<commit_message>
Verify data, complete Cuadrante 2 theory and comparison, add logo, rules and Gantt file
Co-Authored-By: Claude Sonnet 5.5 <noreply@anthropic.com>
Claude-Session: https://claude.ai/code/session_01R2Pu4Q9okMgo25ziHACUFG
</commit_message>
<xml_diff>
--- a/Cuadrante2_Rutastrofe_plantilla.docx
+++ b/Cuadrante2_Rutastrofe_plantilla.docx
@@ -4,7 +4,7 @@
   <w:body>
     <w:p>
       <w:pPr>
-        <w:spacing w:after="1800" w:before="0"/>
+        <w:spacing w:after="600" w:before="0"/>
         <w:jc w:val="center"/>
       </w:pPr>
       <w:r>
@@ -19,329 +19,12 @@
     </w:p>
     <w:p>
       <w:pPr>
-        <w:spacing w:after="200" w:before="0"/>
-        <w:jc w:val="center"/>
-      </w:pPr>
-      <w:r>
-        <w:rPr>
-          <w:b/>
-          <w:bCs/>
-          <w:sz w:val="48"/>
-          <w:szCs w:val="48"/>
-        </w:rPr>
-        <w:t xml:space="preserve">Rutástrofe</w:t>
-      </w:r>
-    </w:p>
-    <w:p>
-      <w:pPr>
-        <w:spacing w:after="1200" w:before="0"/>
-        <w:jc w:val="center"/>
-      </w:pPr>
-      <w:r>
-        <w:rPr>
-          <w:b w:val="false"/>
-          <w:bCs w:val="false"/>
-          <w:sz w:val="26"/>
-          <w:szCs w:val="26"/>
-        </w:rPr>
-        <w:t xml:space="preserve">Videojuego 2D para fomentar la conducción segura y responsable en jóvenes conductores de moto y repartidores de Medellín</w:t>
-      </w:r>
-    </w:p>
-    <w:p>
-      <w:pPr>
-        <w:spacing w:after="1200" w:before="0"/>
-        <w:jc w:val="center"/>
-      </w:pPr>
-      <w:r>
-        <w:rPr>
-          <w:b w:val="false"/>
-          <w:bCs w:val="false"/>
-          <w:sz w:val="24"/>
-          <w:szCs w:val="24"/>
-        </w:rPr>
-        <w:t xml:space="preserve">Cuadrante 2 – Trabajo escrito</w:t>
-      </w:r>
-    </w:p>
-    <w:p>
-      <w:pPr>
-        <w:spacing w:after="60" w:before="0"/>
-        <w:jc w:val="center"/>
-      </w:pPr>
-      <w:r>
-        <w:rPr>
-          <w:b w:val="false"/>
-          <w:bCs w:val="false"/>
-          <w:sz w:val="24"/>
-          <w:szCs w:val="24"/>
-        </w:rPr>
-        <w:t xml:space="preserve">Edison Daniel Cardona Vélez</w:t>
-      </w:r>
-    </w:p>
-    <w:p>
-      <w:pPr>
-        <w:spacing w:after="1200" w:before="0"/>
-        <w:jc w:val="center"/>
-      </w:pPr>
-      <w:r>
-        <w:rPr>
-          <w:b w:val="false"/>
-          <w:bCs w:val="false"/>
-          <w:sz w:val="24"/>
-          <w:szCs w:val="24"/>
-        </w:rPr>
-        <w:t xml:space="preserve">Adrian Yamid Muñoz Abuabara</w:t>
-      </w:r>
-    </w:p>
-    <w:p>
-      <w:pPr>
-        <w:spacing w:after="0" w:before="0"/>
-        <w:jc w:val="center"/>
-      </w:pPr>
-      <w:r>
-        <w:rPr>
-          <w:b w:val="false"/>
-          <w:bCs w:val="false"/>
-          <w:sz w:val="22"/>
-          <w:szCs w:val="22"/>
-        </w:rPr>
-        <w:t xml:space="preserve">Medellín, 2026-2</w:t>
-      </w:r>
-    </w:p>
-    <w:p>
-      <w:r>
-        <w:br w:type="page"/>
-      </w:r>
-    </w:p>
-    <w:p>
-      <w:pPr>
-        <w:pStyle w:val="Heading1"/>
-      </w:pPr>
-      <w:r>
-        <w:t xml:space="preserve">1. Descripción del problema (complementada y corregida)</w:t>
-      </w:r>
-    </w:p>
-    <w:p>
-      <w:pPr>
-        <w:spacing w:after="120" w:line="276"/>
-        <w:jc w:val="both"/>
-      </w:pPr>
-      <w:r>
-        <w:t xml:space="preserve">La movilidad en Medellín enfrenta congestión vehicular, aumento de los tiempos de desplazamiento, siniestros viales, retos para el transporte público, ocupación inadecuada del espacio vial y un crecimiento sostenido del uso de la motocicleta. Según la Encuesta Origen-Destino 2025 (Área Metropolitana del Valle de Aburrá, 2026), el transporte privado aumentó un 22,3 % y el público disminuyó un 14 %, y TomTom (2026) registró un incremento de la congestión del 3,4 % en el último año. </w:t>
-      </w:r>
-      <w:r>
-        <w:rPr>
-          <w:shd w:fill="FFFF00" w:color="auto" w:val="clear"/>
-        </w:rPr>
-        <w:t xml:space="preserve">[VERIFICAR cifras con las fuentes]</w:t>
-      </w:r>
-    </w:p>
-    <w:p>
-      <w:pPr>
-        <w:spacing w:after="120" w:line="276"/>
-        <w:jc w:val="both"/>
-      </w:pPr>
-      <w:r>
-        <w:t xml:space="preserve">En seguridad vial, la Alcaldía de Medellín (s. f.) informó 210 muertes por siniestros en lo corrido de 2025, frente a 239 en el mismo período de 2024. Los motociclistas y los peatones son los actores más vulnerables.</w:t>
-      </w:r>
-    </w:p>
-    <w:p>
-      <w:pPr>
-        <w:spacing w:after="120" w:line="276"/>
-        <w:jc w:val="both"/>
-      </w:pPr>
-      <w:r>
-        <w:rPr>
-          <w:b/>
-          <w:bCs/>
-        </w:rPr>
-        <w:t xml:space="preserve">Problema central:</w:t>
-      </w:r>
-      <w:r>
-        <w:t xml:space="preserve"> muchas decisiones inseguras de los jóvenes en la vía (no usar casco, irrespetar semáforos, adelantar con afán, distraerse con el celular) contribuyen a la siniestralidad y a la congestión, y existen pocas herramientas atractivas que los eduquen de forma práctica.</w:t>
-      </w:r>
-    </w:p>
-    <w:p>
-      <w:pPr>
-        <w:spacing w:after="120" w:line="276"/>
-        <w:jc w:val="both"/>
-      </w:pPr>
-      <w:r>
-        <w:rPr>
-          <w:b/>
-          <w:bCs/>
-        </w:rPr>
-        <w:t xml:space="preserve">Necesidad:</w:t>
-      </w:r>
-      <w:r>
-        <w:t xml:space="preserve"> una experiencia interactiva en la que el joven pueda tomar decisiones viales, equivocarse sin riesgo real y ver las consecuencias.</w:t>
-      </w:r>
-    </w:p>
-    <w:p>
-      <w:pPr>
-        <w:spacing w:after="120" w:line="276"/>
-        <w:jc w:val="both"/>
-      </w:pPr>
-      <w:r>
-        <w:rPr>
-          <w:b/>
-          <w:bCs/>
-        </w:rPr>
-        <w:t xml:space="preserve">Pregunta orientadora:</w:t>
-      </w:r>
-      <w:r>
-        <w:t xml:space="preserve"> ¿Cómo puede un videojuego 2D de escritorio ayudar a que los jóvenes conductores de moto y repartidores de Medellín comprendan las consecuencias de sus decisiones al conducir y adopten comportamientos más seguros?</w:t>
-      </w:r>
-    </w:p>
-    <w:p>
-      <w:pPr>
-        <w:pStyle w:val="Heading1"/>
-      </w:pPr>
-      <w:r>
-        <w:t xml:space="preserve">2. Alcance (complementado y corregido)</w:t>
-      </w:r>
-    </w:p>
-    <w:p>
-      <w:pPr>
-        <w:pStyle w:val="ListParagraph"/>
-        <w:numPr>
-          <w:ilvl w:val="0"/>
-          <w:numId w:val="2"/>
-        </w:numPr>
-        <w:spacing w:after="60" w:line="276"/>
-      </w:pPr>
-      <w:r>
-        <w:rPr>
-          <w:b/>
-          <w:bCs/>
-        </w:rPr>
-        <w:t xml:space="preserve">Producto:</w:t>
-      </w:r>
-      <w:r>
-        <w:t xml:space="preserve"> videojuego 2D de escritorio con interfaz gráfica, desarrollado por tres niveles (la avenida, el barrio de noche y con lluvia, la hora pico).</w:t>
-      </w:r>
-    </w:p>
-    <w:p>
-      <w:pPr>
-        <w:pStyle w:val="ListParagraph"/>
-        <w:numPr>
-          <w:ilvl w:val="0"/>
-          <w:numId w:val="2"/>
-        </w:numPr>
-        <w:spacing w:after="60" w:line="276"/>
-      </w:pPr>
-      <w:r>
-        <w:rPr>
-          <w:b/>
-          <w:bCs/>
-        </w:rPr>
-        <w:t xml:space="preserve">Técnica:</w:t>
-      </w:r>
-      <w:r>
-        <w:t xml:space="preserve"> programación estructurada y modular (sin POO), con secuencia, condicionales, iteración y funciones.</w:t>
-      </w:r>
-    </w:p>
-    <w:p>
-      <w:pPr>
-        <w:pStyle w:val="ListParagraph"/>
-        <w:numPr>
-          <w:ilvl w:val="0"/>
-          <w:numId w:val="2"/>
-        </w:numPr>
-        <w:spacing w:after="60" w:line="276"/>
-      </w:pPr>
-      <w:r>
-        <w:rPr>
-          <w:b/>
-          <w:bCs/>
-        </w:rPr>
-        <w:t xml:space="preserve">Persistencia:</w:t>
-      </w:r>
-      <w:r>
-        <w:t xml:space="preserve"> archivos planos .txt para usuarios, progreso, puntajes y configuración.</w:t>
-      </w:r>
-    </w:p>
-    <w:p>
-      <w:pPr>
-        <w:pStyle w:val="ListParagraph"/>
-        <w:numPr>
-          <w:ilvl w:val="0"/>
-          <w:numId w:val="2"/>
-        </w:numPr>
-        <w:spacing w:after="60" w:line="276"/>
-      </w:pPr>
-      <w:r>
-        <w:rPr>
-          <w:b/>
-          <w:bCs/>
-        </w:rPr>
-        <w:t xml:space="preserve">Funcionalidades:</w:t>
-      </w:r>
-      <w:r>
-        <w:t xml:space="preserve"> inicio de sesión con alias, selección de nivel, juego con obstáculos y decisiones, puntaje y vidas, guardado de progreso, ranking de puntajes. </w:t>
-      </w:r>
-      <w:r>
-        <w:rPr>
-          <w:shd w:fill="FFFF00" w:color="auto" w:val="clear"/>
-        </w:rPr>
-        <w:t xml:space="preserve">[Confirmar y registrar en la bitácora con el módulo sol]</w:t>
-      </w:r>
-    </w:p>
-    <w:p>
-      <w:pPr>
-        <w:pStyle w:val="ListParagraph"/>
-        <w:numPr>
-          <w:ilvl w:val="0"/>
-          <w:numId w:val="2"/>
-        </w:numPr>
-        <w:spacing w:after="60" w:line="276"/>
-      </w:pPr>
-      <w:r>
-        <w:rPr>
-          <w:b/>
-          <w:bCs/>
-        </w:rPr>
-        <w:t xml:space="preserve">Público objetivo:</w:t>
-      </w:r>
-      <w:r>
-        <w:t xml:space="preserve"> jóvenes conductores de moto y repartidores de Medellín.</w:t>
-      </w:r>
-    </w:p>
-    <w:p>
-      <w:pPr>
-        <w:pStyle w:val="ListParagraph"/>
-        <w:numPr>
-          <w:ilvl w:val="0"/>
-          <w:numId w:val="2"/>
-        </w:numPr>
-        <w:spacing w:after="60" w:line="276"/>
-      </w:pPr>
-      <w:r>
-        <w:rPr>
-          <w:b/>
-          <w:bCs/>
-        </w:rPr>
-        <w:t xml:space="preserve">Fuera del alcance:</w:t>
-      </w:r>
-      <w:r>
-        <w:t xml:space="preserve"> GPS, datos en tiempo real, simulación del Metro, solución directa del problema de movilidad, temas ambientales y otros actores viales como jugador (peatón o ciclista).</w:t>
-      </w:r>
-    </w:p>
-    <w:p>
-      <w:pPr>
-        <w:pStyle w:val="Heading1"/>
-      </w:pPr>
-      <w:r>
-        <w:t xml:space="preserve">3. Descripción del problema y alcance en mapa conceptual</w:t>
-      </w:r>
-    </w:p>
-    <w:p>
-      <w:pPr>
         <w:jc w:val="center"/>
       </w:pPr>
       <w:r>
         <w:drawing>
           <wp:inline distT="0" distB="0" distL="0" distR="0">
-            <wp:extent cx="5905500" cy="3638550"/>
+            <wp:extent cx="3619500" cy="1371600"/>
             <wp:effectExtent t="0" r="0" b="0" l="0"/>
             <wp:docPr id="1" name="figura" descr="figura" title="figura"/>
             <wp:cNvGraphicFramePr>
@@ -366,7 +49,7 @@
                   <pic:spPr bwMode="auto">
                     <a:xfrm>
                       <a:off x="0" y="0"/>
-                      <a:ext cx="5905500" cy="3638550"/>
+                      <a:ext cx="3619500" cy="1371600"/>
                     </a:xfrm>
                     <a:prstGeom prst="rect">
                       <a:avLst/>
@@ -381,17 +64,97 @@
     </w:p>
     <w:p>
       <w:pPr>
-        <w:spacing w:after="120" w:line="276"/>
+        <w:spacing w:after="200" w:before="0"/>
         <w:jc w:val="center"/>
       </w:pPr>
       <w:r>
         <w:rPr>
-          <w:i/>
-          <w:iCs/>
-          <w:sz w:val="18"/>
-          <w:szCs w:val="18"/>
+          <w:b/>
+          <w:bCs/>
+          <w:sz w:val="32"/>
+          <w:szCs w:val="32"/>
         </w:rPr>
-        <w:t xml:space="preserve">Figura 1. Mapa conceptual del problema y el alcance de Rutástrofe. Elaboración propia.</w:t>
+        <w:t xml:space="preserve">Rutástrofe</w:t>
+      </w:r>
+    </w:p>
+    <w:p>
+      <w:pPr>
+        <w:spacing w:after="1200" w:before="0"/>
+        <w:jc w:val="center"/>
+      </w:pPr>
+      <w:r>
+        <w:rPr>
+          <w:b w:val="false"/>
+          <w:bCs w:val="false"/>
+          <w:sz w:val="26"/>
+          <w:szCs w:val="26"/>
+        </w:rPr>
+        <w:t xml:space="preserve">Videojuego 2D para fomentar la conducción segura y responsable en jóvenes conductores de moto y repartidores de Medellín</w:t>
+      </w:r>
+    </w:p>
+    <w:p>
+      <w:pPr>
+        <w:spacing w:after="1200" w:before="0"/>
+        <w:jc w:val="center"/>
+      </w:pPr>
+      <w:r>
+        <w:rPr>
+          <w:b w:val="false"/>
+          <w:bCs w:val="false"/>
+          <w:sz w:val="24"/>
+          <w:szCs w:val="24"/>
+        </w:rPr>
+        <w:t xml:space="preserve">Cuadrante 2 – Trabajo escrito</w:t>
+      </w:r>
+    </w:p>
+    <w:p>
+      <w:pPr>
+        <w:spacing w:after="60" w:before="0"/>
+        <w:jc w:val="center"/>
+      </w:pPr>
+      <w:r>
+        <w:rPr>
+          <w:b w:val="false"/>
+          <w:bCs w:val="false"/>
+          <w:sz w:val="24"/>
+          <w:szCs w:val="24"/>
+        </w:rPr>
+        <w:t xml:space="preserve">Edison Daniel Cardona Vélez</w:t>
+      </w:r>
+    </w:p>
+    <w:p>
+      <w:pPr>
+        <w:spacing w:after="1200" w:before="0"/>
+        <w:jc w:val="center"/>
+      </w:pPr>
+      <w:r>
+        <w:rPr>
+          <w:b w:val="false"/>
+          <w:bCs w:val="false"/>
+          <w:sz w:val="24"/>
+          <w:szCs w:val="24"/>
+        </w:rPr>
+        <w:t xml:space="preserve">Adrian Yamid Muñoz Abuabara</w:t>
+      </w:r>
+    </w:p>
+    <w:p>
+      <w:pPr>
+        <w:spacing w:after="0" w:before="0"/>
+        <w:jc w:val="center"/>
+      </w:pPr>
+      <w:r>
+        <w:rPr>
+          <w:b w:val="false"/>
+          <w:bCs w:val="false"/>
+          <w:sz w:val="22"/>
+          <w:szCs w:val="22"/>
+        </w:rPr>
+        <w:t xml:space="preserve">Medellín, 2026-2</w:t>
+      </w:r>
+    </w:p>
+    <w:p>
+      <w:r>
+        <w:br w:type="page"/>
       </w:r>
     </w:p>
     <w:p>
@@ -399,7 +162,7 @@
         <w:pStyle w:val="Heading1"/>
       </w:pPr>
       <w:r>
-        <w:t xml:space="preserve">4. Objetivo general</w:t>
+        <w:t xml:space="preserve">1. Descripción del problema (complementada y corregida)</w:t>
       </w:r>
     </w:p>
     <w:p>
@@ -408,7 +171,64 @@
         <w:jc w:val="both"/>
       </w:pPr>
       <w:r>
-        <w:t xml:space="preserve">Desarrollar un videojuego 2D de escritorio, con programación estructurada y archivos planos, que promueva la conducción segura y responsable en jóvenes conductores de moto y repartidores de Medellín mediante decisiones con consecuencias en tres niveles de juego.</w:t>
+        <w:t xml:space="preserve">La movilidad en Medellín enfrenta congestión vehicular, aumento de los tiempos de desplazamiento, siniestros viales, retos para el transporte público y un crecimiento sostenido del uso de la motocicleta. Según la Encuesta Origen-Destino 2025, los viajes en transporte privado crecieron un 22,3 %, mientras que el transporte público cayó un 14 % (Área Metropolitana del Valle de Aburrá, 2026). TomTom (2026) ubicó la congestión promedio de Medellín en 66,9 % en 2025, lo que significa que un conductor tarda cerca de un 67 % más que con la vía libre.</w:t>
+      </w:r>
+    </w:p>
+    <w:p>
+      <w:pPr>
+        <w:spacing w:after="120" w:line="276"/>
+        <w:jc w:val="both"/>
+      </w:pPr>
+      <w:r>
+        <w:t xml:space="preserve">En seguridad vial, la Alcaldía de Medellín (s. f.) informó 210 muertes por siniestros en lo corrido de 2025, frente a 239 en el mismo período de 2024 (una reducción del 12,1 %). La cifra baja, pero sigue siendo alta, y los motociclistas y los peatones son los actores más vulnerables.</w:t>
+      </w:r>
+    </w:p>
+    <w:p>
+      <w:pPr>
+        <w:spacing w:after="120" w:line="276"/>
+        <w:jc w:val="both"/>
+      </w:pPr>
+      <w:r>
+        <w:rPr>
+          <w:b/>
+          <w:bCs/>
+        </w:rPr>
+        <w:t xml:space="preserve">Problema central:</w:t>
+      </w:r>
+      <w:r>
+        <w:t xml:space="preserve"> muchas decisiones inseguras de los jóvenes en la vía (no usar casco, irrespetar semáforos, adelantar con afán, distraerse con el celular) contribuyen a la siniestralidad y a la congestión, y existen pocas herramientas atractivas que los eduquen de forma práctica.</w:t>
+      </w:r>
+    </w:p>
+    <w:p>
+      <w:pPr>
+        <w:spacing w:after="120" w:line="276"/>
+        <w:jc w:val="both"/>
+      </w:pPr>
+      <w:r>
+        <w:rPr>
+          <w:b/>
+          <w:bCs/>
+        </w:rPr>
+        <w:t xml:space="preserve">Necesidad:</w:t>
+      </w:r>
+      <w:r>
+        <w:t xml:space="preserve"> una experiencia interactiva en la que el joven pueda tomar decisiones viales, equivocarse sin riesgo real y ver las consecuencias.</w:t>
+      </w:r>
+    </w:p>
+    <w:p>
+      <w:pPr>
+        <w:spacing w:after="120" w:line="276"/>
+        <w:jc w:val="both"/>
+      </w:pPr>
+      <w:r>
+        <w:rPr>
+          <w:b/>
+          <w:bCs/>
+        </w:rPr>
+        <w:t xml:space="preserve">Pregunta orientadora:</w:t>
+      </w:r>
+      <w:r>
+        <w:t xml:space="preserve"> ¿Cómo puede un videojuego 2D de escritorio ayudar a que los jóvenes conductores de moto y repartidores de Medellín comprendan las consecuencias de sus decisiones al conducir y adopten comportamientos más seguros?</w:t>
       </w:r>
     </w:p>
     <w:p>
@@ -416,424 +236,141 @@
         <w:pStyle w:val="Heading1"/>
       </w:pPr>
       <w:r>
-        <w:t xml:space="preserve">5. Objetivos específicos</w:t>
-      </w:r>
-    </w:p>
-    <w:tbl>
-      <w:tblPr>
-        <w:tblW w:type="dxa" w:w="9360"/>
-        <w:tblBorders>
-          <w:top w:val="single" w:color="auto" w:sz="4"/>
-          <w:left w:val="single" w:color="auto" w:sz="4"/>
-          <w:bottom w:val="single" w:color="auto" w:sz="4"/>
-          <w:right w:val="single" w:color="auto" w:sz="4"/>
-          <w:insideH w:val="single" w:color="auto" w:sz="4"/>
-          <w:insideV w:val="single" w:color="auto" w:sz="4"/>
-        </w:tblBorders>
-      </w:tblPr>
-      <w:tblGrid>
-        <w:gridCol w:w="2200"/>
-        <w:gridCol w:w="7160"/>
-      </w:tblGrid>
-      <w:tr>
-        <w:trPr>
-          <w:cantSplit/>
-          <w:tblHeader/>
-        </w:trPr>
-        <w:tc>
-          <w:tcPr>
-            <w:tcW w:type="dxa" w:w="2200"/>
-            <w:tcBorders>
-              <w:top w:val="single" w:color="999999" w:sz="4"/>
-              <w:left w:val="single" w:color="999999" w:sz="4"/>
-              <w:bottom w:val="single" w:color="999999" w:sz="4"/>
-              <w:right w:val="single" w:color="999999" w:sz="4"/>
-            </w:tcBorders>
-            <w:shd w:fill="1F4E79" w:color="auto" w:val="clear"/>
-            <w:tcMar>
-              <w:top w:type="dxa" w:w="60"/>
-              <w:left w:type="dxa" w:w="90"/>
-              <w:bottom w:type="dxa" w:w="60"/>
-              <w:right w:type="dxa" w:w="90"/>
-            </w:tcMar>
-          </w:tcPr>
-          <w:p>
-            <w:pPr>
-              <w:spacing w:after="40"/>
-            </w:pPr>
-            <w:r>
-              <w:rPr>
-                <w:b/>
-                <w:bCs/>
-                <w:color w:val="FFFFFF"/>
-                <w:sz w:val="19"/>
-                <w:szCs w:val="19"/>
-              </w:rPr>
-              <w:t xml:space="preserve">Fase</w:t>
-            </w:r>
-          </w:p>
-        </w:tc>
-        <w:tc>
-          <w:tcPr>
-            <w:tcW w:type="dxa" w:w="7160"/>
-            <w:tcBorders>
-              <w:top w:val="single" w:color="999999" w:sz="4"/>
-              <w:left w:val="single" w:color="999999" w:sz="4"/>
-              <w:bottom w:val="single" w:color="999999" w:sz="4"/>
-              <w:right w:val="single" w:color="999999" w:sz="4"/>
-            </w:tcBorders>
-            <w:shd w:fill="1F4E79" w:color="auto" w:val="clear"/>
-            <w:tcMar>
-              <w:top w:type="dxa" w:w="60"/>
-              <w:left w:type="dxa" w:w="90"/>
-              <w:bottom w:type="dxa" w:w="60"/>
-              <w:right w:type="dxa" w:w="90"/>
-            </w:tcMar>
-          </w:tcPr>
-          <w:p>
-            <w:pPr>
-              <w:spacing w:after="40"/>
-            </w:pPr>
-            <w:r>
-              <w:rPr>
-                <w:b/>
-                <w:bCs/>
-                <w:color w:val="FFFFFF"/>
-                <w:sz w:val="19"/>
-                <w:szCs w:val="19"/>
-              </w:rPr>
-              <w:t xml:space="preserve">Objetivo específico</w:t>
-            </w:r>
-          </w:p>
-        </w:tc>
-      </w:tr>
-      <w:tr>
-        <w:trPr>
-          <w:cantSplit/>
-          <w:tblHeader w:val="false"/>
-        </w:trPr>
-        <w:tc>
-          <w:tcPr>
-            <w:tcW w:type="dxa" w:w="2200"/>
-            <w:tcBorders>
-              <w:top w:val="single" w:color="999999" w:sz="4"/>
-              <w:left w:val="single" w:color="999999" w:sz="4"/>
-              <w:bottom w:val="single" w:color="999999" w:sz="4"/>
-              <w:right w:val="single" w:color="999999" w:sz="4"/>
-            </w:tcBorders>
-            <w:tcMar>
-              <w:top w:type="dxa" w:w="60"/>
-              <w:left w:type="dxa" w:w="90"/>
-              <w:bottom w:type="dxa" w:w="60"/>
-              <w:right w:type="dxa" w:w="90"/>
-            </w:tcMar>
-          </w:tcPr>
-          <w:p>
-            <w:pPr>
-              <w:spacing w:after="40"/>
-            </w:pPr>
-            <w:r>
-              <w:rPr>
-                <w:sz w:val="19"/>
-                <w:szCs w:val="19"/>
-              </w:rPr>
-              <w:t xml:space="preserve">Análisis</w:t>
-            </w:r>
-          </w:p>
-        </w:tc>
-        <w:tc>
-          <w:tcPr>
-            <w:tcW w:type="dxa" w:w="7160"/>
-            <w:tcBorders>
-              <w:top w:val="single" w:color="999999" w:sz="4"/>
-              <w:left w:val="single" w:color="999999" w:sz="4"/>
-              <w:bottom w:val="single" w:color="999999" w:sz="4"/>
-              <w:right w:val="single" w:color="999999" w:sz="4"/>
-            </w:tcBorders>
-            <w:tcMar>
-              <w:top w:type="dxa" w:w="60"/>
-              <w:left w:type="dxa" w:w="90"/>
-              <w:bottom w:type="dxa" w:w="60"/>
-              <w:right w:type="dxa" w:w="90"/>
-            </w:tcMar>
-          </w:tcPr>
-          <w:p>
-            <w:pPr>
-              <w:spacing w:after="40"/>
-            </w:pPr>
-            <w:r>
-              <w:rPr>
-                <w:sz w:val="19"/>
-                <w:szCs w:val="19"/>
-              </w:rPr>
-              <w:t xml:space="preserve">Identificar y documentar los requerimientos funcionales y no funcionales del juego, y las situaciones viales que se representarán, a partir de fuentes oficiales y de la validación con 4 usuarios.</w:t>
-            </w:r>
-          </w:p>
-        </w:tc>
-      </w:tr>
-      <w:tr>
-        <w:trPr>
-          <w:cantSplit/>
-          <w:tblHeader w:val="false"/>
-        </w:trPr>
-        <w:tc>
-          <w:tcPr>
-            <w:tcW w:type="dxa" w:w="2200"/>
-            <w:tcBorders>
-              <w:top w:val="single" w:color="999999" w:sz="4"/>
-              <w:left w:val="single" w:color="999999" w:sz="4"/>
-              <w:bottom w:val="single" w:color="999999" w:sz="4"/>
-              <w:right w:val="single" w:color="999999" w:sz="4"/>
-            </w:tcBorders>
-            <w:tcMar>
-              <w:top w:type="dxa" w:w="60"/>
-              <w:left w:type="dxa" w:w="90"/>
-              <w:bottom w:type="dxa" w:w="60"/>
-              <w:right w:type="dxa" w:w="90"/>
-            </w:tcMar>
-          </w:tcPr>
-          <w:p>
-            <w:pPr>
-              <w:spacing w:after="40"/>
-            </w:pPr>
-            <w:r>
-              <w:rPr>
-                <w:sz w:val="19"/>
-                <w:szCs w:val="19"/>
-              </w:rPr>
-              <w:t xml:space="preserve">Diseño</w:t>
-            </w:r>
-          </w:p>
-        </w:tc>
-        <w:tc>
-          <w:tcPr>
-            <w:tcW w:type="dxa" w:w="7160"/>
-            <w:tcBorders>
-              <w:top w:val="single" w:color="999999" w:sz="4"/>
-              <w:left w:val="single" w:color="999999" w:sz="4"/>
-              <w:bottom w:val="single" w:color="999999" w:sz="4"/>
-              <w:right w:val="single" w:color="999999" w:sz="4"/>
-            </w:tcBorders>
-            <w:tcMar>
-              <w:top w:type="dxa" w:w="60"/>
-              <w:left w:type="dxa" w:w="90"/>
-              <w:bottom w:type="dxa" w:w="60"/>
-              <w:right w:type="dxa" w:w="90"/>
-            </w:tcMar>
-          </w:tcPr>
-          <w:p>
-            <w:pPr>
-              <w:spacing w:after="40"/>
-            </w:pPr>
-            <w:r>
-              <w:rPr>
-                <w:sz w:val="19"/>
-                <w:szCs w:val="19"/>
-              </w:rPr>
-              <w:t xml:space="preserve">Diseñar el storyboard, el logo, las interfaces y el prototipo navegacional de los tres niveles, y la estructura de los archivos planos.</w:t>
-            </w:r>
-          </w:p>
-        </w:tc>
-      </w:tr>
-      <w:tr>
-        <w:trPr>
-          <w:cantSplit/>
-          <w:tblHeader w:val="false"/>
-        </w:trPr>
-        <w:tc>
-          <w:tcPr>
-            <w:tcW w:type="dxa" w:w="2200"/>
-            <w:tcBorders>
-              <w:top w:val="single" w:color="999999" w:sz="4"/>
-              <w:left w:val="single" w:color="999999" w:sz="4"/>
-              <w:bottom w:val="single" w:color="999999" w:sz="4"/>
-              <w:right w:val="single" w:color="999999" w:sz="4"/>
-            </w:tcBorders>
-            <w:tcMar>
-              <w:top w:type="dxa" w:w="60"/>
-              <w:left w:type="dxa" w:w="90"/>
-              <w:bottom w:type="dxa" w:w="60"/>
-              <w:right w:type="dxa" w:w="90"/>
-            </w:tcMar>
-          </w:tcPr>
-          <w:p>
-            <w:pPr>
-              <w:spacing w:after="40"/>
-            </w:pPr>
-            <w:r>
-              <w:rPr>
-                <w:sz w:val="19"/>
-                <w:szCs w:val="19"/>
-              </w:rPr>
-              <w:t xml:space="preserve">Desarrollo</w:t>
-            </w:r>
-          </w:p>
-        </w:tc>
-        <w:tc>
-          <w:tcPr>
-            <w:tcW w:type="dxa" w:w="7160"/>
-            <w:tcBorders>
-              <w:top w:val="single" w:color="999999" w:sz="4"/>
-              <w:left w:val="single" w:color="999999" w:sz="4"/>
-              <w:bottom w:val="single" w:color="999999" w:sz="4"/>
-              <w:right w:val="single" w:color="999999" w:sz="4"/>
-            </w:tcBorders>
-            <w:tcMar>
-              <w:top w:type="dxa" w:w="60"/>
-              <w:left w:type="dxa" w:w="90"/>
-              <w:bottom w:type="dxa" w:w="60"/>
-              <w:right w:type="dxa" w:w="90"/>
-            </w:tcMar>
-          </w:tcPr>
-          <w:p>
-            <w:pPr>
-              <w:spacing w:after="40"/>
-            </w:pPr>
-            <w:r>
-              <w:rPr>
-                <w:sz w:val="19"/>
-                <w:szCs w:val="19"/>
-              </w:rPr>
-              <w:t xml:space="preserve">Codificar el videojuego con programación estructurada y modular, aplicando secuencia, condicionales, iteración y funciones, con interfaz gráfica y persistencia en archivos .txt.</w:t>
-            </w:r>
-          </w:p>
-        </w:tc>
-      </w:tr>
-      <w:tr>
-        <w:trPr>
-          <w:cantSplit/>
-          <w:tblHeader w:val="false"/>
-        </w:trPr>
-        <w:tc>
-          <w:tcPr>
-            <w:tcW w:type="dxa" w:w="2200"/>
-            <w:tcBorders>
-              <w:top w:val="single" w:color="999999" w:sz="4"/>
-              <w:left w:val="single" w:color="999999" w:sz="4"/>
-              <w:bottom w:val="single" w:color="999999" w:sz="4"/>
-              <w:right w:val="single" w:color="999999" w:sz="4"/>
-            </w:tcBorders>
-            <w:tcMar>
-              <w:top w:type="dxa" w:w="60"/>
-              <w:left w:type="dxa" w:w="90"/>
-              <w:bottom w:type="dxa" w:w="60"/>
-              <w:right w:type="dxa" w:w="90"/>
-            </w:tcMar>
-          </w:tcPr>
-          <w:p>
-            <w:pPr>
-              <w:spacing w:after="40"/>
-            </w:pPr>
-            <w:r>
-              <w:rPr>
-                <w:sz w:val="19"/>
-                <w:szCs w:val="19"/>
-              </w:rPr>
-              <w:t xml:space="preserve">Pruebas</w:t>
-            </w:r>
-          </w:p>
-        </w:tc>
-        <w:tc>
-          <w:tcPr>
-            <w:tcW w:type="dxa" w:w="7160"/>
-            <w:tcBorders>
-              <w:top w:val="single" w:color="999999" w:sz="4"/>
-              <w:left w:val="single" w:color="999999" w:sz="4"/>
-              <w:bottom w:val="single" w:color="999999" w:sz="4"/>
-              <w:right w:val="single" w:color="999999" w:sz="4"/>
-            </w:tcBorders>
-            <w:tcMar>
-              <w:top w:type="dxa" w:w="60"/>
-              <w:left w:type="dxa" w:w="90"/>
-              <w:bottom w:type="dxa" w:w="60"/>
-              <w:right w:type="dxa" w:w="90"/>
-            </w:tcMar>
-          </w:tcPr>
-          <w:p>
-            <w:pPr>
-              <w:spacing w:after="40"/>
-            </w:pPr>
-            <w:r>
-              <w:rPr>
-                <w:sz w:val="19"/>
-                <w:szCs w:val="19"/>
-              </w:rPr>
-              <w:t xml:space="preserve">Verificar el funcionamiento de cada nivel y de la persistencia mediante pruebas funcionales y pruebas con usuarios, y registrar los errores corregidos.</w:t>
-            </w:r>
-          </w:p>
-        </w:tc>
-      </w:tr>
-      <w:tr>
-        <w:trPr>
-          <w:cantSplit/>
-          <w:tblHeader w:val="false"/>
-        </w:trPr>
-        <w:tc>
-          <w:tcPr>
-            <w:tcW w:type="dxa" w:w="2200"/>
-            <w:tcBorders>
-              <w:top w:val="single" w:color="999999" w:sz="4"/>
-              <w:left w:val="single" w:color="999999" w:sz="4"/>
-              <w:bottom w:val="single" w:color="999999" w:sz="4"/>
-              <w:right w:val="single" w:color="999999" w:sz="4"/>
-            </w:tcBorders>
-            <w:tcMar>
-              <w:top w:type="dxa" w:w="60"/>
-              <w:left w:type="dxa" w:w="90"/>
-              <w:bottom w:type="dxa" w:w="60"/>
-              <w:right w:type="dxa" w:w="90"/>
-            </w:tcMar>
-          </w:tcPr>
-          <w:p>
-            <w:pPr>
-              <w:spacing w:after="40"/>
-            </w:pPr>
-            <w:r>
-              <w:rPr>
-                <w:sz w:val="19"/>
-                <w:szCs w:val="19"/>
-              </w:rPr>
-              <w:t xml:space="preserve">Operación y mantenimiento</w:t>
-            </w:r>
-          </w:p>
-        </w:tc>
-        <w:tc>
-          <w:tcPr>
-            <w:tcW w:type="dxa" w:w="7160"/>
-            <w:tcBorders>
-              <w:top w:val="single" w:color="999999" w:sz="4"/>
-              <w:left w:val="single" w:color="999999" w:sz="4"/>
-              <w:bottom w:val="single" w:color="999999" w:sz="4"/>
-              <w:right w:val="single" w:color="999999" w:sz="4"/>
-            </w:tcBorders>
-            <w:tcMar>
-              <w:top w:type="dxa" w:w="60"/>
-              <w:left w:type="dxa" w:w="90"/>
-              <w:bottom w:type="dxa" w:w="60"/>
-              <w:right w:type="dxa" w:w="90"/>
-            </w:tcMar>
-          </w:tcPr>
-          <w:p>
-            <w:pPr>
-              <w:spacing w:after="40"/>
-            </w:pPr>
-            <w:r>
-              <w:rPr>
-                <w:sz w:val="19"/>
-                <w:szCs w:val="19"/>
-              </w:rPr>
-              <w:t xml:space="preserve">Elaborar el manual de usuario y el instalador, y corregir los errores detectados tras la puesta en uso del juego.</w:t>
-            </w:r>
-          </w:p>
-        </w:tc>
-      </w:tr>
-    </w:tbl>
+        <w:t xml:space="preserve">2. Alcance (complementado y corregido)</w:t>
+      </w:r>
+    </w:p>
+    <w:p>
+      <w:pPr>
+        <w:pStyle w:val="ListParagraph"/>
+        <w:numPr>
+          <w:ilvl w:val="0"/>
+          <w:numId w:val="2"/>
+        </w:numPr>
+        <w:spacing w:after="60" w:line="276"/>
+      </w:pPr>
+      <w:r>
+        <w:rPr>
+          <w:b/>
+          <w:bCs/>
+        </w:rPr>
+        <w:t xml:space="preserve">Producto:</w:t>
+      </w:r>
+      <w:r>
+        <w:t xml:space="preserve"> videojuego 2D de escritorio con interfaz gráfica, desarrollado por tres niveles (la avenida, el barrio de noche y con lluvia, la hora pico).</w:t>
+      </w:r>
+    </w:p>
+    <w:p>
+      <w:pPr>
+        <w:pStyle w:val="ListParagraph"/>
+        <w:numPr>
+          <w:ilvl w:val="0"/>
+          <w:numId w:val="2"/>
+        </w:numPr>
+        <w:spacing w:after="60" w:line="276"/>
+      </w:pPr>
+      <w:r>
+        <w:rPr>
+          <w:b/>
+          <w:bCs/>
+        </w:rPr>
+        <w:t xml:space="preserve">Técnica:</w:t>
+      </w:r>
+      <w:r>
+        <w:t xml:space="preserve"> programación estructurada y modular (sin POO), con secuencia, condicionales, iteración y funciones.</w:t>
+      </w:r>
+    </w:p>
+    <w:p>
+      <w:pPr>
+        <w:pStyle w:val="ListParagraph"/>
+        <w:numPr>
+          <w:ilvl w:val="0"/>
+          <w:numId w:val="2"/>
+        </w:numPr>
+        <w:spacing w:after="60" w:line="276"/>
+      </w:pPr>
+      <w:r>
+        <w:rPr>
+          <w:b/>
+          <w:bCs/>
+        </w:rPr>
+        <w:t xml:space="preserve">Persistencia:</w:t>
+      </w:r>
+      <w:r>
+        <w:t xml:space="preserve"> archivos planos .txt para usuarios, progreso, puntajes y configuración.</w:t>
+      </w:r>
+    </w:p>
+    <w:p>
+      <w:pPr>
+        <w:pStyle w:val="ListParagraph"/>
+        <w:numPr>
+          <w:ilvl w:val="0"/>
+          <w:numId w:val="2"/>
+        </w:numPr>
+        <w:spacing w:after="60" w:line="276"/>
+      </w:pPr>
+      <w:r>
+        <w:rPr>
+          <w:b/>
+          <w:bCs/>
+        </w:rPr>
+        <w:t xml:space="preserve">Funcionalidades:</w:t>
+      </w:r>
+      <w:r>
+        <w:t xml:space="preserve"> inicio de sesión con alias, selección de nivel, juego con obstáculos y decisiones, puntaje y vidas, guardado de progreso, ranking de puntajes. </w:t>
+      </w:r>
+      <w:r>
+        <w:rPr>
+          <w:shd w:fill="FFFF00" w:color="auto" w:val="clear"/>
+        </w:rPr>
+        <w:t xml:space="preserve">[Confirmar y registrar en la bitácora con el módulo sol]</w:t>
+      </w:r>
+    </w:p>
+    <w:p>
+      <w:pPr>
+        <w:pStyle w:val="ListParagraph"/>
+        <w:numPr>
+          <w:ilvl w:val="0"/>
+          <w:numId w:val="2"/>
+        </w:numPr>
+        <w:spacing w:after="60" w:line="276"/>
+      </w:pPr>
+      <w:r>
+        <w:rPr>
+          <w:b/>
+          <w:bCs/>
+        </w:rPr>
+        <w:t xml:space="preserve">Público objetivo:</w:t>
+      </w:r>
+      <w:r>
+        <w:t xml:space="preserve"> jóvenes conductores de moto y repartidores de Medellín.</w:t>
+      </w:r>
+    </w:p>
+    <w:p>
+      <w:pPr>
+        <w:pStyle w:val="ListParagraph"/>
+        <w:numPr>
+          <w:ilvl w:val="0"/>
+          <w:numId w:val="2"/>
+        </w:numPr>
+        <w:spacing w:after="60" w:line="276"/>
+      </w:pPr>
+      <w:r>
+        <w:rPr>
+          <w:b/>
+          <w:bCs/>
+        </w:rPr>
+        <w:t xml:space="preserve">Fuera del alcance:</w:t>
+      </w:r>
+      <w:r>
+        <w:t xml:space="preserve"> GPS, datos en tiempo real, simulación del Metro, solución directa del problema de movilidad, temas ambientales y otros actores viales como jugador (peatón o ciclista).</w:t>
+      </w:r>
+    </w:p>
     <w:p>
       <w:pPr>
         <w:pStyle w:val="Heading1"/>
       </w:pPr>
       <w:r>
-        <w:t xml:space="preserve">6. Cronograma de actividades (diagrama de Gantt)</w:t>
+        <w:t xml:space="preserve">3. Descripción del problema y alcance en mapa conceptual</w:t>
       </w:r>
     </w:p>
     <w:p>
@@ -843,7 +380,7 @@
       <w:r>
         <w:drawing>
           <wp:inline distT="0" distB="0" distL="0" distR="0">
-            <wp:extent cx="5905500" cy="3143250"/>
+            <wp:extent cx="5905500" cy="3638550"/>
             <wp:effectExtent t="0" r="0" b="0" l="0"/>
             <wp:docPr id="1" name="figura" descr="figura" title="figura"/>
             <wp:cNvGraphicFramePr>
@@ -868,6 +405,508 @@
                   <pic:spPr bwMode="auto">
                     <a:xfrm>
                       <a:off x="0" y="0"/>
+                      <a:ext cx="5905500" cy="3638550"/>
+                    </a:xfrm>
+                    <a:prstGeom prst="rect">
+                      <a:avLst/>
+                    </a:prstGeom>
+                  </pic:spPr>
+                </pic:pic>
+              </a:graphicData>
+            </a:graphic>
+          </wp:inline>
+        </w:drawing>
+      </w:r>
+    </w:p>
+    <w:p>
+      <w:pPr>
+        <w:spacing w:after="120" w:line="276"/>
+        <w:jc w:val="center"/>
+      </w:pPr>
+      <w:r>
+        <w:rPr>
+          <w:i/>
+          <w:iCs/>
+          <w:sz w:val="18"/>
+          <w:szCs w:val="18"/>
+        </w:rPr>
+        <w:t xml:space="preserve">Figura 1. Mapa conceptual del problema y el alcance de Rutástrofe. Elaboración propia.</w:t>
+      </w:r>
+    </w:p>
+    <w:p>
+      <w:pPr>
+        <w:pStyle w:val="Heading1"/>
+      </w:pPr>
+      <w:r>
+        <w:t xml:space="preserve">4. Objetivo general</w:t>
+      </w:r>
+    </w:p>
+    <w:p>
+      <w:pPr>
+        <w:spacing w:after="120" w:line="276"/>
+        <w:jc w:val="both"/>
+      </w:pPr>
+      <w:r>
+        <w:t xml:space="preserve">Desarrollar un videojuego 2D de escritorio, con programación estructurada y archivos planos, que promueva la conducción segura y responsable en jóvenes conductores de moto y repartidores de Medellín mediante decisiones con consecuencias en tres niveles de juego.</w:t>
+      </w:r>
+    </w:p>
+    <w:p>
+      <w:pPr>
+        <w:pStyle w:val="Heading1"/>
+      </w:pPr>
+      <w:r>
+        <w:t xml:space="preserve">5. Objetivos específicos</w:t>
+      </w:r>
+    </w:p>
+    <w:tbl>
+      <w:tblPr>
+        <w:tblW w:type="dxa" w:w="9360"/>
+        <w:tblBorders>
+          <w:top w:val="single" w:color="auto" w:sz="4"/>
+          <w:left w:val="single" w:color="auto" w:sz="4"/>
+          <w:bottom w:val="single" w:color="auto" w:sz="4"/>
+          <w:right w:val="single" w:color="auto" w:sz="4"/>
+          <w:insideH w:val="single" w:color="auto" w:sz="4"/>
+          <w:insideV w:val="single" w:color="auto" w:sz="4"/>
+        </w:tblBorders>
+      </w:tblPr>
+      <w:tblGrid>
+        <w:gridCol w:w="2200"/>
+        <w:gridCol w:w="7160"/>
+      </w:tblGrid>
+      <w:tr>
+        <w:trPr>
+          <w:cantSplit/>
+          <w:tblHeader/>
+        </w:trPr>
+        <w:tc>
+          <w:tcPr>
+            <w:tcW w:type="dxa" w:w="2200"/>
+            <w:tcBorders>
+              <w:top w:val="single" w:color="999999" w:sz="4"/>
+              <w:left w:val="single" w:color="999999" w:sz="4"/>
+              <w:bottom w:val="single" w:color="999999" w:sz="4"/>
+              <w:right w:val="single" w:color="999999" w:sz="4"/>
+            </w:tcBorders>
+            <w:shd w:fill="1F4E79" w:color="auto" w:val="clear"/>
+            <w:tcMar>
+              <w:top w:type="dxa" w:w="60"/>
+              <w:left w:type="dxa" w:w="90"/>
+              <w:bottom w:type="dxa" w:w="60"/>
+              <w:right w:type="dxa" w:w="90"/>
+            </w:tcMar>
+          </w:tcPr>
+          <w:p>
+            <w:pPr>
+              <w:spacing w:after="40"/>
+            </w:pPr>
+            <w:r>
+              <w:rPr>
+                <w:b/>
+                <w:bCs/>
+                <w:color w:val="FFFFFF"/>
+                <w:sz w:val="19"/>
+                <w:szCs w:val="19"/>
+              </w:rPr>
+              <w:t xml:space="preserve">Fase</w:t>
+            </w:r>
+          </w:p>
+        </w:tc>
+        <w:tc>
+          <w:tcPr>
+            <w:tcW w:type="dxa" w:w="7160"/>
+            <w:tcBorders>
+              <w:top w:val="single" w:color="999999" w:sz="4"/>
+              <w:left w:val="single" w:color="999999" w:sz="4"/>
+              <w:bottom w:val="single" w:color="999999" w:sz="4"/>
+              <w:right w:val="single" w:color="999999" w:sz="4"/>
+            </w:tcBorders>
+            <w:shd w:fill="1F4E79" w:color="auto" w:val="clear"/>
+            <w:tcMar>
+              <w:top w:type="dxa" w:w="60"/>
+              <w:left w:type="dxa" w:w="90"/>
+              <w:bottom w:type="dxa" w:w="60"/>
+              <w:right w:type="dxa" w:w="90"/>
+            </w:tcMar>
+          </w:tcPr>
+          <w:p>
+            <w:pPr>
+              <w:spacing w:after="40"/>
+            </w:pPr>
+            <w:r>
+              <w:rPr>
+                <w:b/>
+                <w:bCs/>
+                <w:color w:val="FFFFFF"/>
+                <w:sz w:val="19"/>
+                <w:szCs w:val="19"/>
+              </w:rPr>
+              <w:t xml:space="preserve">Objetivo específico</w:t>
+            </w:r>
+          </w:p>
+        </w:tc>
+      </w:tr>
+      <w:tr>
+        <w:trPr>
+          <w:cantSplit/>
+          <w:tblHeader w:val="false"/>
+        </w:trPr>
+        <w:tc>
+          <w:tcPr>
+            <w:tcW w:type="dxa" w:w="2200"/>
+            <w:tcBorders>
+              <w:top w:val="single" w:color="999999" w:sz="4"/>
+              <w:left w:val="single" w:color="999999" w:sz="4"/>
+              <w:bottom w:val="single" w:color="999999" w:sz="4"/>
+              <w:right w:val="single" w:color="999999" w:sz="4"/>
+            </w:tcBorders>
+            <w:tcMar>
+              <w:top w:type="dxa" w:w="60"/>
+              <w:left w:type="dxa" w:w="90"/>
+              <w:bottom w:type="dxa" w:w="60"/>
+              <w:right w:type="dxa" w:w="90"/>
+            </w:tcMar>
+          </w:tcPr>
+          <w:p>
+            <w:pPr>
+              <w:spacing w:after="40"/>
+            </w:pPr>
+            <w:r>
+              <w:rPr>
+                <w:sz w:val="19"/>
+                <w:szCs w:val="19"/>
+              </w:rPr>
+              <w:t xml:space="preserve">Análisis</w:t>
+            </w:r>
+          </w:p>
+        </w:tc>
+        <w:tc>
+          <w:tcPr>
+            <w:tcW w:type="dxa" w:w="7160"/>
+            <w:tcBorders>
+              <w:top w:val="single" w:color="999999" w:sz="4"/>
+              <w:left w:val="single" w:color="999999" w:sz="4"/>
+              <w:bottom w:val="single" w:color="999999" w:sz="4"/>
+              <w:right w:val="single" w:color="999999" w:sz="4"/>
+            </w:tcBorders>
+            <w:tcMar>
+              <w:top w:type="dxa" w:w="60"/>
+              <w:left w:type="dxa" w:w="90"/>
+              <w:bottom w:type="dxa" w:w="60"/>
+              <w:right w:type="dxa" w:w="90"/>
+            </w:tcMar>
+          </w:tcPr>
+          <w:p>
+            <w:pPr>
+              <w:spacing w:after="40"/>
+            </w:pPr>
+            <w:r>
+              <w:rPr>
+                <w:sz w:val="19"/>
+                <w:szCs w:val="19"/>
+              </w:rPr>
+              <w:t xml:space="preserve">Identificar y documentar los requerimientos funcionales y no funcionales del juego, y las situaciones viales que se representarán, a partir de fuentes oficiales y de la validación con 4 usuarios.</w:t>
+            </w:r>
+          </w:p>
+        </w:tc>
+      </w:tr>
+      <w:tr>
+        <w:trPr>
+          <w:cantSplit/>
+          <w:tblHeader w:val="false"/>
+        </w:trPr>
+        <w:tc>
+          <w:tcPr>
+            <w:tcW w:type="dxa" w:w="2200"/>
+            <w:tcBorders>
+              <w:top w:val="single" w:color="999999" w:sz="4"/>
+              <w:left w:val="single" w:color="999999" w:sz="4"/>
+              <w:bottom w:val="single" w:color="999999" w:sz="4"/>
+              <w:right w:val="single" w:color="999999" w:sz="4"/>
+            </w:tcBorders>
+            <w:tcMar>
+              <w:top w:type="dxa" w:w="60"/>
+              <w:left w:type="dxa" w:w="90"/>
+              <w:bottom w:type="dxa" w:w="60"/>
+              <w:right w:type="dxa" w:w="90"/>
+            </w:tcMar>
+          </w:tcPr>
+          <w:p>
+            <w:pPr>
+              <w:spacing w:after="40"/>
+            </w:pPr>
+            <w:r>
+              <w:rPr>
+                <w:sz w:val="19"/>
+                <w:szCs w:val="19"/>
+              </w:rPr>
+              <w:t xml:space="preserve">Diseño</w:t>
+            </w:r>
+          </w:p>
+        </w:tc>
+        <w:tc>
+          <w:tcPr>
+            <w:tcW w:type="dxa" w:w="7160"/>
+            <w:tcBorders>
+              <w:top w:val="single" w:color="999999" w:sz="4"/>
+              <w:left w:val="single" w:color="999999" w:sz="4"/>
+              <w:bottom w:val="single" w:color="999999" w:sz="4"/>
+              <w:right w:val="single" w:color="999999" w:sz="4"/>
+            </w:tcBorders>
+            <w:tcMar>
+              <w:top w:type="dxa" w:w="60"/>
+              <w:left w:type="dxa" w:w="90"/>
+              <w:bottom w:type="dxa" w:w="60"/>
+              <w:right w:type="dxa" w:w="90"/>
+            </w:tcMar>
+          </w:tcPr>
+          <w:p>
+            <w:pPr>
+              <w:spacing w:after="40"/>
+            </w:pPr>
+            <w:r>
+              <w:rPr>
+                <w:sz w:val="19"/>
+                <w:szCs w:val="19"/>
+              </w:rPr>
+              <w:t xml:space="preserve">Diseñar el storyboard, el logo, las interfaces y el prototipo navegacional de los tres niveles, y la estructura de los archivos planos.</w:t>
+            </w:r>
+          </w:p>
+        </w:tc>
+      </w:tr>
+      <w:tr>
+        <w:trPr>
+          <w:cantSplit/>
+          <w:tblHeader w:val="false"/>
+        </w:trPr>
+        <w:tc>
+          <w:tcPr>
+            <w:tcW w:type="dxa" w:w="2200"/>
+            <w:tcBorders>
+              <w:top w:val="single" w:color="999999" w:sz="4"/>
+              <w:left w:val="single" w:color="999999" w:sz="4"/>
+              <w:bottom w:val="single" w:color="999999" w:sz="4"/>
+              <w:right w:val="single" w:color="999999" w:sz="4"/>
+            </w:tcBorders>
+            <w:tcMar>
+              <w:top w:type="dxa" w:w="60"/>
+              <w:left w:type="dxa" w:w="90"/>
+              <w:bottom w:type="dxa" w:w="60"/>
+              <w:right w:type="dxa" w:w="90"/>
+            </w:tcMar>
+          </w:tcPr>
+          <w:p>
+            <w:pPr>
+              <w:spacing w:after="40"/>
+            </w:pPr>
+            <w:r>
+              <w:rPr>
+                <w:sz w:val="19"/>
+                <w:szCs w:val="19"/>
+              </w:rPr>
+              <w:t xml:space="preserve">Desarrollo</w:t>
+            </w:r>
+          </w:p>
+        </w:tc>
+        <w:tc>
+          <w:tcPr>
+            <w:tcW w:type="dxa" w:w="7160"/>
+            <w:tcBorders>
+              <w:top w:val="single" w:color="999999" w:sz="4"/>
+              <w:left w:val="single" w:color="999999" w:sz="4"/>
+              <w:bottom w:val="single" w:color="999999" w:sz="4"/>
+              <w:right w:val="single" w:color="999999" w:sz="4"/>
+            </w:tcBorders>
+            <w:tcMar>
+              <w:top w:type="dxa" w:w="60"/>
+              <w:left w:type="dxa" w:w="90"/>
+              <w:bottom w:type="dxa" w:w="60"/>
+              <w:right w:type="dxa" w:w="90"/>
+            </w:tcMar>
+          </w:tcPr>
+          <w:p>
+            <w:pPr>
+              <w:spacing w:after="40"/>
+            </w:pPr>
+            <w:r>
+              <w:rPr>
+                <w:sz w:val="19"/>
+                <w:szCs w:val="19"/>
+              </w:rPr>
+              <w:t xml:space="preserve">Codificar el videojuego con programación estructurada y modular, aplicando secuencia, condicionales, iteración y funciones, con interfaz gráfica y persistencia en archivos .txt.</w:t>
+            </w:r>
+          </w:p>
+        </w:tc>
+      </w:tr>
+      <w:tr>
+        <w:trPr>
+          <w:cantSplit/>
+          <w:tblHeader w:val="false"/>
+        </w:trPr>
+        <w:tc>
+          <w:tcPr>
+            <w:tcW w:type="dxa" w:w="2200"/>
+            <w:tcBorders>
+              <w:top w:val="single" w:color="999999" w:sz="4"/>
+              <w:left w:val="single" w:color="999999" w:sz="4"/>
+              <w:bottom w:val="single" w:color="999999" w:sz="4"/>
+              <w:right w:val="single" w:color="999999" w:sz="4"/>
+            </w:tcBorders>
+            <w:tcMar>
+              <w:top w:type="dxa" w:w="60"/>
+              <w:left w:type="dxa" w:w="90"/>
+              <w:bottom w:type="dxa" w:w="60"/>
+              <w:right w:type="dxa" w:w="90"/>
+            </w:tcMar>
+          </w:tcPr>
+          <w:p>
+            <w:pPr>
+              <w:spacing w:after="40"/>
+            </w:pPr>
+            <w:r>
+              <w:rPr>
+                <w:sz w:val="19"/>
+                <w:szCs w:val="19"/>
+              </w:rPr>
+              <w:t xml:space="preserve">Pruebas</w:t>
+            </w:r>
+          </w:p>
+        </w:tc>
+        <w:tc>
+          <w:tcPr>
+            <w:tcW w:type="dxa" w:w="7160"/>
+            <w:tcBorders>
+              <w:top w:val="single" w:color="999999" w:sz="4"/>
+              <w:left w:val="single" w:color="999999" w:sz="4"/>
+              <w:bottom w:val="single" w:color="999999" w:sz="4"/>
+              <w:right w:val="single" w:color="999999" w:sz="4"/>
+            </w:tcBorders>
+            <w:tcMar>
+              <w:top w:type="dxa" w:w="60"/>
+              <w:left w:type="dxa" w:w="90"/>
+              <w:bottom w:type="dxa" w:w="60"/>
+              <w:right w:type="dxa" w:w="90"/>
+            </w:tcMar>
+          </w:tcPr>
+          <w:p>
+            <w:pPr>
+              <w:spacing w:after="40"/>
+            </w:pPr>
+            <w:r>
+              <w:rPr>
+                <w:sz w:val="19"/>
+                <w:szCs w:val="19"/>
+              </w:rPr>
+              <w:t xml:space="preserve">Verificar el funcionamiento de cada nivel y de la persistencia mediante pruebas funcionales y pruebas con usuarios, y registrar los errores corregidos.</w:t>
+            </w:r>
+          </w:p>
+        </w:tc>
+      </w:tr>
+      <w:tr>
+        <w:trPr>
+          <w:cantSplit/>
+          <w:tblHeader w:val="false"/>
+        </w:trPr>
+        <w:tc>
+          <w:tcPr>
+            <w:tcW w:type="dxa" w:w="2200"/>
+            <w:tcBorders>
+              <w:top w:val="single" w:color="999999" w:sz="4"/>
+              <w:left w:val="single" w:color="999999" w:sz="4"/>
+              <w:bottom w:val="single" w:color="999999" w:sz="4"/>
+              <w:right w:val="single" w:color="999999" w:sz="4"/>
+            </w:tcBorders>
+            <w:tcMar>
+              <w:top w:type="dxa" w:w="60"/>
+              <w:left w:type="dxa" w:w="90"/>
+              <w:bottom w:type="dxa" w:w="60"/>
+              <w:right w:type="dxa" w:w="90"/>
+            </w:tcMar>
+          </w:tcPr>
+          <w:p>
+            <w:pPr>
+              <w:spacing w:after="40"/>
+            </w:pPr>
+            <w:r>
+              <w:rPr>
+                <w:sz w:val="19"/>
+                <w:szCs w:val="19"/>
+              </w:rPr>
+              <w:t xml:space="preserve">Operación y mantenimiento</w:t>
+            </w:r>
+          </w:p>
+        </w:tc>
+        <w:tc>
+          <w:tcPr>
+            <w:tcW w:type="dxa" w:w="7160"/>
+            <w:tcBorders>
+              <w:top w:val="single" w:color="999999" w:sz="4"/>
+              <w:left w:val="single" w:color="999999" w:sz="4"/>
+              <w:bottom w:val="single" w:color="999999" w:sz="4"/>
+              <w:right w:val="single" w:color="999999" w:sz="4"/>
+            </w:tcBorders>
+            <w:tcMar>
+              <w:top w:type="dxa" w:w="60"/>
+              <w:left w:type="dxa" w:w="90"/>
+              <w:bottom w:type="dxa" w:w="60"/>
+              <w:right w:type="dxa" w:w="90"/>
+            </w:tcMar>
+          </w:tcPr>
+          <w:p>
+            <w:pPr>
+              <w:spacing w:after="40"/>
+            </w:pPr>
+            <w:r>
+              <w:rPr>
+                <w:sz w:val="19"/>
+                <w:szCs w:val="19"/>
+              </w:rPr>
+              <w:t xml:space="preserve">Elaborar el manual de usuario y el instalador, y corregir los errores detectados tras la puesta en uso del juego.</w:t>
+            </w:r>
+          </w:p>
+        </w:tc>
+      </w:tr>
+    </w:tbl>
+    <w:p>
+      <w:pPr>
+        <w:pStyle w:val="Heading1"/>
+      </w:pPr>
+      <w:r>
+        <w:t xml:space="preserve">6. Cronograma de actividades (diagrama de Gantt)</w:t>
+      </w:r>
+    </w:p>
+    <w:p>
+      <w:pPr>
+        <w:jc w:val="center"/>
+      </w:pPr>
+      <w:r>
+        <w:drawing>
+          <wp:inline distT="0" distB="0" distL="0" distR="0">
+            <wp:extent cx="5905500" cy="3143250"/>
+            <wp:effectExtent t="0" r="0" b="0" l="0"/>
+            <wp:docPr id="1" name="figura" descr="figura" title="figura"/>
+            <wp:cNvGraphicFramePr>
+              <a:graphicFrameLocks xmlns:a="http://schemas.openxmlformats.org/drawingml/2006/main" noChangeAspect="1"/>
+            </wp:cNvGraphicFramePr>
+            <a:graphic xmlns:a="http://schemas.openxmlformats.org/drawingml/2006/main">
+              <a:graphicData uri="http://schemas.openxmlformats.org/drawingml/2006/picture">
+                <pic:pic xmlns:pic="http://schemas.openxmlformats.org/drawingml/2006/picture">
+                  <pic:nvPicPr>
+                    <pic:cNvPr id="0" name="" descr=""/>
+                    <pic:cNvPicPr>
+                      <a:picLocks noChangeAspect="1" noChangeArrowheads="1"/>
+                    </pic:cNvPicPr>
+                  </pic:nvPicPr>
+                  <pic:blipFill>
+                    <a:blip r:embed="rId9" cstate="none"/>
+                    <a:srcRect/>
+                    <a:stretch>
+                      <a:fillRect/>
+                    </a:stretch>
+                  </pic:blipFill>
+                  <pic:spPr bwMode="auto">
+                    <a:xfrm>
+                      <a:off x="0" y="0"/>
                       <a:ext cx="5905500" cy="3143250"/>
                     </a:xfrm>
                     <a:prstGeom prst="rect">
@@ -893,17 +932,7 @@
           <w:sz w:val="18"/>
           <w:szCs w:val="18"/>
         </w:rPr>
-        <w:t xml:space="preserve">Figura 2. Cronograma de Rutástrofe (1 de octubre al 12 de diciembre de 2026). </w:t>
-      </w:r>
-      <w:r>
-        <w:rPr>
-          <w:i/>
-          <w:iCs/>
-          <w:sz w:val="18"/>
-          <w:szCs w:val="18"/>
-          <w:shd w:fill="FFFF00" w:color="auto" w:val="clear"/>
-        </w:rPr>
-        <w:t xml:space="preserve">[Reproducir este cronograma en GanttProject, que es la herramienta que pide la rúbrica de la socialización, y pegar aquí la captura]</w:t>
+        <w:t xml:space="preserve">Figura 2. Cronograma de Rutástrofe (1 de octubre al 12 de diciembre de 2026). El archivo Rutastrofe_cronograma.gan se puede abrir en GanttProject para tomar la captura oficial.</w:t>
       </w:r>
     </w:p>
     <w:tbl>
@@ -2783,13 +2812,115 @@
         <w:jc w:val="both"/>
       </w:pPr>
       <w:r>
-        <w:t xml:space="preserve">Las fechas de socialización siguen el protocolo PPI 2026-2. </w:t>
+        <w:t xml:space="preserve">Las fechas de las socializaciones siguen el protocolo PPI 2026-2.</w:t>
+      </w:r>
+    </w:p>
+    <w:p>
+      <w:pPr>
+        <w:pStyle w:val="Heading1"/>
+      </w:pPr>
+      <w:r>
+        <w:t xml:space="preserve">7. Marco teórico o marco de referencia</w:t>
+      </w:r>
+    </w:p>
+    <w:p>
+      <w:pPr>
+        <w:pStyle w:val="Heading2"/>
+      </w:pPr>
+      <w:r>
+        <w:t xml:space="preserve">7.1 Seguridad vial y conducción responsable</w:t>
+      </w:r>
+    </w:p>
+    <w:p>
+      <w:pPr>
+        <w:spacing w:after="120" w:line="276"/>
+        <w:jc w:val="both"/>
+      </w:pPr>
+      <w:r>
+        <w:t xml:space="preserve">La seguridad vial es un problema de salud pública: la Organización Mundial de la Salud (2023) estima que los siniestros viales causan alrededor de 1,19 millones de muertes al año en el mundo. En Medellín, el aumento del transporte privado y de la motocicleta (Área Metropolitana del Valle de Aburrá, 2026) y las muertes por siniestros reportadas por la Alcaldía de Medellín (s. f.) muestran que el problema es local y actual. La conducción responsable implica decisiones concretas: respetar los semáforos, usar casco, mantener la distancia de seguridad y no usar el celular al conducir.</w:t>
+      </w:r>
+    </w:p>
+    <w:p>
+      <w:pPr>
+        <w:pStyle w:val="Heading2"/>
+      </w:pPr>
+      <w:r>
+        <w:t xml:space="preserve">7.2 Juegos serios y gamificación</w:t>
+      </w:r>
+    </w:p>
+    <w:p>
+      <w:pPr>
+        <w:spacing w:after="120" w:line="276"/>
+        <w:jc w:val="both"/>
+      </w:pPr>
+      <w:r>
+        <w:t xml:space="preserve">Un juego serio es un juego diseñado con un propósito distinto al entretenimiento, como educar, entrenar o informar (Michael y Chen, 2005). La gamificación, por su parte, usa elementos de diseño de juegos (puntos, niveles, retos) en contextos que no son juegos (Deterding et al., 2011). Rutástrofe combina ambas ideas: es un juego con niveles, puntaje y vidas cuyo propósito es enseñar conducción segura mediante decisiones con consecuencias.</w:t>
+      </w:r>
+    </w:p>
+    <w:p>
+      <w:pPr>
+        <w:spacing w:after="120" w:line="276"/>
+        <w:jc w:val="both"/>
+      </w:pPr>
+      <w:r>
+        <w:t xml:space="preserve">Este enfoque ya se ha usado en educación vial. Arboleda y Maturana (2017) desarrollaron en Pereira un videojuego de seguridad vial a partir de una infografía, y Carmona (s. f.) propuso "Atrapados", una plataforma de juegos serios para niños de sexto grado en Costa Rica. A nivel nacional, la Agencia Nacional de Seguridad Vial (s. f.) incluye la gamificación como uno de los pilares de su programa de educación vial.</w:t>
+      </w:r>
+    </w:p>
+    <w:p>
+      <w:pPr>
+        <w:pStyle w:val="Heading2"/>
+      </w:pPr>
+      <w:r>
+        <w:t xml:space="preserve">7.3 Programación estructurada y modular</w:t>
+      </w:r>
+    </w:p>
+    <w:p>
+      <w:pPr>
+        <w:spacing w:after="120" w:line="276"/>
+        <w:jc w:val="both"/>
+      </w:pPr>
+      <w:r>
+        <w:t xml:space="preserve">El teorema de Böhm y Jacopini (1966) demostró que cualquier programa puede escribirse usando solo tres estructuras de control: secuencia, selección e iteración. Dijkstra (1968) defendió reducir el uso de saltos arbitrarios (GOTO) para obtener programas más claros. Estas ideas dan origen a la programación estructurada, que se complementa con la modularidad: dividir el programa en funciones con una tarea específica (Joyanes, 2008). En Rutástrofe, la secuencia organiza el flujo del juego, los condicionales evalúan si una decisión fue segura, las iteraciones sostienen el ciclo principal y las funciones separan acciones como mover la moto, evaluar decisiones y guardar el progreso.</w:t>
+      </w:r>
+    </w:p>
+    <w:p>
+      <w:pPr>
+        <w:pStyle w:val="Heading2"/>
+      </w:pPr>
+      <w:r>
+        <w:t xml:space="preserve">7.4 Archivos planos</w:t>
+      </w:r>
+    </w:p>
+    <w:p>
+      <w:pPr>
+        <w:spacing w:after="120" w:line="276"/>
+        <w:jc w:val="both"/>
+      </w:pPr>
+      <w:r>
+        <w:t xml:space="preserve">Un archivo plano almacena datos como texto simple, sin una estructura de base de datos, y se lee y escribe de forma secuencial (Joyanes, 2008). En Rutástrofe se usarán archivos .txt para guardar los usuarios, el progreso por nivel y los puntajes. La documentación del lenguaje explica cómo abrir, leer y escribir archivos de texto (Python Software Foundation, s. f.).</w:t>
+      </w:r>
+    </w:p>
+    <w:p>
+      <w:pPr>
+        <w:pStyle w:val="Heading2"/>
+      </w:pPr>
+      <w:r>
+        <w:t xml:space="preserve">7.5 Interfaz gráfica de escritorio</w:t>
+      </w:r>
+    </w:p>
+    <w:p>
+      <w:pPr>
+        <w:spacing w:after="120" w:line="276"/>
+        <w:jc w:val="both"/>
+      </w:pPr>
+      <w:r>
+        <w:t xml:space="preserve">Una aplicación de escritorio con interfaz gráfica responde a eventos del usuario (teclado, ratón) y redibuja la pantalla de forma continua. Para videojuegos 2D en Python se puede usar la biblioteca Pygame, que ofrece manejo de gráficos, sonido y eventos (Pygame, s. f.). </w:t>
       </w:r>
       <w:r>
         <w:rPr>
           <w:shd w:fill="FFFF00" w:color="auto" w:val="clear"/>
         </w:rPr>
-        <w:t xml:space="preserve">[Ajustar si el módulo sol cambia las fechas]</w:t>
+        <w:t xml:space="preserve">[Confirmar con el módulo sol el lenguaje y la biblioteca permitidos antes de dejarlos como definitivos]</w:t>
       </w:r>
     </w:p>
     <w:p>
@@ -2797,151 +2928,7 @@
         <w:pStyle w:val="Heading1"/>
       </w:pPr>
       <w:r>
-        <w:t xml:space="preserve">7. Marco teórico o marco de referencia</w:t>
-      </w:r>
-    </w:p>
-    <w:p>
-      <w:pPr>
-        <w:spacing w:after="120" w:line="276"/>
-        <w:jc w:val="both"/>
-      </w:pPr>
-      <w:r>
-        <w:rPr>
-          <w:shd w:fill="FFFF00" w:color="auto" w:val="clear"/>
-        </w:rPr>
-        <w:t xml:space="preserve">[Este marco es un esqueleto: cada subtema debe completarse leyendo y citando las fuentes (mínimo una por subtema). No copiar texto; parafrasear con cita en APA.]</w:t>
-      </w:r>
-    </w:p>
-    <w:p>
-      <w:pPr>
-        <w:pStyle w:val="Heading2"/>
-      </w:pPr>
-      <w:r>
-        <w:t xml:space="preserve">7.1 Seguridad vial y conducción responsable</w:t>
-      </w:r>
-    </w:p>
-    <w:p>
-      <w:pPr>
-        <w:spacing w:after="120" w:line="276"/>
-        <w:jc w:val="both"/>
-      </w:pPr>
-      <w:r>
-        <w:t xml:space="preserve">Definir siniestro vial, actor vial vulnerable y cultura ciudadana vial, y mostrar el contexto de Medellín con las cifras de la Alcaldía de Medellín (s. f.) y del Área Metropolitana (2026). </w:t>
-      </w:r>
-      <w:r>
-        <w:rPr>
-          <w:shd w:fill="FFFF00" w:color="auto" w:val="clear"/>
-        </w:rPr>
-        <w:t xml:space="preserve">[Agregar definiciones desde la OMS o la Agencia Nacional de Seguridad Vial]</w:t>
-      </w:r>
-    </w:p>
-    <w:p>
-      <w:pPr>
-        <w:pStyle w:val="Heading2"/>
-      </w:pPr>
-      <w:r>
-        <w:t xml:space="preserve">7.2 Juegos serios y gamificación en la educación vial</w:t>
-      </w:r>
-    </w:p>
-    <w:p>
-      <w:pPr>
-        <w:spacing w:after="120" w:line="276"/>
-        <w:jc w:val="both"/>
-      </w:pPr>
-      <w:r>
-        <w:t xml:space="preserve">Explicar qué es un juego serio y cómo se usa para educar sobre seguridad vial. Existen revisiones que muestran impactos mayormente positivos de los juegos serios en las habilidades de seguridad de los niños como peatones (ver Theseus, "Don't Be Like Frogger"). </w:t>
-      </w:r>
-      <w:r>
-        <w:rPr>
-          <w:shd w:fill="FFFF00" w:color="auto" w:val="clear"/>
-        </w:rPr>
-        <w:t xml:space="preserve">[Completar autor, año y URL; leer el resumen antes de citar]</w:t>
-      </w:r>
-    </w:p>
-    <w:p>
-      <w:pPr>
-        <w:pStyle w:val="Heading2"/>
-      </w:pPr>
-      <w:r>
-        <w:t xml:space="preserve">7.3 Programación estructurada y modular</w:t>
-      </w:r>
-    </w:p>
-    <w:p>
-      <w:pPr>
-        <w:spacing w:after="120" w:line="276"/>
-        <w:jc w:val="both"/>
-      </w:pPr>
-      <w:r>
-        <w:t xml:space="preserve">Describir las estructuras de secuencia, selección e iteración, el uso de funciones y por qué se evita la programación orientada a objetos en este proyecto. </w:t>
-      </w:r>
-      <w:r>
-        <w:rPr>
-          <w:shd w:fill="FFFF00" w:color="auto" w:val="clear"/>
-        </w:rPr>
-        <w:t xml:space="preserve">[Citar un libro de lógica de programación]</w:t>
-      </w:r>
-    </w:p>
-    <w:p>
-      <w:pPr>
-        <w:pStyle w:val="Heading2"/>
-      </w:pPr>
-      <w:r>
-        <w:t xml:space="preserve">7.4 Archivos planos</w:t>
-      </w:r>
-    </w:p>
-    <w:p>
-      <w:pPr>
-        <w:spacing w:after="120" w:line="276"/>
-        <w:jc w:val="both"/>
-      </w:pPr>
-      <w:r>
-        <w:t xml:space="preserve">Explicar qué es un archivo plano, cómo se lee y escribe, y el formato elegido para usuarios, progreso y puntajes. </w:t>
-      </w:r>
-      <w:r>
-        <w:rPr>
-          <w:shd w:fill="FFFF00" w:color="auto" w:val="clear"/>
-        </w:rPr>
-        <w:t xml:space="preserve">[Citar la documentación del lenguaje elegido]</w:t>
-      </w:r>
-    </w:p>
-    <w:p>
-      <w:pPr>
-        <w:pStyle w:val="Heading2"/>
-      </w:pPr>
-      <w:r>
-        <w:t xml:space="preserve">7.5 Interfaz gráfica de escritorio</w:t>
-      </w:r>
-    </w:p>
-    <w:p>
-      <w:pPr>
-        <w:spacing w:after="120" w:line="276"/>
-        <w:jc w:val="both"/>
-      </w:pPr>
-      <w:r>
-        <w:t xml:space="preserve">Describir la biblioteca elegida para la interfaz y el ciclo principal de un juego 2D (entrada, actualización, dibujo). </w:t>
-      </w:r>
-      <w:r>
-        <w:rPr>
-          <w:shd w:fill="FFFF00" w:color="auto" w:val="clear"/>
-        </w:rPr>
-        <w:t xml:space="preserve">[Definir el lenguaje y la biblioteca con el módulo sol; Python con Pygame es una opción]</w:t>
-      </w:r>
-    </w:p>
-    <w:p>
-      <w:pPr>
-        <w:pStyle w:val="Heading1"/>
-      </w:pPr>
-      <w:r>
         <w:t xml:space="preserve">8. Cuadro comparativo de tres proyectos similares</w:t>
-      </w:r>
-    </w:p>
-    <w:p>
-      <w:pPr>
-        <w:spacing w:after="120" w:line="276"/>
-        <w:jc w:val="both"/>
-      </w:pPr>
-      <w:r>
-        <w:t xml:space="preserve">Los tres proyectos se encontraron en la búsqueda inicial; las celdas resaltadas deben completarse leyendo el documento original.</w:t>
       </w:r>
     </w:p>
     <w:tbl>
@@ -2957,10 +2944,10 @@
         </w:tblBorders>
       </w:tblPr>
       <w:tblGrid>
-        <w:gridCol w:w="1560"/>
-        <w:gridCol w:w="2600"/>
-        <w:gridCol w:w="2600"/>
-        <w:gridCol w:w="2600"/>
+        <w:gridCol w:w="1500"/>
+        <w:gridCol w:w="2620"/>
+        <w:gridCol w:w="2620"/>
+        <w:gridCol w:w="2620"/>
       </w:tblGrid>
       <w:tr>
         <w:trPr>
@@ -2969,7 +2956,7 @@
         </w:trPr>
         <w:tc>
           <w:tcPr>
-            <w:tcW w:type="dxa" w:w="1560"/>
+            <w:tcW w:type="dxa" w:w="1500"/>
             <w:tcBorders>
               <w:top w:val="single" w:color="999999" w:sz="4"/>
               <w:left w:val="single" w:color="999999" w:sz="4"/>
@@ -3002,7 +2989,7 @@
         </w:tc>
         <w:tc>
           <w:tcPr>
-            <w:tcW w:type="dxa" w:w="2600"/>
+            <w:tcW w:type="dxa" w:w="2620"/>
             <w:tcBorders>
               <w:top w:val="single" w:color="999999" w:sz="4"/>
               <w:left w:val="single" w:color="999999" w:sz="4"/>
@@ -3029,13 +3016,13 @@
                 <w:sz w:val="19"/>
                 <w:szCs w:val="19"/>
               </w:rPr>
-              <w:t xml:space="preserve">Proyecto 1: videojuego de educación vial en Pereira</w:t>
-            </w:r>
-          </w:p>
-        </w:tc>
-        <w:tc>
-          <w:tcPr>
-            <w:tcW w:type="dxa" w:w="2600"/>
+              <w:t xml:space="preserve">Proyecto 1: "¿Y tú qué harías?" (Pereira, Colombia)</w:t>
+            </w:r>
+          </w:p>
+        </w:tc>
+        <w:tc>
+          <w:tcPr>
+            <w:tcW w:type="dxa" w:w="2620"/>
             <w:tcBorders>
               <w:top w:val="single" w:color="999999" w:sz="4"/>
               <w:left w:val="single" w:color="999999" w:sz="4"/>
@@ -3062,13 +3049,13 @@
                 <w:sz w:val="19"/>
                 <w:szCs w:val="19"/>
               </w:rPr>
-              <w:t xml:space="preserve">Proyecto 2: "Atrapados", plataforma de serious games para educación vial (Costa Rica)</w:t>
-            </w:r>
-          </w:p>
-        </w:tc>
-        <w:tc>
-          <w:tcPr>
-            <w:tcW w:type="dxa" w:w="2600"/>
+              <w:t xml:space="preserve">Proyecto 2: "Atrapados" (Costa Rica)</w:t>
+            </w:r>
+          </w:p>
+        </w:tc>
+        <w:tc>
+          <w:tcPr>
+            <w:tcW w:type="dxa" w:w="2620"/>
             <w:tcBorders>
               <w:top w:val="single" w:color="999999" w:sz="4"/>
               <w:left w:val="single" w:color="999999" w:sz="4"/>
@@ -3107,7 +3094,7 @@
         </w:trPr>
         <w:tc>
           <w:tcPr>
-            <w:tcW w:type="dxa" w:w="1560"/>
+            <w:tcW w:type="dxa" w:w="1500"/>
             <w:tcBorders>
               <w:top w:val="single" w:color="999999" w:sz="4"/>
               <w:left w:val="single" w:color="999999" w:sz="4"/>
@@ -3136,127 +3123,88 @@
         </w:tc>
         <w:tc>
           <w:tcPr>
-            <w:tcW w:type="dxa" w:w="2600"/>
-            <w:tcBorders>
-              <w:top w:val="single" w:color="999999" w:sz="4"/>
-              <w:left w:val="single" w:color="999999" w:sz="4"/>
-              <w:bottom w:val="single" w:color="999999" w:sz="4"/>
-              <w:right w:val="single" w:color="999999" w:sz="4"/>
-            </w:tcBorders>
-            <w:tcMar>
-              <w:top w:type="dxa" w:w="60"/>
-              <w:left w:type="dxa" w:w="90"/>
-              <w:bottom w:type="dxa" w:w="60"/>
-              <w:right w:type="dxa" w:w="90"/>
-            </w:tcMar>
-          </w:tcPr>
-          <w:p>
-            <w:pPr>
-              <w:spacing w:after="40"/>
-            </w:pPr>
-            <w:r>
-              <w:rPr>
-                <w:sz w:val="19"/>
-                <w:szCs w:val="19"/>
-                <w:shd w:fill="FFFF00" w:color="auto" w:val="clear"/>
-              </w:rPr>
-              <w:t xml:space="preserve">[Autores, año]</w:t>
-            </w:r>
-            <w:r>
-              <w:rPr>
-                <w:sz w:val="19"/>
-                <w:szCs w:val="19"/>
-              </w:rPr>
-              <w:t xml:space="preserve">. Revista Grafías, Universidad Católica de Pereira. https://revistas.ucp.edu.co/index.php/grafias/article/download/1368/1376</w:t>
-            </w:r>
-          </w:p>
-        </w:tc>
-        <w:tc>
-          <w:tcPr>
-            <w:tcW w:type="dxa" w:w="2600"/>
-            <w:tcBorders>
-              <w:top w:val="single" w:color="999999" w:sz="4"/>
-              <w:left w:val="single" w:color="999999" w:sz="4"/>
-              <w:bottom w:val="single" w:color="999999" w:sz="4"/>
-              <w:right w:val="single" w:color="999999" w:sz="4"/>
-            </w:tcBorders>
-            <w:tcMar>
-              <w:top w:type="dxa" w:w="60"/>
-              <w:left w:type="dxa" w:w="90"/>
-              <w:bottom w:type="dxa" w:w="60"/>
-              <w:right w:type="dxa" w:w="90"/>
-            </w:tcMar>
-          </w:tcPr>
-          <w:p>
-            <w:pPr>
-              <w:spacing w:after="40"/>
-            </w:pPr>
-            <w:r>
-              <w:rPr>
-                <w:sz w:val="19"/>
-                <w:szCs w:val="19"/>
-                <w:shd w:fill="FFFF00" w:color="auto" w:val="clear"/>
-              </w:rPr>
-              <w:t xml:space="preserve">[Autores, año]</w:t>
-            </w:r>
-            <w:r>
-              <w:rPr>
-                <w:sz w:val="19"/>
-                <w:szCs w:val="19"/>
-              </w:rPr>
-              <w:t xml:space="preserve">. Universidad de Costa Rica. https://www.kerwa.ucr.ac.cr/handle/10669/85289</w:t>
-            </w:r>
-          </w:p>
-        </w:tc>
-        <w:tc>
-          <w:tcPr>
-            <w:tcW w:type="dxa" w:w="2600"/>
-            <w:tcBorders>
-              <w:top w:val="single" w:color="999999" w:sz="4"/>
-              <w:left w:val="single" w:color="999999" w:sz="4"/>
-              <w:bottom w:val="single" w:color="999999" w:sz="4"/>
-              <w:right w:val="single" w:color="999999" w:sz="4"/>
-            </w:tcBorders>
-            <w:tcMar>
-              <w:top w:type="dxa" w:w="60"/>
-              <w:left w:type="dxa" w:w="90"/>
-              <w:bottom w:type="dxa" w:w="60"/>
-              <w:right w:type="dxa" w:w="90"/>
-            </w:tcMar>
-          </w:tcPr>
-          <w:p>
-            <w:pPr>
-              <w:spacing w:after="40"/>
-            </w:pPr>
-            <w:r>
-              <w:rPr>
-                <w:sz w:val="19"/>
-                <w:szCs w:val="19"/>
-              </w:rPr>
-              <w:t xml:space="preserve">Agencia Nacional de Seguridad Vial. </w:t>
-            </w:r>
-            <w:r>
-              <w:rPr>
-                <w:sz w:val="19"/>
-                <w:szCs w:val="19"/>
-                <w:shd w:fill="FFFF00" w:color="auto" w:val="clear"/>
-              </w:rPr>
-              <w:t xml:space="preserve">[año]</w:t>
-            </w:r>
-            <w:r>
-              <w:rPr>
-                <w:sz w:val="19"/>
-                <w:szCs w:val="19"/>
-              </w:rPr>
-              <w:t xml:space="preserve">. </w:t>
-            </w:r>
-            <w:r>
-              <w:rPr>
-                <w:sz w:val="19"/>
-                <w:szCs w:val="19"/>
-                <w:shd w:fill="FFFF00" w:color="auto" w:val="clear"/>
-              </w:rPr>
-              <w:t xml:space="preserve">[URL oficial]</w:t>
+            <w:tcW w:type="dxa" w:w="2620"/>
+            <w:tcBorders>
+              <w:top w:val="single" w:color="999999" w:sz="4"/>
+              <w:left w:val="single" w:color="999999" w:sz="4"/>
+              <w:bottom w:val="single" w:color="999999" w:sz="4"/>
+              <w:right w:val="single" w:color="999999" w:sz="4"/>
+            </w:tcBorders>
+            <w:tcMar>
+              <w:top w:type="dxa" w:w="60"/>
+              <w:left w:type="dxa" w:w="90"/>
+              <w:bottom w:type="dxa" w:w="60"/>
+              <w:right w:type="dxa" w:w="90"/>
+            </w:tcMar>
+          </w:tcPr>
+          <w:p>
+            <w:pPr>
+              <w:spacing w:after="40"/>
+            </w:pPr>
+            <w:r>
+              <w:rPr>
+                <w:sz w:val="19"/>
+                <w:szCs w:val="19"/>
+              </w:rPr>
+              <w:t xml:space="preserve">Arboleda y Maturana (2017)</w:t>
+            </w:r>
+          </w:p>
+        </w:tc>
+        <w:tc>
+          <w:tcPr>
+            <w:tcW w:type="dxa" w:w="2620"/>
+            <w:tcBorders>
+              <w:top w:val="single" w:color="999999" w:sz="4"/>
+              <w:left w:val="single" w:color="999999" w:sz="4"/>
+              <w:bottom w:val="single" w:color="999999" w:sz="4"/>
+              <w:right w:val="single" w:color="999999" w:sz="4"/>
+            </w:tcBorders>
+            <w:tcMar>
+              <w:top w:type="dxa" w:w="60"/>
+              <w:left w:type="dxa" w:w="90"/>
+              <w:bottom w:type="dxa" w:w="60"/>
+              <w:right w:type="dxa" w:w="90"/>
+            </w:tcMar>
+          </w:tcPr>
+          <w:p>
+            <w:pPr>
+              <w:spacing w:after="40"/>
+            </w:pPr>
+            <w:r>
+              <w:rPr>
+                <w:sz w:val="19"/>
+                <w:szCs w:val="19"/>
+              </w:rPr>
+              <w:t xml:space="preserve">Carmona (s. f.)</w:t>
+            </w:r>
+          </w:p>
+        </w:tc>
+        <w:tc>
+          <w:tcPr>
+            <w:tcW w:type="dxa" w:w="2620"/>
+            <w:tcBorders>
+              <w:top w:val="single" w:color="999999" w:sz="4"/>
+              <w:left w:val="single" w:color="999999" w:sz="4"/>
+              <w:bottom w:val="single" w:color="999999" w:sz="4"/>
+              <w:right w:val="single" w:color="999999" w:sz="4"/>
+            </w:tcBorders>
+            <w:tcMar>
+              <w:top w:type="dxa" w:w="60"/>
+              <w:left w:type="dxa" w:w="90"/>
+              <w:bottom w:type="dxa" w:w="60"/>
+              <w:right w:type="dxa" w:w="90"/>
+            </w:tcMar>
+          </w:tcPr>
+          <w:p>
+            <w:pPr>
+              <w:spacing w:after="40"/>
+            </w:pPr>
+            <w:r>
+              <w:rPr>
+                <w:sz w:val="19"/>
+                <w:szCs w:val="19"/>
+              </w:rPr>
+              <w:t xml:space="preserve">Agencia Nacional de Seguridad Vial (s. f.)</w:t>
             </w:r>
           </w:p>
         </w:tc>
@@ -3268,117 +3216,117 @@
         </w:trPr>
         <w:tc>
           <w:tcPr>
-            <w:tcW w:type="dxa" w:w="1560"/>
-            <w:tcBorders>
-              <w:top w:val="single" w:color="999999" w:sz="4"/>
-              <w:left w:val="single" w:color="999999" w:sz="4"/>
-              <w:bottom w:val="single" w:color="999999" w:sz="4"/>
-              <w:right w:val="single" w:color="999999" w:sz="4"/>
-            </w:tcBorders>
-            <w:tcMar>
-              <w:top w:type="dxa" w:w="60"/>
-              <w:left w:type="dxa" w:w="90"/>
-              <w:bottom w:type="dxa" w:w="60"/>
-              <w:right w:type="dxa" w:w="90"/>
-            </w:tcMar>
-          </w:tcPr>
-          <w:p>
-            <w:pPr>
-              <w:spacing w:after="40"/>
-            </w:pPr>
-            <w:r>
-              <w:rPr>
-                <w:sz w:val="19"/>
-                <w:szCs w:val="19"/>
-              </w:rPr>
-              <w:t xml:space="preserve">Problema</w:t>
-            </w:r>
-          </w:p>
-        </w:tc>
-        <w:tc>
-          <w:tcPr>
-            <w:tcW w:type="dxa" w:w="2600"/>
-            <w:tcBorders>
-              <w:top w:val="single" w:color="999999" w:sz="4"/>
-              <w:left w:val="single" w:color="999999" w:sz="4"/>
-              <w:bottom w:val="single" w:color="999999" w:sz="4"/>
-              <w:right w:val="single" w:color="999999" w:sz="4"/>
-            </w:tcBorders>
-            <w:tcMar>
-              <w:top w:type="dxa" w:w="60"/>
-              <w:left w:type="dxa" w:w="90"/>
-              <w:bottom w:type="dxa" w:w="60"/>
-              <w:right w:type="dxa" w:w="90"/>
-            </w:tcMar>
-          </w:tcPr>
-          <w:p>
-            <w:pPr>
-              <w:spacing w:after="40"/>
-            </w:pPr>
-            <w:r>
-              <w:rPr>
-                <w:sz w:val="19"/>
-                <w:szCs w:val="19"/>
-              </w:rPr>
-              <w:t xml:space="preserve">Falta de educación en seguridad vial</w:t>
-            </w:r>
-          </w:p>
-        </w:tc>
-        <w:tc>
-          <w:tcPr>
-            <w:tcW w:type="dxa" w:w="2600"/>
-            <w:tcBorders>
-              <w:top w:val="single" w:color="999999" w:sz="4"/>
-              <w:left w:val="single" w:color="999999" w:sz="4"/>
-              <w:bottom w:val="single" w:color="999999" w:sz="4"/>
-              <w:right w:val="single" w:color="999999" w:sz="4"/>
-            </w:tcBorders>
-            <w:tcMar>
-              <w:top w:type="dxa" w:w="60"/>
-              <w:left w:type="dxa" w:w="90"/>
-              <w:bottom w:type="dxa" w:w="60"/>
-              <w:right w:type="dxa" w:w="90"/>
-            </w:tcMar>
-          </w:tcPr>
-          <w:p>
-            <w:pPr>
-              <w:spacing w:after="40"/>
-            </w:pPr>
-            <w:r>
-              <w:rPr>
-                <w:sz w:val="19"/>
-                <w:szCs w:val="19"/>
-              </w:rPr>
-              <w:t xml:space="preserve">Nuevo modelo de educación vial</w:t>
-            </w:r>
-          </w:p>
-        </w:tc>
-        <w:tc>
-          <w:tcPr>
-            <w:tcW w:type="dxa" w:w="2600"/>
-            <w:tcBorders>
-              <w:top w:val="single" w:color="999999" w:sz="4"/>
-              <w:left w:val="single" w:color="999999" w:sz="4"/>
-              <w:bottom w:val="single" w:color="999999" w:sz="4"/>
-              <w:right w:val="single" w:color="999999" w:sz="4"/>
-            </w:tcBorders>
-            <w:tcMar>
-              <w:top w:type="dxa" w:w="60"/>
-              <w:left w:type="dxa" w:w="90"/>
-              <w:bottom w:type="dxa" w:w="60"/>
-              <w:right w:type="dxa" w:w="90"/>
-            </w:tcMar>
-          </w:tcPr>
-          <w:p>
-            <w:pPr>
-              <w:spacing w:after="40"/>
-            </w:pPr>
-            <w:r>
-              <w:rPr>
-                <w:sz w:val="19"/>
-                <w:szCs w:val="19"/>
-              </w:rPr>
-              <w:t xml:space="preserve">Reducir la siniestralidad de niños y adolescentes en su desplazamiento a la escuela</w:t>
+            <w:tcW w:type="dxa" w:w="1500"/>
+            <w:tcBorders>
+              <w:top w:val="single" w:color="999999" w:sz="4"/>
+              <w:left w:val="single" w:color="999999" w:sz="4"/>
+              <w:bottom w:val="single" w:color="999999" w:sz="4"/>
+              <w:right w:val="single" w:color="999999" w:sz="4"/>
+            </w:tcBorders>
+            <w:tcMar>
+              <w:top w:type="dxa" w:w="60"/>
+              <w:left w:type="dxa" w:w="90"/>
+              <w:bottom w:type="dxa" w:w="60"/>
+              <w:right w:type="dxa" w:w="90"/>
+            </w:tcMar>
+          </w:tcPr>
+          <w:p>
+            <w:pPr>
+              <w:spacing w:after="40"/>
+            </w:pPr>
+            <w:r>
+              <w:rPr>
+                <w:sz w:val="19"/>
+                <w:szCs w:val="19"/>
+              </w:rPr>
+              <w:t xml:space="preserve">Tipo</w:t>
+            </w:r>
+          </w:p>
+        </w:tc>
+        <w:tc>
+          <w:tcPr>
+            <w:tcW w:type="dxa" w:w="2620"/>
+            <w:tcBorders>
+              <w:top w:val="single" w:color="999999" w:sz="4"/>
+              <w:left w:val="single" w:color="999999" w:sz="4"/>
+              <w:bottom w:val="single" w:color="999999" w:sz="4"/>
+              <w:right w:val="single" w:color="999999" w:sz="4"/>
+            </w:tcBorders>
+            <w:tcMar>
+              <w:top w:type="dxa" w:w="60"/>
+              <w:left w:type="dxa" w:w="90"/>
+              <w:bottom w:type="dxa" w:w="60"/>
+              <w:right w:type="dxa" w:w="90"/>
+            </w:tcMar>
+          </w:tcPr>
+          <w:p>
+            <w:pPr>
+              <w:spacing w:after="40"/>
+            </w:pPr>
+            <w:r>
+              <w:rPr>
+                <w:sz w:val="19"/>
+                <w:szCs w:val="19"/>
+              </w:rPr>
+              <w:t xml:space="preserve">Artículo de investigación formativa (Especialización en Edumática, Universidad Católica de Pereira)</w:t>
+            </w:r>
+          </w:p>
+        </w:tc>
+        <w:tc>
+          <w:tcPr>
+            <w:tcW w:type="dxa" w:w="2620"/>
+            <w:tcBorders>
+              <w:top w:val="single" w:color="999999" w:sz="4"/>
+              <w:left w:val="single" w:color="999999" w:sz="4"/>
+              <w:bottom w:val="single" w:color="999999" w:sz="4"/>
+              <w:right w:val="single" w:color="999999" w:sz="4"/>
+            </w:tcBorders>
+            <w:tcMar>
+              <w:top w:type="dxa" w:w="60"/>
+              <w:left w:type="dxa" w:w="90"/>
+              <w:bottom w:type="dxa" w:w="60"/>
+              <w:right w:type="dxa" w:w="90"/>
+            </w:tcMar>
+          </w:tcPr>
+          <w:p>
+            <w:pPr>
+              <w:spacing w:after="40"/>
+            </w:pPr>
+            <w:r>
+              <w:rPr>
+                <w:sz w:val="19"/>
+                <w:szCs w:val="19"/>
+              </w:rPr>
+              <w:t xml:space="preserve">Trabajo de maestría (Universidad de Costa Rica)</w:t>
+            </w:r>
+          </w:p>
+        </w:tc>
+        <w:tc>
+          <w:tcPr>
+            <w:tcW w:type="dxa" w:w="2620"/>
+            <w:tcBorders>
+              <w:top w:val="single" w:color="999999" w:sz="4"/>
+              <w:left w:val="single" w:color="999999" w:sz="4"/>
+              <w:bottom w:val="single" w:color="999999" w:sz="4"/>
+              <w:right w:val="single" w:color="999999" w:sz="4"/>
+            </w:tcBorders>
+            <w:tcMar>
+              <w:top w:type="dxa" w:w="60"/>
+              <w:left w:type="dxa" w:w="90"/>
+              <w:bottom w:type="dxa" w:w="60"/>
+              <w:right w:type="dxa" w:w="90"/>
+            </w:tcMar>
+          </w:tcPr>
+          <w:p>
+            <w:pPr>
+              <w:spacing w:after="40"/>
+            </w:pPr>
+            <w:r>
+              <w:rPr>
+                <w:sz w:val="19"/>
+                <w:szCs w:val="19"/>
+              </w:rPr>
+              <w:t xml:space="preserve">Programa estatal de educación vial</w:t>
             </w:r>
           </w:p>
         </w:tc>
@@ -3390,119 +3338,117 @@
         </w:trPr>
         <w:tc>
           <w:tcPr>
-            <w:tcW w:type="dxa" w:w="1560"/>
-            <w:tcBorders>
-              <w:top w:val="single" w:color="999999" w:sz="4"/>
-              <w:left w:val="single" w:color="999999" w:sz="4"/>
-              <w:bottom w:val="single" w:color="999999" w:sz="4"/>
-              <w:right w:val="single" w:color="999999" w:sz="4"/>
-            </w:tcBorders>
-            <w:tcMar>
-              <w:top w:type="dxa" w:w="60"/>
-              <w:left w:type="dxa" w:w="90"/>
-              <w:bottom w:type="dxa" w:w="60"/>
-              <w:right w:type="dxa" w:w="90"/>
-            </w:tcMar>
-          </w:tcPr>
-          <w:p>
-            <w:pPr>
-              <w:spacing w:after="40"/>
-            </w:pPr>
-            <w:r>
-              <w:rPr>
-                <w:sz w:val="19"/>
-                <w:szCs w:val="19"/>
-              </w:rPr>
-              <w:t xml:space="preserve">Público</w:t>
-            </w:r>
-          </w:p>
-        </w:tc>
-        <w:tc>
-          <w:tcPr>
-            <w:tcW w:type="dxa" w:w="2600"/>
-            <w:tcBorders>
-              <w:top w:val="single" w:color="999999" w:sz="4"/>
-              <w:left w:val="single" w:color="999999" w:sz="4"/>
-              <w:bottom w:val="single" w:color="999999" w:sz="4"/>
-              <w:right w:val="single" w:color="999999" w:sz="4"/>
-            </w:tcBorders>
-            <w:tcMar>
-              <w:top w:type="dxa" w:w="60"/>
-              <w:left w:type="dxa" w:w="90"/>
-              <w:bottom w:type="dxa" w:w="60"/>
-              <w:right w:type="dxa" w:w="90"/>
-            </w:tcMar>
-          </w:tcPr>
-          <w:p>
-            <w:pPr>
-              <w:spacing w:after="40"/>
-            </w:pPr>
-            <w:r>
-              <w:rPr>
-                <w:sz w:val="19"/>
-                <w:szCs w:val="19"/>
-                <w:shd w:fill="FFFF00" w:color="auto" w:val="clear"/>
-              </w:rPr>
-              <w:t xml:space="preserve">[completar]</w:t>
-            </w:r>
-          </w:p>
-        </w:tc>
-        <w:tc>
-          <w:tcPr>
-            <w:tcW w:type="dxa" w:w="2600"/>
-            <w:tcBorders>
-              <w:top w:val="single" w:color="999999" w:sz="4"/>
-              <w:left w:val="single" w:color="999999" w:sz="4"/>
-              <w:bottom w:val="single" w:color="999999" w:sz="4"/>
-              <w:right w:val="single" w:color="999999" w:sz="4"/>
-            </w:tcBorders>
-            <w:tcMar>
-              <w:top w:type="dxa" w:w="60"/>
-              <w:left w:type="dxa" w:w="90"/>
-              <w:bottom w:type="dxa" w:w="60"/>
-              <w:right w:type="dxa" w:w="90"/>
-            </w:tcMar>
-          </w:tcPr>
-          <w:p>
-            <w:pPr>
-              <w:spacing w:after="40"/>
-            </w:pPr>
-            <w:r>
-              <w:rPr>
-                <w:sz w:val="19"/>
-                <w:szCs w:val="19"/>
-                <w:shd w:fill="FFFF00" w:color="auto" w:val="clear"/>
-              </w:rPr>
-              <w:t xml:space="preserve">[completar]</w:t>
-            </w:r>
-          </w:p>
-        </w:tc>
-        <w:tc>
-          <w:tcPr>
-            <w:tcW w:type="dxa" w:w="2600"/>
-            <w:tcBorders>
-              <w:top w:val="single" w:color="999999" w:sz="4"/>
-              <w:left w:val="single" w:color="999999" w:sz="4"/>
-              <w:bottom w:val="single" w:color="999999" w:sz="4"/>
-              <w:right w:val="single" w:color="999999" w:sz="4"/>
-            </w:tcBorders>
-            <w:tcMar>
-              <w:top w:type="dxa" w:w="60"/>
-              <w:left w:type="dxa" w:w="90"/>
-              <w:bottom w:type="dxa" w:w="60"/>
-              <w:right w:type="dxa" w:w="90"/>
-            </w:tcMar>
-          </w:tcPr>
-          <w:p>
-            <w:pPr>
-              <w:spacing w:after="40"/>
-            </w:pPr>
-            <w:r>
-              <w:rPr>
-                <w:sz w:val="19"/>
-                <w:szCs w:val="19"/>
-              </w:rPr>
-              <w:t xml:space="preserve">Niños, niñas y adolescentes; 55 municipios y 151 instituciones educativas</w:t>
+            <w:tcW w:type="dxa" w:w="1500"/>
+            <w:tcBorders>
+              <w:top w:val="single" w:color="999999" w:sz="4"/>
+              <w:left w:val="single" w:color="999999" w:sz="4"/>
+              <w:bottom w:val="single" w:color="999999" w:sz="4"/>
+              <w:right w:val="single" w:color="999999" w:sz="4"/>
+            </w:tcBorders>
+            <w:tcMar>
+              <w:top w:type="dxa" w:w="60"/>
+              <w:left w:type="dxa" w:w="90"/>
+              <w:bottom w:type="dxa" w:w="60"/>
+              <w:right w:type="dxa" w:w="90"/>
+            </w:tcMar>
+          </w:tcPr>
+          <w:p>
+            <w:pPr>
+              <w:spacing w:after="40"/>
+            </w:pPr>
+            <w:r>
+              <w:rPr>
+                <w:sz w:val="19"/>
+                <w:szCs w:val="19"/>
+              </w:rPr>
+              <w:t xml:space="preserve">Problema</w:t>
+            </w:r>
+          </w:p>
+        </w:tc>
+        <w:tc>
+          <w:tcPr>
+            <w:tcW w:type="dxa" w:w="2620"/>
+            <w:tcBorders>
+              <w:top w:val="single" w:color="999999" w:sz="4"/>
+              <w:left w:val="single" w:color="999999" w:sz="4"/>
+              <w:bottom w:val="single" w:color="999999" w:sz="4"/>
+              <w:right w:val="single" w:color="999999" w:sz="4"/>
+            </w:tcBorders>
+            <w:tcMar>
+              <w:top w:type="dxa" w:w="60"/>
+              <w:left w:type="dxa" w:w="90"/>
+              <w:bottom w:type="dxa" w:w="60"/>
+              <w:right w:type="dxa" w:w="90"/>
+            </w:tcMar>
+          </w:tcPr>
+          <w:p>
+            <w:pPr>
+              <w:spacing w:after="40"/>
+            </w:pPr>
+            <w:r>
+              <w:rPr>
+                <w:sz w:val="19"/>
+                <w:szCs w:val="19"/>
+              </w:rPr>
+              <w:t xml:space="preserve">Falta de educación en seguridad vial en Pereira</w:t>
+            </w:r>
+          </w:p>
+        </w:tc>
+        <w:tc>
+          <w:tcPr>
+            <w:tcW w:type="dxa" w:w="2620"/>
+            <w:tcBorders>
+              <w:top w:val="single" w:color="999999" w:sz="4"/>
+              <w:left w:val="single" w:color="999999" w:sz="4"/>
+              <w:bottom w:val="single" w:color="999999" w:sz="4"/>
+              <w:right w:val="single" w:color="999999" w:sz="4"/>
+            </w:tcBorders>
+            <w:tcMar>
+              <w:top w:type="dxa" w:w="60"/>
+              <w:left w:type="dxa" w:w="90"/>
+              <w:bottom w:type="dxa" w:w="60"/>
+              <w:right w:type="dxa" w:w="90"/>
+            </w:tcMar>
+          </w:tcPr>
+          <w:p>
+            <w:pPr>
+              <w:spacing w:after="40"/>
+            </w:pPr>
+            <w:r>
+              <w:rPr>
+                <w:sz w:val="19"/>
+                <w:szCs w:val="19"/>
+              </w:rPr>
+              <w:t xml:space="preserve">Cultura vial y movilidad en la zona metropolitana congestionada de Costa Rica</w:t>
+            </w:r>
+          </w:p>
+        </w:tc>
+        <w:tc>
+          <w:tcPr>
+            <w:tcW w:type="dxa" w:w="2620"/>
+            <w:tcBorders>
+              <w:top w:val="single" w:color="999999" w:sz="4"/>
+              <w:left w:val="single" w:color="999999" w:sz="4"/>
+              <w:bottom w:val="single" w:color="999999" w:sz="4"/>
+              <w:right w:val="single" w:color="999999" w:sz="4"/>
+            </w:tcBorders>
+            <w:tcMar>
+              <w:top w:type="dxa" w:w="60"/>
+              <w:left w:type="dxa" w:w="90"/>
+              <w:bottom w:type="dxa" w:w="60"/>
+              <w:right w:type="dxa" w:w="90"/>
+            </w:tcMar>
+          </w:tcPr>
+          <w:p>
+            <w:pPr>
+              <w:spacing w:after="40"/>
+            </w:pPr>
+            <w:r>
+              <w:rPr>
+                <w:sz w:val="19"/>
+                <w:szCs w:val="19"/>
+              </w:rPr>
+              <w:t xml:space="preserve">Siniestralidad de niños y adolescentes en su desplazamiento a la escuela</w:t>
             </w:r>
           </w:p>
         </w:tc>
@@ -3514,117 +3460,125 @@
         </w:trPr>
         <w:tc>
           <w:tcPr>
-            <w:tcW w:type="dxa" w:w="1560"/>
-            <w:tcBorders>
-              <w:top w:val="single" w:color="999999" w:sz="4"/>
-              <w:left w:val="single" w:color="999999" w:sz="4"/>
-              <w:bottom w:val="single" w:color="999999" w:sz="4"/>
-              <w:right w:val="single" w:color="999999" w:sz="4"/>
-            </w:tcBorders>
-            <w:tcMar>
-              <w:top w:type="dxa" w:w="60"/>
-              <w:left w:type="dxa" w:w="90"/>
-              <w:bottom w:type="dxa" w:w="60"/>
-              <w:right w:type="dxa" w:w="90"/>
-            </w:tcMar>
-          </w:tcPr>
-          <w:p>
-            <w:pPr>
-              <w:spacing w:after="40"/>
-            </w:pPr>
-            <w:r>
-              <w:rPr>
-                <w:sz w:val="19"/>
-                <w:szCs w:val="19"/>
-              </w:rPr>
-              <w:t xml:space="preserve">Tecnología / formato</w:t>
-            </w:r>
-          </w:p>
-        </w:tc>
-        <w:tc>
-          <w:tcPr>
-            <w:tcW w:type="dxa" w:w="2600"/>
-            <w:tcBorders>
-              <w:top w:val="single" w:color="999999" w:sz="4"/>
-              <w:left w:val="single" w:color="999999" w:sz="4"/>
-              <w:bottom w:val="single" w:color="999999" w:sz="4"/>
-              <w:right w:val="single" w:color="999999" w:sz="4"/>
-            </w:tcBorders>
-            <w:tcMar>
-              <w:top w:type="dxa" w:w="60"/>
-              <w:left w:type="dxa" w:w="90"/>
-              <w:bottom w:type="dxa" w:w="60"/>
-              <w:right w:type="dxa" w:w="90"/>
-            </w:tcMar>
-          </w:tcPr>
-          <w:p>
-            <w:pPr>
-              <w:spacing w:after="40"/>
-            </w:pPr>
-            <w:r>
-              <w:rPr>
-                <w:sz w:val="19"/>
-                <w:szCs w:val="19"/>
-              </w:rPr>
-              <w:t xml:space="preserve">Videojuego a partir de una infografía</w:t>
-            </w:r>
-          </w:p>
-        </w:tc>
-        <w:tc>
-          <w:tcPr>
-            <w:tcW w:type="dxa" w:w="2600"/>
-            <w:tcBorders>
-              <w:top w:val="single" w:color="999999" w:sz="4"/>
-              <w:left w:val="single" w:color="999999" w:sz="4"/>
-              <w:bottom w:val="single" w:color="999999" w:sz="4"/>
-              <w:right w:val="single" w:color="999999" w:sz="4"/>
-            </w:tcBorders>
-            <w:tcMar>
-              <w:top w:type="dxa" w:w="60"/>
-              <w:left w:type="dxa" w:w="90"/>
-              <w:bottom w:type="dxa" w:w="60"/>
-              <w:right w:type="dxa" w:w="90"/>
-            </w:tcMar>
-          </w:tcPr>
-          <w:p>
-            <w:pPr>
-              <w:spacing w:after="40"/>
-            </w:pPr>
-            <w:r>
-              <w:rPr>
-                <w:sz w:val="19"/>
-                <w:szCs w:val="19"/>
-              </w:rPr>
-              <w:t xml:space="preserve">Plataforma de serious games</w:t>
-            </w:r>
-          </w:p>
-        </w:tc>
-        <w:tc>
-          <w:tcPr>
-            <w:tcW w:type="dxa" w:w="2600"/>
-            <w:tcBorders>
-              <w:top w:val="single" w:color="999999" w:sz="4"/>
-              <w:left w:val="single" w:color="999999" w:sz="4"/>
-              <w:bottom w:val="single" w:color="999999" w:sz="4"/>
-              <w:right w:val="single" w:color="999999" w:sz="4"/>
-            </w:tcBorders>
-            <w:tcMar>
-              <w:top w:type="dxa" w:w="60"/>
-              <w:left w:type="dxa" w:w="90"/>
-              <w:bottom w:type="dxa" w:w="60"/>
-              <w:right w:type="dxa" w:w="90"/>
-            </w:tcMar>
-          </w:tcPr>
-          <w:p>
-            <w:pPr>
-              <w:spacing w:after="40"/>
-            </w:pPr>
-            <w:r>
-              <w:rPr>
-                <w:sz w:val="19"/>
-                <w:szCs w:val="19"/>
-              </w:rPr>
-              <w:t xml:space="preserve">Gamificación con juegos de gran formato</w:t>
+            <w:tcW w:type="dxa" w:w="1500"/>
+            <w:tcBorders>
+              <w:top w:val="single" w:color="999999" w:sz="4"/>
+              <w:left w:val="single" w:color="999999" w:sz="4"/>
+              <w:bottom w:val="single" w:color="999999" w:sz="4"/>
+              <w:right w:val="single" w:color="999999" w:sz="4"/>
+            </w:tcBorders>
+            <w:tcMar>
+              <w:top w:type="dxa" w:w="60"/>
+              <w:left w:type="dxa" w:w="90"/>
+              <w:bottom w:type="dxa" w:w="60"/>
+              <w:right w:type="dxa" w:w="90"/>
+            </w:tcMar>
+          </w:tcPr>
+          <w:p>
+            <w:pPr>
+              <w:spacing w:after="40"/>
+            </w:pPr>
+            <w:r>
+              <w:rPr>
+                <w:sz w:val="19"/>
+                <w:szCs w:val="19"/>
+              </w:rPr>
+              <w:t xml:space="preserve">Público</w:t>
+            </w:r>
+          </w:p>
+        </w:tc>
+        <w:tc>
+          <w:tcPr>
+            <w:tcW w:type="dxa" w:w="2620"/>
+            <w:tcBorders>
+              <w:top w:val="single" w:color="999999" w:sz="4"/>
+              <w:left w:val="single" w:color="999999" w:sz="4"/>
+              <w:bottom w:val="single" w:color="999999" w:sz="4"/>
+              <w:right w:val="single" w:color="999999" w:sz="4"/>
+            </w:tcBorders>
+            <w:tcMar>
+              <w:top w:type="dxa" w:w="60"/>
+              <w:left w:type="dxa" w:w="90"/>
+              <w:bottom w:type="dxa" w:w="60"/>
+              <w:right w:type="dxa" w:w="90"/>
+            </w:tcMar>
+          </w:tcPr>
+          <w:p>
+            <w:pPr>
+              <w:spacing w:after="40"/>
+            </w:pPr>
+            <w:r>
+              <w:rPr>
+                <w:sz w:val="19"/>
+                <w:szCs w:val="19"/>
+              </w:rPr>
+              <w:t xml:space="preserve">Estudiantes y ciudadanos de Pereira </w:t>
+            </w:r>
+            <w:r>
+              <w:rPr>
+                <w:sz w:val="19"/>
+                <w:szCs w:val="19"/>
+                <w:shd w:fill="FFFF00" w:color="auto" w:val="clear"/>
+              </w:rPr>
+              <w:t xml:space="preserve">[confirmar en el artículo]</w:t>
+            </w:r>
+          </w:p>
+        </w:tc>
+        <w:tc>
+          <w:tcPr>
+            <w:tcW w:type="dxa" w:w="2620"/>
+            <w:tcBorders>
+              <w:top w:val="single" w:color="999999" w:sz="4"/>
+              <w:left w:val="single" w:color="999999" w:sz="4"/>
+              <w:bottom w:val="single" w:color="999999" w:sz="4"/>
+              <w:right w:val="single" w:color="999999" w:sz="4"/>
+            </w:tcBorders>
+            <w:tcMar>
+              <w:top w:type="dxa" w:w="60"/>
+              <w:left w:type="dxa" w:w="90"/>
+              <w:bottom w:type="dxa" w:w="60"/>
+              <w:right w:type="dxa" w:w="90"/>
+            </w:tcMar>
+          </w:tcPr>
+          <w:p>
+            <w:pPr>
+              <w:spacing w:after="40"/>
+            </w:pPr>
+            <w:r>
+              <w:rPr>
+                <w:sz w:val="19"/>
+                <w:szCs w:val="19"/>
+              </w:rPr>
+              <w:t xml:space="preserve">Niños de sexto grado de primaria</w:t>
+            </w:r>
+          </w:p>
+        </w:tc>
+        <w:tc>
+          <w:tcPr>
+            <w:tcW w:type="dxa" w:w="2620"/>
+            <w:tcBorders>
+              <w:top w:val="single" w:color="999999" w:sz="4"/>
+              <w:left w:val="single" w:color="999999" w:sz="4"/>
+              <w:bottom w:val="single" w:color="999999" w:sz="4"/>
+              <w:right w:val="single" w:color="999999" w:sz="4"/>
+            </w:tcBorders>
+            <w:tcMar>
+              <w:top w:type="dxa" w:w="60"/>
+              <w:left w:type="dxa" w:w="90"/>
+              <w:bottom w:type="dxa" w:w="60"/>
+              <w:right w:type="dxa" w:w="90"/>
+            </w:tcMar>
+          </w:tcPr>
+          <w:p>
+            <w:pPr>
+              <w:spacing w:after="40"/>
+            </w:pPr>
+            <w:r>
+              <w:rPr>
+                <w:sz w:val="19"/>
+                <w:szCs w:val="19"/>
+              </w:rPr>
+              <w:t xml:space="preserve">Niños, niñas y adolescentes; 55 municipios y 151 instituciones educativas</w:t>
             </w:r>
           </w:p>
         </w:tc>
@@ -3636,120 +3590,117 @@
         </w:trPr>
         <w:tc>
           <w:tcPr>
-            <w:tcW w:type="dxa" w:w="1560"/>
-            <w:tcBorders>
-              <w:top w:val="single" w:color="999999" w:sz="4"/>
-              <w:left w:val="single" w:color="999999" w:sz="4"/>
-              <w:bottom w:val="single" w:color="999999" w:sz="4"/>
-              <w:right w:val="single" w:color="999999" w:sz="4"/>
-            </w:tcBorders>
-            <w:tcMar>
-              <w:top w:type="dxa" w:w="60"/>
-              <w:left w:type="dxa" w:w="90"/>
-              <w:bottom w:type="dxa" w:w="60"/>
-              <w:right w:type="dxa" w:w="90"/>
-            </w:tcMar>
-          </w:tcPr>
-          <w:p>
-            <w:pPr>
-              <w:spacing w:after="40"/>
-            </w:pPr>
-            <w:r>
-              <w:rPr>
-                <w:sz w:val="19"/>
-                <w:szCs w:val="19"/>
-              </w:rPr>
-              <w:t xml:space="preserve">Resultados</w:t>
-            </w:r>
-          </w:p>
-        </w:tc>
-        <w:tc>
-          <w:tcPr>
-            <w:tcW w:type="dxa" w:w="2600"/>
-            <w:tcBorders>
-              <w:top w:val="single" w:color="999999" w:sz="4"/>
-              <w:left w:val="single" w:color="999999" w:sz="4"/>
-              <w:bottom w:val="single" w:color="999999" w:sz="4"/>
-              <w:right w:val="single" w:color="999999" w:sz="4"/>
-            </w:tcBorders>
-            <w:tcMar>
-              <w:top w:type="dxa" w:w="60"/>
-              <w:left w:type="dxa" w:w="90"/>
-              <w:bottom w:type="dxa" w:w="60"/>
-              <w:right w:type="dxa" w:w="90"/>
-            </w:tcMar>
-          </w:tcPr>
-          <w:p>
-            <w:pPr>
-              <w:spacing w:after="40"/>
-            </w:pPr>
-            <w:r>
-              <w:rPr>
-                <w:sz w:val="19"/>
-                <w:szCs w:val="19"/>
-                <w:shd w:fill="FFFF00" w:color="auto" w:val="clear"/>
-              </w:rPr>
-              <w:t xml:space="preserve">[completar]</w:t>
-            </w:r>
-          </w:p>
-        </w:tc>
-        <w:tc>
-          <w:tcPr>
-            <w:tcW w:type="dxa" w:w="2600"/>
-            <w:tcBorders>
-              <w:top w:val="single" w:color="999999" w:sz="4"/>
-              <w:left w:val="single" w:color="999999" w:sz="4"/>
-              <w:bottom w:val="single" w:color="999999" w:sz="4"/>
-              <w:right w:val="single" w:color="999999" w:sz="4"/>
-            </w:tcBorders>
-            <w:tcMar>
-              <w:top w:type="dxa" w:w="60"/>
-              <w:left w:type="dxa" w:w="90"/>
-              <w:bottom w:type="dxa" w:w="60"/>
-              <w:right w:type="dxa" w:w="90"/>
-            </w:tcMar>
-          </w:tcPr>
-          <w:p>
-            <w:pPr>
-              <w:spacing w:after="40"/>
-            </w:pPr>
-            <w:r>
-              <w:rPr>
-                <w:sz w:val="19"/>
-                <w:szCs w:val="19"/>
-                <w:shd w:fill="FFFF00" w:color="auto" w:val="clear"/>
-              </w:rPr>
-              <w:t xml:space="preserve">[completar]</w:t>
-            </w:r>
-          </w:p>
-        </w:tc>
-        <w:tc>
-          <w:tcPr>
-            <w:tcW w:type="dxa" w:w="2600"/>
-            <w:tcBorders>
-              <w:top w:val="single" w:color="999999" w:sz="4"/>
-              <w:left w:val="single" w:color="999999" w:sz="4"/>
-              <w:bottom w:val="single" w:color="999999" w:sz="4"/>
-              <w:right w:val="single" w:color="999999" w:sz="4"/>
-            </w:tcBorders>
-            <w:tcMar>
-              <w:top w:type="dxa" w:w="60"/>
-              <w:left w:type="dxa" w:w="90"/>
-              <w:bottom w:type="dxa" w:w="60"/>
-              <w:right w:type="dxa" w:w="90"/>
-            </w:tcMar>
-          </w:tcPr>
-          <w:p>
-            <w:pPr>
-              <w:spacing w:after="40"/>
-            </w:pPr>
-            <w:r>
-              <w:rPr>
-                <w:sz w:val="19"/>
-                <w:szCs w:val="19"/>
-                <w:shd w:fill="FFFF00" w:color="auto" w:val="clear"/>
-              </w:rPr>
-              <w:t xml:space="preserve">[completar]</w:t>
+            <w:tcW w:type="dxa" w:w="1500"/>
+            <w:tcBorders>
+              <w:top w:val="single" w:color="999999" w:sz="4"/>
+              <w:left w:val="single" w:color="999999" w:sz="4"/>
+              <w:bottom w:val="single" w:color="999999" w:sz="4"/>
+              <w:right w:val="single" w:color="999999" w:sz="4"/>
+            </w:tcBorders>
+            <w:tcMar>
+              <w:top w:type="dxa" w:w="60"/>
+              <w:left w:type="dxa" w:w="90"/>
+              <w:bottom w:type="dxa" w:w="60"/>
+              <w:right w:type="dxa" w:w="90"/>
+            </w:tcMar>
+          </w:tcPr>
+          <w:p>
+            <w:pPr>
+              <w:spacing w:after="40"/>
+            </w:pPr>
+            <w:r>
+              <w:rPr>
+                <w:sz w:val="19"/>
+                <w:szCs w:val="19"/>
+              </w:rPr>
+              <w:t xml:space="preserve">Solución / formato</w:t>
+            </w:r>
+          </w:p>
+        </w:tc>
+        <w:tc>
+          <w:tcPr>
+            <w:tcW w:type="dxa" w:w="2620"/>
+            <w:tcBorders>
+              <w:top w:val="single" w:color="999999" w:sz="4"/>
+              <w:left w:val="single" w:color="999999" w:sz="4"/>
+              <w:bottom w:val="single" w:color="999999" w:sz="4"/>
+              <w:right w:val="single" w:color="999999" w:sz="4"/>
+            </w:tcBorders>
+            <w:tcMar>
+              <w:top w:type="dxa" w:w="60"/>
+              <w:left w:type="dxa" w:w="90"/>
+              <w:bottom w:type="dxa" w:w="60"/>
+              <w:right w:type="dxa" w:w="90"/>
+            </w:tcMar>
+          </w:tcPr>
+          <w:p>
+            <w:pPr>
+              <w:spacing w:after="40"/>
+            </w:pPr>
+            <w:r>
+              <w:rPr>
+                <w:sz w:val="19"/>
+                <w:szCs w:val="19"/>
+              </w:rPr>
+              <w:t xml:space="preserve">Videojuego creado a partir de una infografía</w:t>
+            </w:r>
+          </w:p>
+        </w:tc>
+        <w:tc>
+          <w:tcPr>
+            <w:tcW w:type="dxa" w:w="2620"/>
+            <w:tcBorders>
+              <w:top w:val="single" w:color="999999" w:sz="4"/>
+              <w:left w:val="single" w:color="999999" w:sz="4"/>
+              <w:bottom w:val="single" w:color="999999" w:sz="4"/>
+              <w:right w:val="single" w:color="999999" w:sz="4"/>
+            </w:tcBorders>
+            <w:tcMar>
+              <w:top w:type="dxa" w:w="60"/>
+              <w:left w:type="dxa" w:w="90"/>
+              <w:bottom w:type="dxa" w:w="60"/>
+              <w:right w:type="dxa" w:w="90"/>
+            </w:tcMar>
+          </w:tcPr>
+          <w:p>
+            <w:pPr>
+              <w:spacing w:after="40"/>
+            </w:pPr>
+            <w:r>
+              <w:rPr>
+                <w:sz w:val="19"/>
+                <w:szCs w:val="19"/>
+              </w:rPr>
+              <w:t xml:space="preserve">Aplicación web progresiva con juegos serios y narrativa por etapas</w:t>
+            </w:r>
+          </w:p>
+        </w:tc>
+        <w:tc>
+          <w:tcPr>
+            <w:tcW w:type="dxa" w:w="2620"/>
+            <w:tcBorders>
+              <w:top w:val="single" w:color="999999" w:sz="4"/>
+              <w:left w:val="single" w:color="999999" w:sz="4"/>
+              <w:bottom w:val="single" w:color="999999" w:sz="4"/>
+              <w:right w:val="single" w:color="999999" w:sz="4"/>
+            </w:tcBorders>
+            <w:tcMar>
+              <w:top w:type="dxa" w:w="60"/>
+              <w:left w:type="dxa" w:w="90"/>
+              <w:bottom w:type="dxa" w:w="60"/>
+              <w:right w:type="dxa" w:w="90"/>
+            </w:tcMar>
+          </w:tcPr>
+          <w:p>
+            <w:pPr>
+              <w:spacing w:after="40"/>
+            </w:pPr>
+            <w:r>
+              <w:rPr>
+                <w:sz w:val="19"/>
+                <w:szCs w:val="19"/>
+              </w:rPr>
+              <w:t xml:space="preserve">Gamificación con juegos de gran formato, entornos escolares seguros y rutas escolares seguras</w:t>
             </w:r>
           </w:p>
         </w:tc>
@@ -3761,7 +3712,129 @@
         </w:trPr>
         <w:tc>
           <w:tcPr>
-            <w:tcW w:type="dxa" w:w="1560"/>
+            <w:tcW w:type="dxa" w:w="1500"/>
+            <w:tcBorders>
+              <w:top w:val="single" w:color="999999" w:sz="4"/>
+              <w:left w:val="single" w:color="999999" w:sz="4"/>
+              <w:bottom w:val="single" w:color="999999" w:sz="4"/>
+              <w:right w:val="single" w:color="999999" w:sz="4"/>
+            </w:tcBorders>
+            <w:tcMar>
+              <w:top w:type="dxa" w:w="60"/>
+              <w:left w:type="dxa" w:w="90"/>
+              <w:bottom w:type="dxa" w:w="60"/>
+              <w:right w:type="dxa" w:w="90"/>
+            </w:tcMar>
+          </w:tcPr>
+          <w:p>
+            <w:pPr>
+              <w:spacing w:after="40"/>
+            </w:pPr>
+            <w:r>
+              <w:rPr>
+                <w:sz w:val="19"/>
+                <w:szCs w:val="19"/>
+              </w:rPr>
+              <w:t xml:space="preserve">Qué aporta a Rutástrofe</w:t>
+            </w:r>
+          </w:p>
+        </w:tc>
+        <w:tc>
+          <w:tcPr>
+            <w:tcW w:type="dxa" w:w="2620"/>
+            <w:tcBorders>
+              <w:top w:val="single" w:color="999999" w:sz="4"/>
+              <w:left w:val="single" w:color="999999" w:sz="4"/>
+              <w:bottom w:val="single" w:color="999999" w:sz="4"/>
+              <w:right w:val="single" w:color="999999" w:sz="4"/>
+            </w:tcBorders>
+            <w:tcMar>
+              <w:top w:type="dxa" w:w="60"/>
+              <w:left w:type="dxa" w:w="90"/>
+              <w:bottom w:type="dxa" w:w="60"/>
+              <w:right w:type="dxa" w:w="90"/>
+            </w:tcMar>
+          </w:tcPr>
+          <w:p>
+            <w:pPr>
+              <w:spacing w:after="40"/>
+            </w:pPr>
+            <w:r>
+              <w:rPr>
+                <w:sz w:val="19"/>
+                <w:szCs w:val="19"/>
+              </w:rPr>
+              <w:t xml:space="preserve">Muestra que un videojuego sirve para la pedagogía vial</w:t>
+            </w:r>
+          </w:p>
+        </w:tc>
+        <w:tc>
+          <w:tcPr>
+            <w:tcW w:type="dxa" w:w="2620"/>
+            <w:tcBorders>
+              <w:top w:val="single" w:color="999999" w:sz="4"/>
+              <w:left w:val="single" w:color="999999" w:sz="4"/>
+              <w:bottom w:val="single" w:color="999999" w:sz="4"/>
+              <w:right w:val="single" w:color="999999" w:sz="4"/>
+            </w:tcBorders>
+            <w:tcMar>
+              <w:top w:type="dxa" w:w="60"/>
+              <w:left w:type="dxa" w:w="90"/>
+              <w:bottom w:type="dxa" w:w="60"/>
+              <w:right w:type="dxa" w:w="90"/>
+            </w:tcMar>
+          </w:tcPr>
+          <w:p>
+            <w:pPr>
+              <w:spacing w:after="40"/>
+            </w:pPr>
+            <w:r>
+              <w:rPr>
+                <w:sz w:val="19"/>
+                <w:szCs w:val="19"/>
+              </w:rPr>
+              <w:t xml:space="preserve">Narrativa y avance por etapas, como los niveles de Rutástrofe</w:t>
+            </w:r>
+          </w:p>
+        </w:tc>
+        <w:tc>
+          <w:tcPr>
+            <w:tcW w:type="dxa" w:w="2620"/>
+            <w:tcBorders>
+              <w:top w:val="single" w:color="999999" w:sz="4"/>
+              <w:left w:val="single" w:color="999999" w:sz="4"/>
+              <w:bottom w:val="single" w:color="999999" w:sz="4"/>
+              <w:right w:val="single" w:color="999999" w:sz="4"/>
+            </w:tcBorders>
+            <w:tcMar>
+              <w:top w:type="dxa" w:w="60"/>
+              <w:left w:type="dxa" w:w="90"/>
+              <w:bottom w:type="dxa" w:w="60"/>
+              <w:right w:type="dxa" w:w="90"/>
+            </w:tcMar>
+          </w:tcPr>
+          <w:p>
+            <w:pPr>
+              <w:spacing w:after="40"/>
+            </w:pPr>
+            <w:r>
+              <w:rPr>
+                <w:sz w:val="19"/>
+                <w:szCs w:val="19"/>
+              </w:rPr>
+              <w:t xml:space="preserve">Valida la gamificación como estrategia de educación vial en Colombia</w:t>
+            </w:r>
+          </w:p>
+        </w:tc>
+      </w:tr>
+      <w:tr>
+        <w:trPr>
+          <w:cantSplit/>
+          <w:tblHeader w:val="false"/>
+        </w:trPr>
+        <w:tc>
+          <w:tcPr>
+            <w:tcW w:type="dxa" w:w="1500"/>
             <w:tcBorders>
               <w:top w:val="single" w:color="999999" w:sz="4"/>
               <w:left w:val="single" w:color="999999" w:sz="4"/>
@@ -3790,90 +3863,88 @@
         </w:tc>
         <w:tc>
           <w:tcPr>
-            <w:tcW w:type="dxa" w:w="2600"/>
-            <w:tcBorders>
-              <w:top w:val="single" w:color="999999" w:sz="4"/>
-              <w:left w:val="single" w:color="999999" w:sz="4"/>
-              <w:bottom w:val="single" w:color="999999" w:sz="4"/>
-              <w:right w:val="single" w:color="999999" w:sz="4"/>
-            </w:tcBorders>
-            <w:tcMar>
-              <w:top w:type="dxa" w:w="60"/>
-              <w:left w:type="dxa" w:w="90"/>
-              <w:bottom w:type="dxa" w:w="60"/>
-              <w:right w:type="dxa" w:w="90"/>
-            </w:tcMar>
-          </w:tcPr>
-          <w:p>
-            <w:pPr>
-              <w:spacing w:after="40"/>
-            </w:pPr>
-            <w:r>
-              <w:rPr>
-                <w:sz w:val="19"/>
-                <w:szCs w:val="19"/>
-                <w:shd w:fill="FFFF00" w:color="auto" w:val="clear"/>
-              </w:rPr>
-              <w:t xml:space="preserve">[completar]</w:t>
-            </w:r>
-          </w:p>
-        </w:tc>
-        <w:tc>
-          <w:tcPr>
-            <w:tcW w:type="dxa" w:w="2600"/>
-            <w:tcBorders>
-              <w:top w:val="single" w:color="999999" w:sz="4"/>
-              <w:left w:val="single" w:color="999999" w:sz="4"/>
-              <w:bottom w:val="single" w:color="999999" w:sz="4"/>
-              <w:right w:val="single" w:color="999999" w:sz="4"/>
-            </w:tcBorders>
-            <w:tcMar>
-              <w:top w:type="dxa" w:w="60"/>
-              <w:left w:type="dxa" w:w="90"/>
-              <w:bottom w:type="dxa" w:w="60"/>
-              <w:right w:type="dxa" w:w="90"/>
-            </w:tcMar>
-          </w:tcPr>
-          <w:p>
-            <w:pPr>
-              <w:spacing w:after="40"/>
-            </w:pPr>
-            <w:r>
-              <w:rPr>
-                <w:sz w:val="19"/>
-                <w:szCs w:val="19"/>
-                <w:shd w:fill="FFFF00" w:color="auto" w:val="clear"/>
-              </w:rPr>
-              <w:t xml:space="preserve">[completar]</w:t>
-            </w:r>
-          </w:p>
-        </w:tc>
-        <w:tc>
-          <w:tcPr>
-            <w:tcW w:type="dxa" w:w="2600"/>
-            <w:tcBorders>
-              <w:top w:val="single" w:color="999999" w:sz="4"/>
-              <w:left w:val="single" w:color="999999" w:sz="4"/>
-              <w:bottom w:val="single" w:color="999999" w:sz="4"/>
-              <w:right w:val="single" w:color="999999" w:sz="4"/>
-            </w:tcBorders>
-            <w:tcMar>
-              <w:top w:type="dxa" w:w="60"/>
-              <w:left w:type="dxa" w:w="90"/>
-              <w:bottom w:type="dxa" w:w="60"/>
-              <w:right w:type="dxa" w:w="90"/>
-            </w:tcMar>
-          </w:tcPr>
-          <w:p>
-            <w:pPr>
-              <w:spacing w:after="40"/>
-            </w:pPr>
-            <w:r>
-              <w:rPr>
-                <w:sz w:val="19"/>
-                <w:szCs w:val="19"/>
-              </w:rPr>
-              <w:t xml:space="preserve">Es un programa presencial en colegios; Rutástrofe es una aplicación de escritorio centrada en Medellín y en jóvenes</w:t>
+            <w:tcW w:type="dxa" w:w="2620"/>
+            <w:tcBorders>
+              <w:top w:val="single" w:color="999999" w:sz="4"/>
+              <w:left w:val="single" w:color="999999" w:sz="4"/>
+              <w:bottom w:val="single" w:color="999999" w:sz="4"/>
+              <w:right w:val="single" w:color="999999" w:sz="4"/>
+            </w:tcBorders>
+            <w:tcMar>
+              <w:top w:type="dxa" w:w="60"/>
+              <w:left w:type="dxa" w:w="90"/>
+              <w:bottom w:type="dxa" w:w="60"/>
+              <w:right w:type="dxa" w:w="90"/>
+            </w:tcMar>
+          </w:tcPr>
+          <w:p>
+            <w:pPr>
+              <w:spacing w:after="40"/>
+            </w:pPr>
+            <w:r>
+              <w:rPr>
+                <w:sz w:val="19"/>
+                <w:szCs w:val="19"/>
+              </w:rPr>
+              <w:t xml:space="preserve">No está enfocado en jóvenes conductores de moto ni en Medellín</w:t>
+            </w:r>
+          </w:p>
+        </w:tc>
+        <w:tc>
+          <w:tcPr>
+            <w:tcW w:type="dxa" w:w="2620"/>
+            <w:tcBorders>
+              <w:top w:val="single" w:color="999999" w:sz="4"/>
+              <w:left w:val="single" w:color="999999" w:sz="4"/>
+              <w:bottom w:val="single" w:color="999999" w:sz="4"/>
+              <w:right w:val="single" w:color="999999" w:sz="4"/>
+            </w:tcBorders>
+            <w:tcMar>
+              <w:top w:type="dxa" w:w="60"/>
+              <w:left w:type="dxa" w:w="90"/>
+              <w:bottom w:type="dxa" w:w="60"/>
+              <w:right w:type="dxa" w:w="90"/>
+            </w:tcMar>
+          </w:tcPr>
+          <w:p>
+            <w:pPr>
+              <w:spacing w:after="40"/>
+            </w:pPr>
+            <w:r>
+              <w:rPr>
+                <w:sz w:val="19"/>
+                <w:szCs w:val="19"/>
+              </w:rPr>
+              <w:t xml:space="preserve">Público infantil y plataforma web; Rutástrofe es de escritorio y para jóvenes conductores</w:t>
+            </w:r>
+          </w:p>
+        </w:tc>
+        <w:tc>
+          <w:tcPr>
+            <w:tcW w:type="dxa" w:w="2620"/>
+            <w:tcBorders>
+              <w:top w:val="single" w:color="999999" w:sz="4"/>
+              <w:left w:val="single" w:color="999999" w:sz="4"/>
+              <w:bottom w:val="single" w:color="999999" w:sz="4"/>
+              <w:right w:val="single" w:color="999999" w:sz="4"/>
+            </w:tcBorders>
+            <w:tcMar>
+              <w:top w:type="dxa" w:w="60"/>
+              <w:left w:type="dxa" w:w="90"/>
+              <w:bottom w:type="dxa" w:w="60"/>
+              <w:right w:type="dxa" w:w="90"/>
+            </w:tcMar>
+          </w:tcPr>
+          <w:p>
+            <w:pPr>
+              <w:spacing w:after="40"/>
+            </w:pPr>
+            <w:r>
+              <w:rPr>
+                <w:sz w:val="19"/>
+                <w:szCs w:val="19"/>
+              </w:rPr>
+              <w:t xml:space="preserve">Es presencial, en colegios y para menores; Rutástrofe es una aplicación digital para jóvenes conductores</w:t>
             </w:r>
           </w:p>
         </w:tc>
@@ -3884,6 +3955,22 @@
         <w:spacing w:after="60" w:line="276"/>
         <w:jc w:val="both"/>
       </w:pPr>
+    </w:p>
+    <w:p>
+      <w:pPr>
+        <w:spacing w:after="120" w:line="276"/>
+        <w:jc w:val="both"/>
+      </w:pPr>
+      <w:r>
+        <w:rPr>
+          <w:b/>
+          <w:bCs/>
+        </w:rPr>
+        <w:t xml:space="preserve">Conclusión:</w:t>
+      </w:r>
+      <w:r>
+        <w:t xml:space="preserve"> los tres proyectos confirman que el juego y la gamificación son estrategias válidas para la educación vial, pero ninguno se dirige a jóvenes conductores de moto y repartidores de Medellín. Rutástrofe cubre ese vacío con una experiencia de escritorio donde el jugador decide al conducir y ve las consecuencias.</w:t>
+      </w:r>
     </w:p>
     <w:p>
       <w:pPr>
@@ -3894,7 +3981,7 @@
         <w:rPr>
           <w:shd w:fill="FFFF00" w:color="auto" w:val="clear"/>
         </w:rPr>
-        <w:t xml:space="preserve">[Agregar una conclusión de 3–4 líneas: qué aporta Rutástrofe frente a estos proyectos.]</w:t>
+        <w:t xml:space="preserve">[Antes de entregar, lean el resumen de cada proyecto para confirmar las celdas marcadas]</w:t>
       </w:r>
     </w:p>
     <w:p>
@@ -3917,7 +4004,7 @@
         <w:rPr>
           <w:shd w:fill="FFFF00" w:color="auto" w:val="clear"/>
         </w:rPr>
-        <w:t xml:space="preserve">[Completar con la URL oficial]</w:t>
+        <w:t xml:space="preserve">[Agregar la URL oficial de la ANSV]</w:t>
       </w:r>
     </w:p>
     <w:p>
@@ -3935,7 +4022,7 @@
         <w:ind w:left="720" w:hanging="720"/>
       </w:pPr>
       <w:r>
-        <w:t xml:space="preserve">Área Metropolitana del Valle de Aburrá. (2026, 29 de abril). Área Metropolitana del Valle de Aburrá entrega resultados de la Encuesta Origen-Destino 2025. https://www.metropol.gov.co/Paginas/Noticias/Encuesta%20origen%20destino%202025.aspx</w:t>
+        <w:t xml:space="preserve">Arboleda Mancilla, Á. P. y Maturana Mosquera, C. (2017). ¿Y tú qué harías?: un juego para la pedagogía de la seguridad vial. Grafías Disciplinares de la UCP, (38-39). https://revistas.ucp.edu.co/index.php/grafias/article/download/1368/1376</w:t>
       </w:r>
     </w:p>
     <w:p>
@@ -3944,13 +4031,31 @@
         <w:ind w:left="720" w:hanging="720"/>
       </w:pPr>
       <w:r>
-        <w:t xml:space="preserve">Theseus. (s. f.). "Don't Be Like Frogger": A rapid review on the use of serious game for road safety education in children. https://www.theseus.fi/handle/10024/746717 </w:t>
+        <w:t xml:space="preserve">Área Metropolitana del Valle de Aburrá. (2026, 29 de abril). Área Metropolitana del Valle de Aburrá entrega resultados de la Encuesta Origen-Destino 2025. https://www.metropol.gov.co/Paginas/Noticias/Encuesta%20origen%20destino%202025.aspx</w:t>
+      </w:r>
+    </w:p>
+    <w:p>
+      <w:pPr>
+        <w:spacing w:after="120" w:line="276"/>
+        <w:ind w:left="720" w:hanging="720"/>
+      </w:pPr>
+      <w:r>
+        <w:t xml:space="preserve">Böhm, C. y Jacopini, G. (1966). Flow diagrams, Turing machines and languages with only two formation rules. Communications of the ACM, 9(5), 366–371.</w:t>
+      </w:r>
+    </w:p>
+    <w:p>
+      <w:pPr>
+        <w:spacing w:after="120" w:line="276"/>
+        <w:ind w:left="720" w:hanging="720"/>
+      </w:pPr>
+      <w:r>
+        <w:t xml:space="preserve">Carmona Alfaro, D. A. (s. f.). Atrapados: plataforma Serious Games para un nuevo modelo de educación vial en Costa Rica [Tesis de maestría, Universidad de Costa Rica]. https://www.kerwa.ucr.ac.cr/handle/10669/85289 </w:t>
       </w:r>
       <w:r>
         <w:rPr>
           <w:shd w:fill="FFFF00" w:color="auto" w:val="clear"/>
         </w:rPr>
-        <w:t xml:space="preserve">[Completar autor y año]</w:t>
+        <w:t xml:space="preserve">[Agregar el año]</w:t>
       </w:r>
     </w:p>
     <w:p>
@@ -3959,7 +4064,7 @@
         <w:ind w:left="720" w:hanging="720"/>
       </w:pPr>
       <w:r>
-        <w:t xml:space="preserve">TomTom. (2026). Medellin traffic report. TomTom Traffic Index. https://www.tomtom.com/traffic-index/city/medellin/</w:t>
+        <w:t xml:space="preserve">Deterding, S., Dixon, D., Khaled, R. y Nacke, L. (2011). From game design elements to gamefulness: Defining "gamification". En Proceedings of the 15th International Academic MindTrek Conference (pp. 9–15). ACM. https://doi.org/10.1145/2181037.2181040</w:t>
       </w:r>
     </w:p>
     <w:p>
@@ -3968,10 +4073,61 @@
         <w:ind w:left="720" w:hanging="720"/>
       </w:pPr>
       <w:r>
-        <w:rPr>
-          <w:shd w:fill="FFFF00" w:color="auto" w:val="clear"/>
-        </w:rPr>
-        <w:t xml:space="preserve">[Agregar los proyectos 1 y 2 del cuadro comparativo en formato APA]</w:t>
+        <w:t xml:space="preserve">Dijkstra, E. W. (1968). Go to statement considered harmful. Communications of the ACM, 11(3), 147–148.</w:t>
+      </w:r>
+    </w:p>
+    <w:p>
+      <w:pPr>
+        <w:spacing w:after="120" w:line="276"/>
+        <w:ind w:left="720" w:hanging="720"/>
+      </w:pPr>
+      <w:r>
+        <w:t xml:space="preserve">Joyanes Aguilar, L. (2008). Fundamentos de programación: Algoritmos, estructuras de datos y objetos (4.ª ed.). McGraw-Hill.</w:t>
+      </w:r>
+    </w:p>
+    <w:p>
+      <w:pPr>
+        <w:spacing w:after="120" w:line="276"/>
+        <w:ind w:left="720" w:hanging="720"/>
+      </w:pPr>
+      <w:r>
+        <w:t xml:space="preserve">Michael, D. y Chen, S. (2005). Serious games: Games that educate, train, and inform. Thomson Course Technology.</w:t>
+      </w:r>
+    </w:p>
+    <w:p>
+      <w:pPr>
+        <w:spacing w:after="120" w:line="276"/>
+        <w:ind w:left="720" w:hanging="720"/>
+      </w:pPr>
+      <w:r>
+        <w:t xml:space="preserve">Organización Mundial de la Salud. (2023). Informe sobre la situación mundial de la seguridad vial 2023. OMS.</w:t>
+      </w:r>
+    </w:p>
+    <w:p>
+      <w:pPr>
+        <w:spacing w:after="120" w:line="276"/>
+        <w:ind w:left="720" w:hanging="720"/>
+      </w:pPr>
+      <w:r>
+        <w:t xml:space="preserve">Pygame. (s. f.). Pygame documentation. https://www.pygame.org/docs/</w:t>
+      </w:r>
+    </w:p>
+    <w:p>
+      <w:pPr>
+        <w:spacing w:after="120" w:line="276"/>
+        <w:ind w:left="720" w:hanging="720"/>
+      </w:pPr>
+      <w:r>
+        <w:t xml:space="preserve">Python Software Foundation. (s. f.). Input and output. En Python 3 documentation. https://docs.python.org/3/tutorial/inputoutput.html</w:t>
+      </w:r>
+    </w:p>
+    <w:p>
+      <w:pPr>
+        <w:spacing w:after="120" w:line="276"/>
+        <w:ind w:left="720" w:hanging="720"/>
+      </w:pPr>
+      <w:r>
+        <w:t xml:space="preserve">TomTom. (2026). Medellin traffic report. TomTom Traffic Index. https://www.tomtom.com/traffic-index/city/medellin/</w:t>
       </w:r>
     </w:p>
     <w:sectPr>

</xml_diff>

<commit_message>
Reduce project to a single driving level; update docs, Gantt and map
Co-Authored-By: Claude Sonnet 5.5 <noreply@anthropic.com>
Claude-Session: https://claude.ai/code/session_01R2Pu4Q9okMgo25ziHACUFG
</commit_message>
<xml_diff>
--- a/Cuadrante2_Rutastrofe_plantilla.docx
+++ b/Cuadrante2_Rutastrofe_plantilla.docx
@@ -256,7 +256,17 @@
         <w:t xml:space="preserve">Producto:</w:t>
       </w:r>
       <w:r>
-        <w:t xml:space="preserve"> videojuego 2D de escritorio con interfaz gráfica, desarrollado por tres niveles (la avenida, el barrio de noche y con lluvia, la hora pico).</w:t>
+        <w:t xml:space="preserve"> videojuego 2D de escritorio con interfaz gráfica, con </w:t>
+      </w:r>
+      <w:r>
+        <w:rPr>
+          <w:b/>
+          <w:bCs/>
+        </w:rPr>
+        <w:t xml:space="preserve">un único nivel de conducción</w:t>
+      </w:r>
+      <w:r>
+        <w:t xml:space="preserve"> de dificultad progresiva: a medida que avanza el recorrido hay más tráfico y la Cabezota se mueve más rápido.</w:t>
       </w:r>
     </w:p>
     <w:p>
@@ -296,7 +306,7 @@
         <w:t xml:space="preserve">Persistencia:</w:t>
       </w:r>
       <w:r>
-        <w:t xml:space="preserve"> archivos planos .txt para usuarios, progreso, puntajes y configuración.</w:t>
+        <w:t xml:space="preserve"> archivos planos .txt para usuarios, puntajes y configuración.</w:t>
       </w:r>
     </w:p>
     <w:p>
@@ -316,7 +326,7 @@
         <w:t xml:space="preserve">Funcionalidades:</w:t>
       </w:r>
       <w:r>
-        <w:t xml:space="preserve"> inicio de sesión con alias, selección de nivel, juego con obstáculos y decisiones, puntaje y vidas, guardado de progreso, ranking de puntajes. </w:t>
+        <w:t xml:space="preserve"> inicio de sesión con alias, instrucciones, juego con obstáculos y decisiones, puntaje y vidas, guardado de puntajes, ranking. </w:t>
       </w:r>
       <w:r>
         <w:rPr>
@@ -447,7 +457,7 @@
         <w:jc w:val="both"/>
       </w:pPr>
       <w:r>
-        <w:t xml:space="preserve">Desarrollar un videojuego 2D de escritorio, con programación estructurada y archivos planos, que promueva la conducción segura y responsable en jóvenes conductores de moto y repartidores de Medellín mediante decisiones con consecuencias en tres niveles de juego.</w:t>
+        <w:t xml:space="preserve">Desarrollar un videojuego 2D de escritorio que promueva la conducción segura y responsable en jóvenes conductores de moto y repartidores de Medellín, mediante un nivel de conducción en el que sus decisiones tienen consecuencias.</w:t>
       </w:r>
     </w:p>
     <w:p>
@@ -669,7 +679,7 @@
                 <w:sz w:val="19"/>
                 <w:szCs w:val="19"/>
               </w:rPr>
-              <w:t xml:space="preserve">Diseñar el storyboard, el logo, las interfaces y el prototipo navegacional de los tres niveles, y la estructura de los archivos planos.</w:t>
+              <w:t xml:space="preserve">Diseñar el storyboard, el logo, las interfaces y el prototipo navegacional del nivel de conducción, y la estructura de los archivos planos.</w:t>
             </w:r>
           </w:p>
         </w:tc>
@@ -797,7 +807,7 @@
                 <w:sz w:val="19"/>
                 <w:szCs w:val="19"/>
               </w:rPr>
-              <w:t xml:space="preserve">Verificar el funcionamiento de cada nivel y de la persistencia mediante pruebas funcionales y pruebas con usuarios, y registrar los errores corregidos.</w:t>
+              <w:t xml:space="preserve">Verificar el funcionamiento del nivel de conducción y de la persistencia mediante pruebas funcionales y pruebas con usuarios, y registrar los errores corregidos.</w:t>
             </w:r>
           </w:p>
         </w:tc>
@@ -1760,7 +1770,7 @@
                 <w:sz w:val="19"/>
                 <w:szCs w:val="19"/>
               </w:rPr>
-              <w:t xml:space="preserve">Nivel 1 e interfaz base</w:t>
+              <w:t xml:space="preserve">Mecánica de conducción e interfaz base</w:t>
             </w:r>
           </w:p>
         </w:tc>
@@ -2004,7 +2014,7 @@
                 <w:sz w:val="19"/>
                 <w:szCs w:val="19"/>
               </w:rPr>
-              <w:t xml:space="preserve">Nivel 2</w:t>
+              <w:t xml:space="preserve">Obstáculos y decisiones (semáforo, peatón, casco, celular)</w:t>
             </w:r>
           </w:p>
         </w:tc>
@@ -2126,7 +2136,7 @@
                 <w:sz w:val="19"/>
                 <w:szCs w:val="19"/>
               </w:rPr>
-              <w:t xml:space="preserve">Nivel 3</w:t>
+              <w:t xml:space="preserve">La Cabezota, puntaje, vidas y dificultad progresiva</w:t>
             </w:r>
           </w:p>
         </w:tc>
@@ -2248,7 +2258,7 @@
                 <w:sz w:val="19"/>
                 <w:szCs w:val="19"/>
               </w:rPr>
-              <w:t xml:space="preserve">Pruebas funcionales por nivel</w:t>
+              <w:t xml:space="preserve">Pruebas funcionales del juego</w:t>
             </w:r>
           </w:p>
         </w:tc>
@@ -2854,7 +2864,7 @@
         <w:jc w:val="both"/>
       </w:pPr>
       <w:r>
-        <w:t xml:space="preserve">Un juego serio es un juego diseñado con un propósito distinto al entretenimiento, como educar, entrenar o informar (Michael y Chen, 2005). La gamificación, por su parte, usa elementos de diseño de juegos (puntos, niveles, retos) en contextos que no son juegos (Deterding et al., 2011). Rutástrofe combina ambas ideas: es un juego con niveles, puntaje y vidas cuyo propósito es enseñar conducción segura mediante decisiones con consecuencias.</w:t>
+        <w:t xml:space="preserve">Un juego serio es un juego diseñado con un propósito distinto al entretenimiento, como educar, entrenar o informar (Michael y Chen, 2005). La gamificación, por su parte, usa elementos de diseño de juegos (puntos, niveles, retos) en contextos que no son juegos (Deterding et al., 2011). Rutástrofe combina ambas ideas: es un juego con puntaje, vidas y dificultad progresiva cuyo propósito es enseñar conducción segura mediante decisiones con consecuencias.</w:t>
       </w:r>
     </w:p>
     <w:p>
@@ -2880,7 +2890,7 @@
         <w:jc w:val="both"/>
       </w:pPr>
       <w:r>
-        <w:t xml:space="preserve">El teorema de Böhm y Jacopini (1966) demostró que cualquier programa puede escribirse usando solo tres estructuras de control: secuencia, selección e iteración. Dijkstra (1968) defendió reducir el uso de saltos arbitrarios (GOTO) para obtener programas más claros. Estas ideas dan origen a la programación estructurada, que se complementa con la modularidad: dividir el programa en funciones con una tarea específica (Joyanes, 2008). En Rutástrofe, la secuencia organiza el flujo del juego, los condicionales evalúan si una decisión fue segura, las iteraciones sostienen el ciclo principal y las funciones separan acciones como mover la moto, evaluar decisiones y guardar el progreso.</w:t>
+        <w:t xml:space="preserve">El teorema de Böhm y Jacopini (1966) demostró que cualquier programa puede escribirse usando solo tres estructuras de control: secuencia, selección e iteración. Dijkstra (1968) defendió reducir el uso de saltos arbitrarios (GOTO) para obtener programas más claros. Estas ideas dan origen a la programación estructurada, que se complementa con la modularidad: dividir el programa en funciones con una tarea específica (Joyanes, 2008). En Rutástrofe, la secuencia organiza el flujo del juego, los condicionales evalúan si una decisión fue segura, las iteraciones sostienen el ciclo principal y las funciones separan acciones como mover la moto, evaluar decisiones y guardar el puntaje.</w:t>
       </w:r>
     </w:p>
     <w:p>
@@ -2897,7 +2907,7 @@
         <w:jc w:val="both"/>
       </w:pPr>
       <w:r>
-        <w:t xml:space="preserve">Un archivo plano almacena datos como texto simple, sin una estructura de base de datos, y se lee y escribe de forma secuencial (Joyanes, 2008). En Rutástrofe se usarán archivos .txt para guardar los usuarios, el progreso por nivel y los puntajes. La documentación del lenguaje explica cómo abrir, leer y escribir archivos de texto (Python Software Foundation, s. f.).</w:t>
+        <w:t xml:space="preserve">Un archivo plano almacena datos como texto simple, sin una estructura de base de datos, y se lee y escribe de forma secuencial (Joyanes, 2008). En Rutástrofe se usarán archivos .txt para guardar los usuarios, las partidas y los puntajes. La documentación del lenguaje explica cómo abrir, leer y escribir archivos de texto (Python Software Foundation, s. f.).</w:t>
       </w:r>
     </w:p>
     <w:p>
@@ -3793,7 +3803,7 @@
                 <w:sz w:val="19"/>
                 <w:szCs w:val="19"/>
               </w:rPr>
-              <w:t xml:space="preserve">Narrativa y avance por etapas, como los niveles de Rutástrofe</w:t>
+              <w:t xml:space="preserve">Narrativa y avance por etapas, como el recorrido de Rutástrofe</w:t>
             </w:r>
           </w:p>
         </w:tc>

</xml_diff>

<commit_message>
Cuadrante 2: general mobility focus aligned with script v3
Co-Authored-By: Claude Sonnet 5.5 <noreply@anthropic.com>
Claude-Session: https://claude.ai/code/session_01R2Pu4Q9okMgo25ziHACUFG
</commit_message>
<xml_diff>
--- a/Cuadrante2_Rutastrofe_plantilla.docx
+++ b/Cuadrante2_Rutastrofe_plantilla.docx
@@ -89,7 +89,7 @@
           <w:sz w:val="26"/>
           <w:szCs w:val="26"/>
         </w:rPr>
-        <w:t xml:space="preserve">Videojuego 2D para fomentar la conducción segura y responsable en jóvenes conductores de moto y repartidores de Medellín</w:t>
+        <w:t xml:space="preserve">Videojuego 2D de obstáculos para sensibilizar sobre la movilidad en Medellín</w:t>
       </w:r>
     </w:p>
     <w:p>
@@ -196,7 +196,7 @@
         <w:t xml:space="preserve">Problema central:</w:t>
       </w:r>
       <w:r>
-        <w:t xml:space="preserve"> muchas decisiones inseguras de los jóvenes en la vía (no usar casco, irrespetar semáforos, adelantar con afán, distraerse con el celular) contribuyen a la siniestralidad y a la congestión, y existen pocas herramientas atractivas que los eduquen de forma práctica.</w:t>
+        <w:t xml:space="preserve"> la movilidad de Medellín está afectada por la congestión, el aumento del transporte privado y de la motocicleta, la caída del uso del transporte público y los siniestros viales. Una parte importante del problema depende del comportamiento de quienes se movilizan (el afán, el irrespeto de las normas y de los semáforos), y existen pocas herramientas atractivas que sensibilicen a la ciudadanía sobre esto.</w:t>
       </w:r>
     </w:p>
     <w:p>
@@ -212,7 +212,7 @@
         <w:t xml:space="preserve">Necesidad:</w:t>
       </w:r>
       <w:r>
-        <w:t xml:space="preserve"> una experiencia interactiva en la que el joven pueda tomar decisiones viales, equivocarse sin riesgo real y ver las consecuencias.</w:t>
+        <w:t xml:space="preserve"> una experiencia interactiva en la que las personas vivan, de forma lúdica, las consecuencias de moverse por la ciudad con afán o sin respetar las normas, sin ningún riesgo real.</w:t>
       </w:r>
     </w:p>
     <w:p>
@@ -228,7 +228,7 @@
         <w:t xml:space="preserve">Pregunta orientadora:</w:t>
       </w:r>
       <w:r>
-        <w:t xml:space="preserve"> ¿Cómo puede un videojuego 2D de escritorio ayudar a que los jóvenes conductores de moto y repartidores de Medellín comprendan las consecuencias de sus decisiones al conducir y adopten comportamientos más seguros?</w:t>
+        <w:t xml:space="preserve"> ¿Cómo puede un videojuego 2D de obstáculos ayudar a sensibilizar a los ciudadanos de Medellín sobre los problemas de movilidad de la ciudad?</w:t>
       </w:r>
     </w:p>
     <w:p>
@@ -256,7 +256,7 @@
         <w:t xml:space="preserve">Producto:</w:t>
       </w:r>
       <w:r>
-        <w:t xml:space="preserve"> videojuego 2D de escritorio con interfaz gráfica, con </w:t>
+        <w:t xml:space="preserve"> videojuego 2D de escritorio con interfaz gráfica y vista desde arriba, con </w:t>
       </w:r>
       <w:r>
         <w:rPr>
@@ -266,7 +266,7 @@
         <w:t xml:space="preserve">un único nivel de conducción</w:t>
       </w:r>
       <w:r>
-        <w:t xml:space="preserve"> de dificultad progresiva: a medida que avanza el recorrido hay más tráfico y la Cabezota se mueve más rápido.</w:t>
+        <w:t xml:space="preserve"> dividido en 5 tramos: el barrio, la avenida de los semáforos, el mercado abandonado, el túnel y la recta final.</w:t>
       </w:r>
     </w:p>
     <w:p>
@@ -283,10 +283,10 @@
           <w:b/>
           <w:bCs/>
         </w:rPr>
-        <w:t xml:space="preserve">Técnica:</w:t>
-      </w:r>
-      <w:r>
-        <w:t xml:space="preserve"> programación estructurada y modular (sin POO), con secuencia, condicionales, iteración y funciones.</w:t>
+        <w:t xml:space="preserve">Historia:</w:t>
+      </w:r>
+      <w:r>
+        <w:t xml:space="preserve"> Jax debe salir del refugio a buscar comida y regresar con ella mientras La Inmensa Cabezota lo persigue. La Cabezota representa el afán y el caos de la ciudad. Los obstáculos y los semáforos aparecen en el camino como si ella los pusiera.</w:t>
       </w:r>
     </w:p>
     <w:p>
@@ -303,10 +303,10 @@
           <w:b/>
           <w:bCs/>
         </w:rPr>
-        <w:t xml:space="preserve">Persistencia:</w:t>
-      </w:r>
-      <w:r>
-        <w:t xml:space="preserve"> archivos planos .txt para usuarios, puntajes y configuración.</w:t>
+        <w:t xml:space="preserve">Mecánica:</w:t>
+      </w:r>
+      <w:r>
+        <w:t xml:space="preserve"> el jugador mueve la moto entre tres carriles y las bermas para esquivar obstáculos (carros, conos, barricadas, huecos), recoger las 12 cajas de comida y rodear los semáforos en rojo. Pasar por encima de un semáforo en rojo resta puntos y activa una alarma; rodearlo suma puntos.</w:t>
       </w:r>
     </w:p>
     <w:p>
@@ -323,16 +323,10 @@
           <w:b/>
           <w:bCs/>
         </w:rPr>
-        <w:t xml:space="preserve">Funcionalidades:</w:t>
-      </w:r>
-      <w:r>
-        <w:t xml:space="preserve"> inicio de sesión con alias, instrucciones, juego con obstáculos y decisiones, puntaje y vidas, guardado de puntajes, ranking. </w:t>
-      </w:r>
-      <w:r>
-        <w:rPr>
-          <w:shd w:fill="FFFF00" w:color="auto" w:val="clear"/>
-        </w:rPr>
-        <w:t xml:space="preserve">[Confirmar y registrar en la bitácora con el módulo sol]</w:t>
+        <w:t xml:space="preserve">Cómo se gana:</w:t>
+      </w:r>
+      <w:r>
+        <w:t xml:space="preserve"> llegar al refugio con al menos 1 vida y al menos 6 de las 12 cajas.</w:t>
       </w:r>
     </w:p>
     <w:p>
@@ -349,10 +343,10 @@
           <w:b/>
           <w:bCs/>
         </w:rPr>
-        <w:t xml:space="preserve">Público objetivo:</w:t>
-      </w:r>
-      <w:r>
-        <w:t xml:space="preserve"> jóvenes conductores de moto y repartidores de Medellín.</w:t>
+        <w:t xml:space="preserve">Cómo se pierde:</w:t>
+      </w:r>
+      <w:r>
+        <w:t xml:space="preserve"> quedarse sin las 3 vidas (cada choque quita una), que la barra de distancia de la Cabezota llegue a cero, o llegar con menos de 6 cajas.</w:t>
       </w:r>
     </w:p>
     <w:p>
@@ -369,11 +363,520 @@
           <w:b/>
           <w:bCs/>
         </w:rPr>
+        <w:t xml:space="preserve">Técnica:</w:t>
+      </w:r>
+      <w:r>
+        <w:t xml:space="preserve"> programación estructurada y modular (sin POO), con secuencia, condicionales, iteración y funciones.</w:t>
+      </w:r>
+    </w:p>
+    <w:p>
+      <w:pPr>
+        <w:pStyle w:val="ListParagraph"/>
+        <w:numPr>
+          <w:ilvl w:val="0"/>
+          <w:numId w:val="2"/>
+        </w:numPr>
+        <w:spacing w:after="60" w:line="276"/>
+      </w:pPr>
+      <w:r>
+        <w:rPr>
+          <w:b/>
+          <w:bCs/>
+        </w:rPr>
+        <w:t xml:space="preserve">Persistencia:</w:t>
+      </w:r>
+      <w:r>
+        <w:t xml:space="preserve"> archivos planos .txt para usuarios, puntajes y configuración.</w:t>
+      </w:r>
+    </w:p>
+    <w:p>
+      <w:pPr>
+        <w:pStyle w:val="ListParagraph"/>
+        <w:numPr>
+          <w:ilvl w:val="0"/>
+          <w:numId w:val="2"/>
+        </w:numPr>
+        <w:spacing w:after="60" w:line="276"/>
+      </w:pPr>
+      <w:r>
+        <w:rPr>
+          <w:b/>
+          <w:bCs/>
+        </w:rPr>
+        <w:t xml:space="preserve">Funcionalidades:</w:t>
+      </w:r>
+      <w:r>
+        <w:t xml:space="preserve"> inicio de sesión con alias, instrucciones, nivel de conducción, puntaje, vidas y cajas, guardado de puntajes y ranking. </w:t>
+      </w:r>
+      <w:r>
+        <w:rPr>
+          <w:shd w:fill="FFFF00" w:color="auto" w:val="clear"/>
+        </w:rPr>
+        <w:t xml:space="preserve">[Confirmar y registrar en la bitácora con el módulo sol]</w:t>
+      </w:r>
+    </w:p>
+    <w:p>
+      <w:pPr>
+        <w:pStyle w:val="ListParagraph"/>
+        <w:numPr>
+          <w:ilvl w:val="0"/>
+          <w:numId w:val="2"/>
+        </w:numPr>
+        <w:spacing w:after="60" w:line="276"/>
+      </w:pPr>
+      <w:r>
+        <w:rPr>
+          <w:b/>
+          <w:bCs/>
+        </w:rPr>
+        <w:t xml:space="preserve">Público objetivo:</w:t>
+      </w:r>
+      <w:r>
+        <w:t xml:space="preserve"> ciudadanos de Medellín que se movilizan en vehículos, principalmente jóvenes y adultos jóvenes. Se incluye a la ciudadanía en general, como pide el protocolo.</w:t>
+      </w:r>
+    </w:p>
+    <w:p>
+      <w:pPr>
+        <w:pStyle w:val="ListParagraph"/>
+        <w:numPr>
+          <w:ilvl w:val="0"/>
+          <w:numId w:val="2"/>
+        </w:numPr>
+        <w:spacing w:after="60" w:line="276"/>
+      </w:pPr>
+      <w:r>
+        <w:rPr>
+          <w:b/>
+          <w:bCs/>
+        </w:rPr>
         <w:t xml:space="preserve">Fuera del alcance:</w:t>
       </w:r>
       <w:r>
-        <w:t xml:space="preserve"> GPS, datos en tiempo real, simulación del Metro, solución directa del problema de movilidad, temas ambientales y otros actores viales como jugador (peatón o ciclista).</w:t>
-      </w:r>
+        <w:t xml:space="preserve"> GPS, datos en tiempo real, simulación del Metro, solución directa del problema de movilidad y temas ambientales.</w:t>
+      </w:r>
+    </w:p>
+    <w:p>
+      <w:pPr>
+        <w:pStyle w:val="Heading2"/>
+      </w:pPr>
+      <w:r>
+        <w:t xml:space="preserve">Relación entre la movilidad real y el juego</w:t>
+      </w:r>
+    </w:p>
+    <w:tbl>
+      <w:tblPr>
+        <w:tblW w:type="dxa" w:w="9360"/>
+        <w:tblBorders>
+          <w:top w:val="single" w:color="auto" w:sz="4"/>
+          <w:left w:val="single" w:color="auto" w:sz="4"/>
+          <w:bottom w:val="single" w:color="auto" w:sz="4"/>
+          <w:right w:val="single" w:color="auto" w:sz="4"/>
+          <w:insideH w:val="single" w:color="auto" w:sz="4"/>
+          <w:insideV w:val="single" w:color="auto" w:sz="4"/>
+        </w:tblBorders>
+      </w:tblPr>
+      <w:tblGrid>
+        <w:gridCol w:w="3300"/>
+        <w:gridCol w:w="6060"/>
+      </w:tblGrid>
+      <w:tr>
+        <w:trPr>
+          <w:cantSplit/>
+          <w:tblHeader/>
+        </w:trPr>
+        <w:tc>
+          <w:tcPr>
+            <w:tcW w:type="dxa" w:w="3300"/>
+            <w:tcBorders>
+              <w:top w:val="single" w:color="999999" w:sz="4"/>
+              <w:left w:val="single" w:color="999999" w:sz="4"/>
+              <w:bottom w:val="single" w:color="999999" w:sz="4"/>
+              <w:right w:val="single" w:color="999999" w:sz="4"/>
+            </w:tcBorders>
+            <w:shd w:fill="1F4E79" w:color="auto" w:val="clear"/>
+            <w:tcMar>
+              <w:top w:type="dxa" w:w="60"/>
+              <w:left w:type="dxa" w:w="90"/>
+              <w:bottom w:type="dxa" w:w="60"/>
+              <w:right w:type="dxa" w:w="90"/>
+            </w:tcMar>
+          </w:tcPr>
+          <w:p>
+            <w:pPr>
+              <w:spacing w:after="40"/>
+            </w:pPr>
+            <w:r>
+              <w:rPr>
+                <w:b/>
+                <w:bCs/>
+                <w:color w:val="FFFFFF"/>
+                <w:sz w:val="19"/>
+                <w:szCs w:val="19"/>
+              </w:rPr>
+              <w:t xml:space="preserve">Problema de movilidad</w:t>
+            </w:r>
+          </w:p>
+        </w:tc>
+        <w:tc>
+          <w:tcPr>
+            <w:tcW w:type="dxa" w:w="6060"/>
+            <w:tcBorders>
+              <w:top w:val="single" w:color="999999" w:sz="4"/>
+              <w:left w:val="single" w:color="999999" w:sz="4"/>
+              <w:bottom w:val="single" w:color="999999" w:sz="4"/>
+              <w:right w:val="single" w:color="999999" w:sz="4"/>
+            </w:tcBorders>
+            <w:shd w:fill="1F4E79" w:color="auto" w:val="clear"/>
+            <w:tcMar>
+              <w:top w:type="dxa" w:w="60"/>
+              <w:left w:type="dxa" w:w="90"/>
+              <w:bottom w:type="dxa" w:w="60"/>
+              <w:right w:type="dxa" w:w="90"/>
+            </w:tcMar>
+          </w:tcPr>
+          <w:p>
+            <w:pPr>
+              <w:spacing w:after="40"/>
+            </w:pPr>
+            <w:r>
+              <w:rPr>
+                <w:b/>
+                <w:bCs/>
+                <w:color w:val="FFFFFF"/>
+                <w:sz w:val="19"/>
+                <w:szCs w:val="19"/>
+              </w:rPr>
+              <w:t xml:space="preserve">Cómo se representa en el juego</w:t>
+            </w:r>
+          </w:p>
+        </w:tc>
+      </w:tr>
+      <w:tr>
+        <w:trPr>
+          <w:cantSplit/>
+          <w:tblHeader w:val="false"/>
+        </w:trPr>
+        <w:tc>
+          <w:tcPr>
+            <w:tcW w:type="dxa" w:w="3300"/>
+            <w:tcBorders>
+              <w:top w:val="single" w:color="999999" w:sz="4"/>
+              <w:left w:val="single" w:color="999999" w:sz="4"/>
+              <w:bottom w:val="single" w:color="999999" w:sz="4"/>
+              <w:right w:val="single" w:color="999999" w:sz="4"/>
+            </w:tcBorders>
+            <w:tcMar>
+              <w:top w:type="dxa" w:w="60"/>
+              <w:left w:type="dxa" w:w="90"/>
+              <w:bottom w:type="dxa" w:w="60"/>
+              <w:right w:type="dxa" w:w="90"/>
+            </w:tcMar>
+          </w:tcPr>
+          <w:p>
+            <w:pPr>
+              <w:spacing w:after="40"/>
+            </w:pPr>
+            <w:r>
+              <w:rPr>
+                <w:sz w:val="19"/>
+                <w:szCs w:val="19"/>
+              </w:rPr>
+              <w:t xml:space="preserve">Congestión y vías bloqueadas</w:t>
+            </w:r>
+          </w:p>
+        </w:tc>
+        <w:tc>
+          <w:tcPr>
+            <w:tcW w:type="dxa" w:w="6060"/>
+            <w:tcBorders>
+              <w:top w:val="single" w:color="999999" w:sz="4"/>
+              <w:left w:val="single" w:color="999999" w:sz="4"/>
+              <w:bottom w:val="single" w:color="999999" w:sz="4"/>
+              <w:right w:val="single" w:color="999999" w:sz="4"/>
+            </w:tcBorders>
+            <w:tcMar>
+              <w:top w:type="dxa" w:w="60"/>
+              <w:left w:type="dxa" w:w="90"/>
+              <w:bottom w:type="dxa" w:w="60"/>
+              <w:right w:type="dxa" w:w="90"/>
+            </w:tcMar>
+          </w:tcPr>
+          <w:p>
+            <w:pPr>
+              <w:spacing w:after="40"/>
+            </w:pPr>
+            <w:r>
+              <w:rPr>
+                <w:sz w:val="19"/>
+                <w:szCs w:val="19"/>
+              </w:rPr>
+              <w:t xml:space="preserve">Carros, barricadas y obstáculos que aparecen en el camino y que hay que esquivar</w:t>
+            </w:r>
+          </w:p>
+        </w:tc>
+      </w:tr>
+      <w:tr>
+        <w:trPr>
+          <w:cantSplit/>
+          <w:tblHeader w:val="false"/>
+        </w:trPr>
+        <w:tc>
+          <w:tcPr>
+            <w:tcW w:type="dxa" w:w="3300"/>
+            <w:tcBorders>
+              <w:top w:val="single" w:color="999999" w:sz="4"/>
+              <w:left w:val="single" w:color="999999" w:sz="4"/>
+              <w:bottom w:val="single" w:color="999999" w:sz="4"/>
+              <w:right w:val="single" w:color="999999" w:sz="4"/>
+            </w:tcBorders>
+            <w:tcMar>
+              <w:top w:type="dxa" w:w="60"/>
+              <w:left w:type="dxa" w:w="90"/>
+              <w:bottom w:type="dxa" w:w="60"/>
+              <w:right w:type="dxa" w:w="90"/>
+            </w:tcMar>
+          </w:tcPr>
+          <w:p>
+            <w:pPr>
+              <w:spacing w:after="40"/>
+            </w:pPr>
+            <w:r>
+              <w:rPr>
+                <w:sz w:val="19"/>
+                <w:szCs w:val="19"/>
+              </w:rPr>
+              <w:t xml:space="preserve">Irrespeto a los semáforos</w:t>
+            </w:r>
+          </w:p>
+        </w:tc>
+        <w:tc>
+          <w:tcPr>
+            <w:tcW w:type="dxa" w:w="6060"/>
+            <w:tcBorders>
+              <w:top w:val="single" w:color="999999" w:sz="4"/>
+              <w:left w:val="single" w:color="999999" w:sz="4"/>
+              <w:bottom w:val="single" w:color="999999" w:sz="4"/>
+              <w:right w:val="single" w:color="999999" w:sz="4"/>
+            </w:tcBorders>
+            <w:tcMar>
+              <w:top w:type="dxa" w:w="60"/>
+              <w:left w:type="dxa" w:w="90"/>
+              <w:bottom w:type="dxa" w:w="60"/>
+              <w:right w:type="dxa" w:w="90"/>
+            </w:tcMar>
+          </w:tcPr>
+          <w:p>
+            <w:pPr>
+              <w:spacing w:after="40"/>
+            </w:pPr>
+            <w:r>
+              <w:rPr>
+                <w:sz w:val="19"/>
+                <w:szCs w:val="19"/>
+              </w:rPr>
+              <w:t xml:space="preserve">Zonas de semáforos: pasar por encima de uno en rojo resta puntos y activa la alarma; rodearlo suma puntos</w:t>
+            </w:r>
+          </w:p>
+        </w:tc>
+      </w:tr>
+      <w:tr>
+        <w:trPr>
+          <w:cantSplit/>
+          <w:tblHeader w:val="false"/>
+        </w:trPr>
+        <w:tc>
+          <w:tcPr>
+            <w:tcW w:type="dxa" w:w="3300"/>
+            <w:tcBorders>
+              <w:top w:val="single" w:color="999999" w:sz="4"/>
+              <w:left w:val="single" w:color="999999" w:sz="4"/>
+              <w:bottom w:val="single" w:color="999999" w:sz="4"/>
+              <w:right w:val="single" w:color="999999" w:sz="4"/>
+            </w:tcBorders>
+            <w:tcMar>
+              <w:top w:type="dxa" w:w="60"/>
+              <w:left w:type="dxa" w:w="90"/>
+              <w:bottom w:type="dxa" w:w="60"/>
+              <w:right w:type="dxa" w:w="90"/>
+            </w:tcMar>
+          </w:tcPr>
+          <w:p>
+            <w:pPr>
+              <w:spacing w:after="40"/>
+            </w:pPr>
+            <w:r>
+              <w:rPr>
+                <w:sz w:val="19"/>
+                <w:szCs w:val="19"/>
+              </w:rPr>
+              <w:t xml:space="preserve">Afán e imprudencia</w:t>
+            </w:r>
+          </w:p>
+        </w:tc>
+        <w:tc>
+          <w:tcPr>
+            <w:tcW w:type="dxa" w:w="6060"/>
+            <w:tcBorders>
+              <w:top w:val="single" w:color="999999" w:sz="4"/>
+              <w:left w:val="single" w:color="999999" w:sz="4"/>
+              <w:bottom w:val="single" w:color="999999" w:sz="4"/>
+              <w:right w:val="single" w:color="999999" w:sz="4"/>
+            </w:tcBorders>
+            <w:tcMar>
+              <w:top w:type="dxa" w:w="60"/>
+              <w:left w:type="dxa" w:w="90"/>
+              <w:bottom w:type="dxa" w:w="60"/>
+              <w:right w:type="dxa" w:w="90"/>
+            </w:tcMar>
+          </w:tcPr>
+          <w:p>
+            <w:pPr>
+              <w:spacing w:after="40"/>
+            </w:pPr>
+            <w:r>
+              <w:rPr>
+                <w:sz w:val="19"/>
+                <w:szCs w:val="19"/>
+              </w:rPr>
+              <w:t xml:space="preserve">La Cabezota, que se acerca cuando el jugador choca o activa la alarma</w:t>
+            </w:r>
+          </w:p>
+        </w:tc>
+      </w:tr>
+      <w:tr>
+        <w:trPr>
+          <w:cantSplit/>
+          <w:tblHeader w:val="false"/>
+        </w:trPr>
+        <w:tc>
+          <w:tcPr>
+            <w:tcW w:type="dxa" w:w="3300"/>
+            <w:tcBorders>
+              <w:top w:val="single" w:color="999999" w:sz="4"/>
+              <w:left w:val="single" w:color="999999" w:sz="4"/>
+              <w:bottom w:val="single" w:color="999999" w:sz="4"/>
+              <w:right w:val="single" w:color="999999" w:sz="4"/>
+            </w:tcBorders>
+            <w:tcMar>
+              <w:top w:type="dxa" w:w="60"/>
+              <w:left w:type="dxa" w:w="90"/>
+              <w:bottom w:type="dxa" w:w="60"/>
+              <w:right w:type="dxa" w:w="90"/>
+            </w:tcMar>
+          </w:tcPr>
+          <w:p>
+            <w:pPr>
+              <w:spacing w:after="40"/>
+            </w:pPr>
+            <w:r>
+              <w:rPr>
+                <w:sz w:val="19"/>
+                <w:szCs w:val="19"/>
+              </w:rPr>
+              <w:t xml:space="preserve">Siniestros viales</w:t>
+            </w:r>
+          </w:p>
+        </w:tc>
+        <w:tc>
+          <w:tcPr>
+            <w:tcW w:type="dxa" w:w="6060"/>
+            <w:tcBorders>
+              <w:top w:val="single" w:color="999999" w:sz="4"/>
+              <w:left w:val="single" w:color="999999" w:sz="4"/>
+              <w:bottom w:val="single" w:color="999999" w:sz="4"/>
+              <w:right w:val="single" w:color="999999" w:sz="4"/>
+            </w:tcBorders>
+            <w:tcMar>
+              <w:top w:type="dxa" w:w="60"/>
+              <w:left w:type="dxa" w:w="90"/>
+              <w:bottom w:type="dxa" w:w="60"/>
+              <w:right w:type="dxa" w:w="90"/>
+            </w:tcMar>
+          </w:tcPr>
+          <w:p>
+            <w:pPr>
+              <w:spacing w:after="40"/>
+            </w:pPr>
+            <w:r>
+              <w:rPr>
+                <w:sz w:val="19"/>
+                <w:szCs w:val="19"/>
+              </w:rPr>
+              <w:t xml:space="preserve">Choques que quitan vidas</w:t>
+            </w:r>
+          </w:p>
+        </w:tc>
+      </w:tr>
+      <w:tr>
+        <w:trPr>
+          <w:cantSplit/>
+          <w:tblHeader w:val="false"/>
+        </w:trPr>
+        <w:tc>
+          <w:tcPr>
+            <w:tcW w:type="dxa" w:w="3300"/>
+            <w:tcBorders>
+              <w:top w:val="single" w:color="999999" w:sz="4"/>
+              <w:left w:val="single" w:color="999999" w:sz="4"/>
+              <w:bottom w:val="single" w:color="999999" w:sz="4"/>
+              <w:right w:val="single" w:color="999999" w:sz="4"/>
+            </w:tcBorders>
+            <w:tcMar>
+              <w:top w:type="dxa" w:w="60"/>
+              <w:left w:type="dxa" w:w="90"/>
+              <w:bottom w:type="dxa" w:w="60"/>
+              <w:right w:type="dxa" w:w="90"/>
+            </w:tcMar>
+          </w:tcPr>
+          <w:p>
+            <w:pPr>
+              <w:spacing w:after="40"/>
+            </w:pPr>
+            <w:r>
+              <w:rPr>
+                <w:sz w:val="19"/>
+                <w:szCs w:val="19"/>
+              </w:rPr>
+              <w:t xml:space="preserve">Llegar al destino a tiempo y completo</w:t>
+            </w:r>
+          </w:p>
+        </w:tc>
+        <w:tc>
+          <w:tcPr>
+            <w:tcW w:type="dxa" w:w="6060"/>
+            <w:tcBorders>
+              <w:top w:val="single" w:color="999999" w:sz="4"/>
+              <w:left w:val="single" w:color="999999" w:sz="4"/>
+              <w:bottom w:val="single" w:color="999999" w:sz="4"/>
+              <w:right w:val="single" w:color="999999" w:sz="4"/>
+            </w:tcBorders>
+            <w:tcMar>
+              <w:top w:type="dxa" w:w="60"/>
+              <w:left w:type="dxa" w:w="90"/>
+              <w:bottom w:type="dxa" w:w="60"/>
+              <w:right w:type="dxa" w:w="90"/>
+            </w:tcMar>
+          </w:tcPr>
+          <w:p>
+            <w:pPr>
+              <w:spacing w:after="40"/>
+            </w:pPr>
+            <w:r>
+              <w:rPr>
+                <w:sz w:val="19"/>
+                <w:szCs w:val="19"/>
+              </w:rPr>
+              <w:t xml:space="preserve">Llegar al refugio con las cajas de comida necesarias</w:t>
+            </w:r>
+          </w:p>
+        </w:tc>
+      </w:tr>
+    </w:tbl>
+    <w:p>
+      <w:pPr>
+        <w:spacing w:after="60" w:line="276"/>
+        <w:jc w:val="both"/>
+      </w:pPr>
     </w:p>
     <w:p>
       <w:pPr>
@@ -457,7 +960,7 @@
         <w:jc w:val="both"/>
       </w:pPr>
       <w:r>
-        <w:t xml:space="preserve">Desarrollar un videojuego 2D de escritorio que promueva la conducción segura y responsable en jóvenes conductores de moto y repartidores de Medellín, mediante un nivel de conducción en el que sus decisiones tienen consecuencias.</w:t>
+        <w:t xml:space="preserve">Desarrollar un videojuego 2D de escritorio de obstáculos que sensibilice a los ciudadanos de Medellín sobre los problemas de movilidad de la ciudad, mediante un recorrido en el que el jugador esquiva obstáculos y respeta los semáforos para llegar a su destino.</w:t>
       </w:r>
     </w:p>
     <w:p>
@@ -615,7 +1118,7 @@
                 <w:sz w:val="19"/>
                 <w:szCs w:val="19"/>
               </w:rPr>
-              <w:t xml:space="preserve">Identificar y documentar los requerimientos funcionales y no funcionales del juego, y las situaciones viales que se representarán, a partir de fuentes oficiales y de la validación con 4 usuarios.</w:t>
+              <w:t xml:space="preserve">Identificar los problemas de movilidad de Medellín y los requerimientos funcionales y no funcionales del juego, a partir de fuentes oficiales y de la validación con 4 usuarios.</w:t>
             </w:r>
           </w:p>
         </w:tc>
@@ -679,7 +1182,7 @@
                 <w:sz w:val="19"/>
                 <w:szCs w:val="19"/>
               </w:rPr>
-              <w:t xml:space="preserve">Diseñar el storyboard, el logo, las interfaces y el prototipo navegacional del nivel de conducción, y la estructura de los archivos planos.</w:t>
+              <w:t xml:space="preserve">Diseñar la historia, el storyboard, el logo, las interfaces y el prototipo navegacional del nivel de conducción, y la estructura de los archivos planos.</w:t>
             </w:r>
           </w:p>
         </w:tc>
@@ -743,7 +1246,7 @@
                 <w:sz w:val="19"/>
                 <w:szCs w:val="19"/>
               </w:rPr>
-              <w:t xml:space="preserve">Codificar el videojuego con programación estructurada y modular, aplicando secuencia, condicionales, iteración y funciones, con interfaz gráfica y persistencia en archivos .txt.</w:t>
+              <w:t xml:space="preserve">Codificar el videojuego con programación estructurada y modular (movimiento de la moto, obstáculos, zonas de semáforos, cajas, vidas, puntaje y barra de distancia), con interfaz gráfica y persistencia en archivos .txt.</w:t>
             </w:r>
           </w:p>
         </w:tc>
@@ -2014,7 +2517,7 @@
                 <w:sz w:val="19"/>
                 <w:szCs w:val="19"/>
               </w:rPr>
-              <w:t xml:space="preserve">Obstáculos y decisiones (semáforo, peatón, casco, celular)</w:t>
+              <w:t xml:space="preserve">Obstáculos y zonas de semáforos</w:t>
             </w:r>
           </w:p>
         </w:tc>
@@ -2136,7 +2639,7 @@
                 <w:sz w:val="19"/>
                 <w:szCs w:val="19"/>
               </w:rPr>
-              <w:t xml:space="preserve">La Cabezota, puntaje, vidas y dificultad progresiva</w:t>
+              <w:t xml:space="preserve">La Cabezota (barra de distancia), cajas, puntaje y vidas</w:t>
             </w:r>
           </w:p>
         </w:tc>
@@ -2838,7 +3341,7 @@
         <w:pStyle w:val="Heading2"/>
       </w:pPr>
       <w:r>
-        <w:t xml:space="preserve">7.1 Seguridad vial y conducción responsable</w:t>
+        <w:t xml:space="preserve">7.1 Movilidad urbana y seguridad vial</w:t>
       </w:r>
     </w:p>
     <w:p>
@@ -2847,7 +3350,7 @@
         <w:jc w:val="both"/>
       </w:pPr>
       <w:r>
-        <w:t xml:space="preserve">La seguridad vial es un problema de salud pública: la Organización Mundial de la Salud (2023) estima que los siniestros viales causan alrededor de 1,19 millones de muertes al año en el mundo. En Medellín, el aumento del transporte privado y de la motocicleta (Área Metropolitana del Valle de Aburrá, 2026) y las muertes por siniestros reportadas por la Alcaldía de Medellín (s. f.) muestran que el problema es local y actual. La conducción responsable implica decisiones concretas: respetar los semáforos, usar casco, mantener la distancia de seguridad y no usar el celular al conducir.</w:t>
+        <w:t xml:space="preserve">La movilidad urbana es el conjunto de desplazamientos de las personas por la ciudad y depende de la infraestructura, del transporte y del comportamiento de quienes se movilizan. En el Valle de Aburrá, la Encuesta Origen-Destino 2025 muestra que los viajes en transporte privado crecieron un 22,3 % y los del transporte público cayeron un 14 % (Área Metropolitana del Valle de Aburrá, 2026), y TomTom (2026) ubica la congestión de Medellín en 66,9 %. A esto se suma la siniestralidad: la Alcaldía de Medellín (s. f.) reportó 210 muertes en lo corrido de 2025. La seguridad vial es un problema de salud pública: la Organización Mundial de la Salud (2023) estima que los siniestros viales causan alrededor de 1,19 millones de muertes al año en el mundo. En este contexto, respetar los semáforos y las normas es una decisión cotidiana que Rutástrofe busca hacer visible.</w:t>
       </w:r>
     </w:p>
     <w:p>
@@ -3896,7 +4399,7 @@
                 <w:sz w:val="19"/>
                 <w:szCs w:val="19"/>
               </w:rPr>
-              <w:t xml:space="preserve">No está enfocado en jóvenes conductores de moto ni en Medellín</w:t>
+              <w:t xml:space="preserve">No trata la movilidad general de Medellín ni usa obstáculos y persecución</w:t>
             </w:r>
           </w:p>
         </w:tc>
@@ -3925,7 +4428,7 @@
                 <w:sz w:val="19"/>
                 <w:szCs w:val="19"/>
               </w:rPr>
-              <w:t xml:space="preserve">Público infantil y plataforma web; Rutástrofe es de escritorio y para jóvenes conductores</w:t>
+              <w:t xml:space="preserve">Público infantil y plataforma web; Rutástrofe es de escritorio y se enfoca en la movilidad de Medellín</w:t>
             </w:r>
           </w:p>
         </w:tc>
@@ -3954,7 +4457,7 @@
                 <w:sz w:val="19"/>
                 <w:szCs w:val="19"/>
               </w:rPr>
-              <w:t xml:space="preserve">Es presencial, en colegios y para menores; Rutástrofe es una aplicación digital para jóvenes conductores</w:t>
+              <w:t xml:space="preserve">Es presencial, en colegios y para menores; Rutástrofe es una aplicación digital para la ciudadanía</w:t>
             </w:r>
           </w:p>
         </w:tc>
@@ -3979,7 +4482,7 @@
         <w:t xml:space="preserve">Conclusión:</w:t>
       </w:r>
       <w:r>
-        <w:t xml:space="preserve"> los tres proyectos confirman que el juego y la gamificación son estrategias válidas para la educación vial, pero ninguno se dirige a jóvenes conductores de moto y repartidores de Medellín. Rutástrofe cubre ese vacío con una experiencia de escritorio donde el jugador decide al conducir y ve las consecuencias.</w:t>
+        <w:t xml:space="preserve"> los tres proyectos confirman que el juego y la gamificación son estrategias válidas para la educación vial, pero ninguno aborda la movilidad general de Medellín con un juego de obstáculos y persecución. Rutástrofe cubre ese vacío con una experiencia de escritorio en la que el jugador esquiva obstáculos, respeta los semáforos y ve las consecuencias de moverse con afán.</w:t>
       </w:r>
     </w:p>
     <w:p>

</xml_diff>

<commit_message>
Gantt: add protocol dates (reviews, socializations, grades) and weekly plan
Co-Authored-By: Claude Sonnet 5.5 <noreply@anthropic.com>
Claude-Session: https://claude.ai/code/session_01R2Pu4Q9okMgo25ziHACUFG
</commit_message>
<xml_diff>
--- a/Cuadrante2_Rutastrofe_plantilla.docx
+++ b/Cuadrante2_Rutastrofe_plantilla.docx
@@ -1395,7 +1395,7 @@
       <w:r>
         <w:drawing>
           <wp:inline distT="0" distB="0" distL="0" distR="0">
-            <wp:extent cx="5905500" cy="3143250"/>
+            <wp:extent cx="5905500" cy="4191000"/>
             <wp:effectExtent t="0" r="0" b="0" l="0"/>
             <wp:docPr id="1" name="figura" descr="figura" title="figura"/>
             <wp:cNvGraphicFramePr>
@@ -1420,7 +1420,7 @@
                   <pic:spPr bwMode="auto">
                     <a:xfrm>
                       <a:off x="0" y="0"/>
-                      <a:ext cx="5905500" cy="3143250"/>
+                      <a:ext cx="5905500" cy="4191000"/>
                     </a:xfrm>
                     <a:prstGeom prst="rect">
                       <a:avLst/>
@@ -1445,7 +1445,7 @@
           <w:sz w:val="18"/>
           <w:szCs w:val="18"/>
         </w:rPr>
-        <w:t xml:space="preserve">Figura 2. Cronograma de Rutástrofe (1 de octubre al 12 de diciembre de 2026). El archivo Rutastrofe_cronograma.gan se puede abrir en GanttProject para tomar la captura oficial.</w:t>
+        <w:t xml:space="preserve">Figura 2. Cronograma de Rutástrofe (21 de septiembre al 20 de diciembre de 2026). El archivo Rutastrofe_cronograma.gan se puede abrir en GanttProject para tomar la captura oficial.</w:t>
       </w:r>
     </w:p>
     <w:tbl>
@@ -1663,7 +1663,7 @@
                 <w:sz w:val="19"/>
                 <w:szCs w:val="19"/>
               </w:rPr>
-              <w:t xml:space="preserve">Corrección del problema, alcance y árbol del problema</w:t>
+              <w:t xml:space="preserve">Corrección del problema, alcance y objetivos</w:t>
             </w:r>
           </w:p>
         </w:tc>
@@ -1692,7 +1692,7 @@
                 <w:sz w:val="19"/>
                 <w:szCs w:val="19"/>
               </w:rPr>
-              <w:t xml:space="preserve">1 oct</w:t>
+              <w:t xml:space="preserve">28 sep</w:t>
             </w:r>
           </w:p>
         </w:tc>
@@ -1721,7 +1721,7 @@
                 <w:sz w:val="19"/>
                 <w:szCs w:val="19"/>
               </w:rPr>
-              <w:t xml:space="preserve">6 oct</w:t>
+              <w:t xml:space="preserve">2 oct</w:t>
             </w:r>
           </w:p>
         </w:tc>
@@ -1785,7 +1785,7 @@
                 <w:sz w:val="19"/>
                 <w:szCs w:val="19"/>
               </w:rPr>
-              <w:t xml:space="preserve">Revisión sistemática de literatura</w:t>
+              <w:t xml:space="preserve">Funcionalidades y lenguaje con el módulo sol</w:t>
             </w:r>
           </w:p>
         </w:tc>
@@ -1814,7 +1814,7 @@
                 <w:sz w:val="19"/>
                 <w:szCs w:val="19"/>
               </w:rPr>
-              <w:t xml:space="preserve">1 oct</w:t>
+              <w:t xml:space="preserve">28 sep</w:t>
             </w:r>
           </w:p>
         </w:tc>
@@ -1843,7 +1843,7 @@
                 <w:sz w:val="19"/>
                 <w:szCs w:val="19"/>
               </w:rPr>
-              <w:t xml:space="preserve">9 oct</w:t>
+              <w:t xml:space="preserve">2 oct</w:t>
             </w:r>
           </w:p>
         </w:tc>
@@ -1907,7 +1907,7 @@
                 <w:sz w:val="19"/>
                 <w:szCs w:val="19"/>
               </w:rPr>
-              <w:t xml:space="preserve">Validación con 4 usuarios</w:t>
+              <w:t xml:space="preserve">Revisión sistemática de literatura</w:t>
             </w:r>
           </w:p>
         </w:tc>
@@ -1936,7 +1936,7 @@
                 <w:sz w:val="19"/>
                 <w:szCs w:val="19"/>
               </w:rPr>
-              <w:t xml:space="preserve">1 oct</w:t>
+              <w:t xml:space="preserve">28 sep</w:t>
             </w:r>
           </w:p>
         </w:tc>
@@ -2000,7 +2000,7 @@
                 <w:sz w:val="19"/>
                 <w:szCs w:val="19"/>
               </w:rPr>
-              <w:t xml:space="preserve">Diseño</w:t>
+              <w:t xml:space="preserve">Análisis</w:t>
             </w:r>
           </w:p>
         </w:tc>
@@ -2029,7 +2029,7 @@
                 <w:sz w:val="19"/>
                 <w:szCs w:val="19"/>
               </w:rPr>
-              <w:t xml:space="preserve">Storyboard y logo</w:t>
+              <w:t xml:space="preserve">Validación con 4 usuarios</w:t>
             </w:r>
           </w:p>
         </w:tc>
@@ -2058,7 +2058,7 @@
                 <w:sz w:val="19"/>
                 <w:szCs w:val="19"/>
               </w:rPr>
-              <w:t xml:space="preserve">1 oct</w:t>
+              <w:t xml:space="preserve">28 sep</w:t>
             </w:r>
           </w:p>
         </w:tc>
@@ -2087,7 +2087,7 @@
                 <w:sz w:val="19"/>
                 <w:szCs w:val="19"/>
               </w:rPr>
-              <w:t xml:space="preserve">8 oct</w:t>
+              <w:t xml:space="preserve">9 oct</w:t>
             </w:r>
           </w:p>
         </w:tc>
@@ -2151,7 +2151,7 @@
                 <w:sz w:val="19"/>
                 <w:szCs w:val="19"/>
               </w:rPr>
-              <w:t xml:space="preserve">Prototipo navegacional</w:t>
+              <w:t xml:space="preserve">Guion final, storyboard y logo</w:t>
             </w:r>
           </w:p>
         </w:tc>
@@ -2180,7 +2180,7 @@
                 <w:sz w:val="19"/>
                 <w:szCs w:val="19"/>
               </w:rPr>
-              <w:t xml:space="preserve">5 oct</w:t>
+              <w:t xml:space="preserve">28 sep</w:t>
             </w:r>
           </w:p>
         </w:tc>
@@ -2209,7 +2209,7 @@
                 <w:sz w:val="19"/>
                 <w:szCs w:val="19"/>
               </w:rPr>
-              <w:t xml:space="preserve">16 oct</w:t>
+              <w:t xml:space="preserve">3 oct</w:t>
             </w:r>
           </w:p>
         </w:tc>
@@ -2244,7 +2244,7 @@
                 <w:sz w:val="19"/>
                 <w:szCs w:val="19"/>
               </w:rPr>
-              <w:t xml:space="preserve">Desarrollo</w:t>
+              <w:t xml:space="preserve">Diseño</w:t>
             </w:r>
           </w:p>
         </w:tc>
@@ -2273,7 +2273,7 @@
                 <w:sz w:val="19"/>
                 <w:szCs w:val="19"/>
               </w:rPr>
-              <w:t xml:space="preserve">Mecánica de conducción e interfaz base</w:t>
+              <w:t xml:space="preserve">Estructura de los archivos .txt</w:t>
             </w:r>
           </w:p>
         </w:tc>
@@ -2302,7 +2302,7 @@
                 <w:sz w:val="19"/>
                 <w:szCs w:val="19"/>
               </w:rPr>
-              <w:t xml:space="preserve">1 oct</w:t>
+              <w:t xml:space="preserve">5 oct</w:t>
             </w:r>
           </w:p>
         </w:tc>
@@ -2331,7 +2331,7 @@
                 <w:sz w:val="19"/>
                 <w:szCs w:val="19"/>
               </w:rPr>
-              <w:t xml:space="preserve">10 oct</w:t>
+              <w:t xml:space="preserve">9 oct</w:t>
             </w:r>
           </w:p>
         </w:tc>
@@ -2366,7 +2366,7 @@
                 <w:sz w:val="19"/>
                 <w:szCs w:val="19"/>
               </w:rPr>
-              <w:t xml:space="preserve">Desarrollo</w:t>
+              <w:t xml:space="preserve">Diseño</w:t>
             </w:r>
           </w:p>
         </w:tc>
@@ -2395,7 +2395,7 @@
                 <w:sz w:val="19"/>
                 <w:szCs w:val="19"/>
               </w:rPr>
-              <w:t xml:space="preserve">Archivos planos</w:t>
+              <w:t xml:space="preserve">Prototipo navegacional</w:t>
             </w:r>
           </w:p>
         </w:tc>
@@ -2453,7 +2453,7 @@
                 <w:sz w:val="19"/>
                 <w:szCs w:val="19"/>
               </w:rPr>
-              <w:t xml:space="preserve">25 oct</w:t>
+              <w:t xml:space="preserve">16 oct</w:t>
             </w:r>
           </w:p>
         </w:tc>
@@ -2517,7 +2517,7 @@
                 <w:sz w:val="19"/>
                 <w:szCs w:val="19"/>
               </w:rPr>
-              <w:t xml:space="preserve">Obstáculos y zonas de semáforos</w:t>
+              <w:t xml:space="preserve">Ventana, moto y 3 carriles</w:t>
             </w:r>
           </w:p>
         </w:tc>
@@ -2546,7 +2546,7 @@
                 <w:sz w:val="19"/>
                 <w:szCs w:val="19"/>
               </w:rPr>
-              <w:t xml:space="preserve">12 oct</w:t>
+              <w:t xml:space="preserve">28 sep</w:t>
             </w:r>
           </w:p>
         </w:tc>
@@ -2575,7 +2575,7 @@
                 <w:sz w:val="19"/>
                 <w:szCs w:val="19"/>
               </w:rPr>
-              <w:t xml:space="preserve">2 nov</w:t>
+              <w:t xml:space="preserve">3 oct</w:t>
             </w:r>
           </w:p>
         </w:tc>
@@ -2639,7 +2639,7 @@
                 <w:sz w:val="19"/>
                 <w:szCs w:val="19"/>
               </w:rPr>
-              <w:t xml:space="preserve">La Cabezota (barra de distancia), cajas, puntaje y vidas</w:t>
+              <w:t xml:space="preserve">Obstáculos, choques, vidas y puntaje</w:t>
             </w:r>
           </w:p>
         </w:tc>
@@ -2668,7 +2668,7 @@
                 <w:sz w:val="19"/>
                 <w:szCs w:val="19"/>
               </w:rPr>
-              <w:t xml:space="preserve">3 nov</w:t>
+              <w:t xml:space="preserve">5 oct</w:t>
             </w:r>
           </w:p>
         </w:tc>
@@ -2697,7 +2697,7 @@
                 <w:sz w:val="19"/>
                 <w:szCs w:val="19"/>
               </w:rPr>
-              <w:t xml:space="preserve">23 nov</w:t>
+              <w:t xml:space="preserve">10 oct</w:t>
             </w:r>
           </w:p>
         </w:tc>
@@ -2732,7 +2732,7 @@
                 <w:sz w:val="19"/>
                 <w:szCs w:val="19"/>
               </w:rPr>
-              <w:t xml:space="preserve">Pruebas</w:t>
+              <w:t xml:space="preserve">Desarrollo</w:t>
             </w:r>
           </w:p>
         </w:tc>
@@ -2761,7 +2761,7 @@
                 <w:sz w:val="19"/>
                 <w:szCs w:val="19"/>
               </w:rPr>
-              <w:t xml:space="preserve">Pruebas funcionales del juego</w:t>
+              <w:t xml:space="preserve">Semáforos y cajas</w:t>
             </w:r>
           </w:p>
         </w:tc>
@@ -2790,7 +2790,7 @@
                 <w:sz w:val="19"/>
                 <w:szCs w:val="19"/>
               </w:rPr>
-              <w:t xml:space="preserve">26 oct</w:t>
+              <w:t xml:space="preserve">12 oct</w:t>
             </w:r>
           </w:p>
         </w:tc>
@@ -2819,7 +2819,7 @@
                 <w:sz w:val="19"/>
                 <w:szCs w:val="19"/>
               </w:rPr>
-              <w:t xml:space="preserve">27 nov</w:t>
+              <w:t xml:space="preserve">17 oct</w:t>
             </w:r>
           </w:p>
         </w:tc>
@@ -2854,7 +2854,7 @@
                 <w:sz w:val="19"/>
                 <w:szCs w:val="19"/>
               </w:rPr>
-              <w:t xml:space="preserve">Pruebas</w:t>
+              <w:t xml:space="preserve">Desarrollo</w:t>
             </w:r>
           </w:p>
         </w:tc>
@@ -2883,7 +2883,7 @@
                 <w:sz w:val="19"/>
                 <w:szCs w:val="19"/>
               </w:rPr>
-              <w:t xml:space="preserve">Pruebas con usuarios y ajustes</w:t>
+              <w:t xml:space="preserve">Menú, inicio de sesión y pantallas</w:t>
             </w:r>
           </w:p>
         </w:tc>
@@ -2912,7 +2912,7 @@
                 <w:sz w:val="19"/>
                 <w:szCs w:val="19"/>
               </w:rPr>
-              <w:t xml:space="preserve">16 nov</w:t>
+              <w:t xml:space="preserve">12 oct</w:t>
             </w:r>
           </w:p>
         </w:tc>
@@ -2941,7 +2941,7 @@
                 <w:sz w:val="19"/>
                 <w:szCs w:val="19"/>
               </w:rPr>
-              <w:t xml:space="preserve">4 dic</w:t>
+              <w:t xml:space="preserve">24 oct</w:t>
             </w:r>
           </w:p>
         </w:tc>
@@ -2976,7 +2976,7 @@
                 <w:sz w:val="19"/>
                 <w:szCs w:val="19"/>
               </w:rPr>
-              <w:t xml:space="preserve">Operación y mantenimiento</w:t>
+              <w:t xml:space="preserve">Desarrollo</w:t>
             </w:r>
           </w:p>
         </w:tc>
@@ -3005,7 +3005,7 @@
                 <w:sz w:val="19"/>
                 <w:szCs w:val="19"/>
               </w:rPr>
-              <w:t xml:space="preserve">Correcciones, manual e instalador</w:t>
+              <w:t xml:space="preserve">Archivos planos (usuarios y puntajes)</w:t>
             </w:r>
           </w:p>
         </w:tc>
@@ -3034,7 +3034,7 @@
                 <w:sz w:val="19"/>
                 <w:szCs w:val="19"/>
               </w:rPr>
-              <w:t xml:space="preserve">23 nov</w:t>
+              <w:t xml:space="preserve">19 oct</w:t>
             </w:r>
           </w:p>
         </w:tc>
@@ -3063,7 +3063,7 @@
                 <w:sz w:val="19"/>
                 <w:szCs w:val="19"/>
               </w:rPr>
-              <w:t xml:space="preserve">6 dic</w:t>
+              <w:t xml:space="preserve">24 oct</w:t>
             </w:r>
           </w:p>
         </w:tc>
@@ -3098,7 +3098,7 @@
                 <w:sz w:val="19"/>
                 <w:szCs w:val="19"/>
               </w:rPr>
-              <w:t xml:space="preserve">Hito</w:t>
+              <w:t xml:space="preserve">Desarrollo</w:t>
             </w:r>
           </w:p>
         </w:tc>
@@ -3127,7 +3127,7 @@
                 <w:sz w:val="19"/>
                 <w:szCs w:val="19"/>
               </w:rPr>
-              <w:t xml:space="preserve">1ra socialización</w:t>
+              <w:t xml:space="preserve">Tramos 1 y 2 (barrio y avenida)</w:t>
             </w:r>
           </w:p>
         </w:tc>
@@ -3156,7 +3156,7 @@
                 <w:sz w:val="19"/>
                 <w:szCs w:val="19"/>
               </w:rPr>
-              <w:t xml:space="preserve">5 oct</w:t>
+              <w:t xml:space="preserve">19 oct</w:t>
             </w:r>
           </w:p>
         </w:tc>
@@ -3185,7 +3185,7 @@
                 <w:sz w:val="19"/>
                 <w:szCs w:val="19"/>
               </w:rPr>
-              <w:t xml:space="preserve">11 oct</w:t>
+              <w:t xml:space="preserve">24 oct</w:t>
             </w:r>
           </w:p>
         </w:tc>
@@ -3220,7 +3220,7 @@
                 <w:sz w:val="19"/>
                 <w:szCs w:val="19"/>
               </w:rPr>
-              <w:t xml:space="preserve">Hito</w:t>
+              <w:t xml:space="preserve">Desarrollo</w:t>
             </w:r>
           </w:p>
         </w:tc>
@@ -3249,6 +3249,1592 @@
                 <w:sz w:val="19"/>
                 <w:szCs w:val="19"/>
               </w:rPr>
+              <w:t xml:space="preserve">Tramos 3 y 4 y barra de la Cabezota</w:t>
+            </w:r>
+          </w:p>
+        </w:tc>
+        <w:tc>
+          <w:tcPr>
+            <w:tcW w:type="dxa" w:w="1450"/>
+            <w:tcBorders>
+              <w:top w:val="single" w:color="999999" w:sz="4"/>
+              <w:left w:val="single" w:color="999999" w:sz="4"/>
+              <w:bottom w:val="single" w:color="999999" w:sz="4"/>
+              <w:right w:val="single" w:color="999999" w:sz="4"/>
+            </w:tcBorders>
+            <w:tcMar>
+              <w:top w:type="dxa" w:w="60"/>
+              <w:left w:type="dxa" w:w="90"/>
+              <w:bottom w:type="dxa" w:w="60"/>
+              <w:right w:type="dxa" w:w="90"/>
+            </w:tcMar>
+          </w:tcPr>
+          <w:p>
+            <w:pPr>
+              <w:spacing w:after="40"/>
+            </w:pPr>
+            <w:r>
+              <w:rPr>
+                <w:sz w:val="19"/>
+                <w:szCs w:val="19"/>
+              </w:rPr>
+              <w:t xml:space="preserve">26 oct</w:t>
+            </w:r>
+          </w:p>
+        </w:tc>
+        <w:tc>
+          <w:tcPr>
+            <w:tcW w:type="dxa" w:w="1450"/>
+            <w:tcBorders>
+              <w:top w:val="single" w:color="999999" w:sz="4"/>
+              <w:left w:val="single" w:color="999999" w:sz="4"/>
+              <w:bottom w:val="single" w:color="999999" w:sz="4"/>
+              <w:right w:val="single" w:color="999999" w:sz="4"/>
+            </w:tcBorders>
+            <w:tcMar>
+              <w:top w:type="dxa" w:w="60"/>
+              <w:left w:type="dxa" w:w="90"/>
+              <w:bottom w:type="dxa" w:w="60"/>
+              <w:right w:type="dxa" w:w="90"/>
+            </w:tcMar>
+          </w:tcPr>
+          <w:p>
+            <w:pPr>
+              <w:spacing w:after="40"/>
+            </w:pPr>
+            <w:r>
+              <w:rPr>
+                <w:sz w:val="19"/>
+                <w:szCs w:val="19"/>
+              </w:rPr>
+              <w:t xml:space="preserve">31 oct</w:t>
+            </w:r>
+          </w:p>
+        </w:tc>
+      </w:tr>
+      <w:tr>
+        <w:trPr>
+          <w:cantSplit/>
+          <w:tblHeader w:val="false"/>
+        </w:trPr>
+        <w:tc>
+          <w:tcPr>
+            <w:tcW w:type="dxa" w:w="2300"/>
+            <w:tcBorders>
+              <w:top w:val="single" w:color="999999" w:sz="4"/>
+              <w:left w:val="single" w:color="999999" w:sz="4"/>
+              <w:bottom w:val="single" w:color="999999" w:sz="4"/>
+              <w:right w:val="single" w:color="999999" w:sz="4"/>
+            </w:tcBorders>
+            <w:tcMar>
+              <w:top w:type="dxa" w:w="60"/>
+              <w:left w:type="dxa" w:w="90"/>
+              <w:bottom w:type="dxa" w:w="60"/>
+              <w:right w:type="dxa" w:w="90"/>
+            </w:tcMar>
+          </w:tcPr>
+          <w:p>
+            <w:pPr>
+              <w:spacing w:after="40"/>
+            </w:pPr>
+            <w:r>
+              <w:rPr>
+                <w:sz w:val="19"/>
+                <w:szCs w:val="19"/>
+              </w:rPr>
+              <w:t xml:space="preserve">Desarrollo</w:t>
+            </w:r>
+          </w:p>
+        </w:tc>
+        <w:tc>
+          <w:tcPr>
+            <w:tcW w:type="dxa" w:w="4160"/>
+            <w:tcBorders>
+              <w:top w:val="single" w:color="999999" w:sz="4"/>
+              <w:left w:val="single" w:color="999999" w:sz="4"/>
+              <w:bottom w:val="single" w:color="999999" w:sz="4"/>
+              <w:right w:val="single" w:color="999999" w:sz="4"/>
+            </w:tcBorders>
+            <w:tcMar>
+              <w:top w:type="dxa" w:w="60"/>
+              <w:left w:type="dxa" w:w="90"/>
+              <w:bottom w:type="dxa" w:w="60"/>
+              <w:right w:type="dxa" w:w="90"/>
+            </w:tcMar>
+          </w:tcPr>
+          <w:p>
+            <w:pPr>
+              <w:spacing w:after="40"/>
+            </w:pPr>
+            <w:r>
+              <w:rPr>
+                <w:sz w:val="19"/>
+                <w:szCs w:val="19"/>
+              </w:rPr>
+              <w:t xml:space="preserve">Recta final, ganar y perder, ranking</w:t>
+            </w:r>
+          </w:p>
+        </w:tc>
+        <w:tc>
+          <w:tcPr>
+            <w:tcW w:type="dxa" w:w="1450"/>
+            <w:tcBorders>
+              <w:top w:val="single" w:color="999999" w:sz="4"/>
+              <w:left w:val="single" w:color="999999" w:sz="4"/>
+              <w:bottom w:val="single" w:color="999999" w:sz="4"/>
+              <w:right w:val="single" w:color="999999" w:sz="4"/>
+            </w:tcBorders>
+            <w:tcMar>
+              <w:top w:type="dxa" w:w="60"/>
+              <w:left w:type="dxa" w:w="90"/>
+              <w:bottom w:type="dxa" w:w="60"/>
+              <w:right w:type="dxa" w:w="90"/>
+            </w:tcMar>
+          </w:tcPr>
+          <w:p>
+            <w:pPr>
+              <w:spacing w:after="40"/>
+            </w:pPr>
+            <w:r>
+              <w:rPr>
+                <w:sz w:val="19"/>
+                <w:szCs w:val="19"/>
+              </w:rPr>
+              <w:t xml:space="preserve">2 nov</w:t>
+            </w:r>
+          </w:p>
+        </w:tc>
+        <w:tc>
+          <w:tcPr>
+            <w:tcW w:type="dxa" w:w="1450"/>
+            <w:tcBorders>
+              <w:top w:val="single" w:color="999999" w:sz="4"/>
+              <w:left w:val="single" w:color="999999" w:sz="4"/>
+              <w:bottom w:val="single" w:color="999999" w:sz="4"/>
+              <w:right w:val="single" w:color="999999" w:sz="4"/>
+            </w:tcBorders>
+            <w:tcMar>
+              <w:top w:type="dxa" w:w="60"/>
+              <w:left w:type="dxa" w:w="90"/>
+              <w:bottom w:type="dxa" w:w="60"/>
+              <w:right w:type="dxa" w:w="90"/>
+            </w:tcMar>
+          </w:tcPr>
+          <w:p>
+            <w:pPr>
+              <w:spacing w:after="40"/>
+            </w:pPr>
+            <w:r>
+              <w:rPr>
+                <w:sz w:val="19"/>
+                <w:szCs w:val="19"/>
+              </w:rPr>
+              <w:t xml:space="preserve">7 nov</w:t>
+            </w:r>
+          </w:p>
+        </w:tc>
+      </w:tr>
+      <w:tr>
+        <w:trPr>
+          <w:cantSplit/>
+          <w:tblHeader w:val="false"/>
+        </w:trPr>
+        <w:tc>
+          <w:tcPr>
+            <w:tcW w:type="dxa" w:w="2300"/>
+            <w:tcBorders>
+              <w:top w:val="single" w:color="999999" w:sz="4"/>
+              <w:left w:val="single" w:color="999999" w:sz="4"/>
+              <w:bottom w:val="single" w:color="999999" w:sz="4"/>
+              <w:right w:val="single" w:color="999999" w:sz="4"/>
+            </w:tcBorders>
+            <w:tcMar>
+              <w:top w:type="dxa" w:w="60"/>
+              <w:left w:type="dxa" w:w="90"/>
+              <w:bottom w:type="dxa" w:w="60"/>
+              <w:right w:type="dxa" w:w="90"/>
+            </w:tcMar>
+          </w:tcPr>
+          <w:p>
+            <w:pPr>
+              <w:spacing w:after="40"/>
+            </w:pPr>
+            <w:r>
+              <w:rPr>
+                <w:sz w:val="19"/>
+                <w:szCs w:val="19"/>
+              </w:rPr>
+              <w:t xml:space="preserve">Pruebas</w:t>
+            </w:r>
+          </w:p>
+        </w:tc>
+        <w:tc>
+          <w:tcPr>
+            <w:tcW w:type="dxa" w:w="4160"/>
+            <w:tcBorders>
+              <w:top w:val="single" w:color="999999" w:sz="4"/>
+              <w:left w:val="single" w:color="999999" w:sz="4"/>
+              <w:bottom w:val="single" w:color="999999" w:sz="4"/>
+              <w:right w:val="single" w:color="999999" w:sz="4"/>
+            </w:tcBorders>
+            <w:tcMar>
+              <w:top w:type="dxa" w:w="60"/>
+              <w:left w:type="dxa" w:w="90"/>
+              <w:bottom w:type="dxa" w:w="60"/>
+              <w:right w:type="dxa" w:w="90"/>
+            </w:tcMar>
+          </w:tcPr>
+          <w:p>
+            <w:pPr>
+              <w:spacing w:after="40"/>
+            </w:pPr>
+            <w:r>
+              <w:rPr>
+                <w:sz w:val="19"/>
+                <w:szCs w:val="19"/>
+              </w:rPr>
+              <w:t xml:space="preserve">Pruebas de cada tramo</w:t>
+            </w:r>
+          </w:p>
+        </w:tc>
+        <w:tc>
+          <w:tcPr>
+            <w:tcW w:type="dxa" w:w="1450"/>
+            <w:tcBorders>
+              <w:top w:val="single" w:color="999999" w:sz="4"/>
+              <w:left w:val="single" w:color="999999" w:sz="4"/>
+              <w:bottom w:val="single" w:color="999999" w:sz="4"/>
+              <w:right w:val="single" w:color="999999" w:sz="4"/>
+            </w:tcBorders>
+            <w:tcMar>
+              <w:top w:type="dxa" w:w="60"/>
+              <w:left w:type="dxa" w:w="90"/>
+              <w:bottom w:type="dxa" w:w="60"/>
+              <w:right w:type="dxa" w:w="90"/>
+            </w:tcMar>
+          </w:tcPr>
+          <w:p>
+            <w:pPr>
+              <w:spacing w:after="40"/>
+            </w:pPr>
+            <w:r>
+              <w:rPr>
+                <w:sz w:val="19"/>
+                <w:szCs w:val="19"/>
+              </w:rPr>
+              <w:t xml:space="preserve">12 oct</w:t>
+            </w:r>
+          </w:p>
+        </w:tc>
+        <w:tc>
+          <w:tcPr>
+            <w:tcW w:type="dxa" w:w="1450"/>
+            <w:tcBorders>
+              <w:top w:val="single" w:color="999999" w:sz="4"/>
+              <w:left w:val="single" w:color="999999" w:sz="4"/>
+              <w:bottom w:val="single" w:color="999999" w:sz="4"/>
+              <w:right w:val="single" w:color="999999" w:sz="4"/>
+            </w:tcBorders>
+            <w:tcMar>
+              <w:top w:type="dxa" w:w="60"/>
+              <w:left w:type="dxa" w:w="90"/>
+              <w:bottom w:type="dxa" w:w="60"/>
+              <w:right w:type="dxa" w:w="90"/>
+            </w:tcMar>
+          </w:tcPr>
+          <w:p>
+            <w:pPr>
+              <w:spacing w:after="40"/>
+            </w:pPr>
+            <w:r>
+              <w:rPr>
+                <w:sz w:val="19"/>
+                <w:szCs w:val="19"/>
+              </w:rPr>
+              <w:t xml:space="preserve">7 nov</w:t>
+            </w:r>
+          </w:p>
+        </w:tc>
+      </w:tr>
+      <w:tr>
+        <w:trPr>
+          <w:cantSplit/>
+          <w:tblHeader w:val="false"/>
+        </w:trPr>
+        <w:tc>
+          <w:tcPr>
+            <w:tcW w:type="dxa" w:w="2300"/>
+            <w:tcBorders>
+              <w:top w:val="single" w:color="999999" w:sz="4"/>
+              <w:left w:val="single" w:color="999999" w:sz="4"/>
+              <w:bottom w:val="single" w:color="999999" w:sz="4"/>
+              <w:right w:val="single" w:color="999999" w:sz="4"/>
+            </w:tcBorders>
+            <w:tcMar>
+              <w:top w:type="dxa" w:w="60"/>
+              <w:left w:type="dxa" w:w="90"/>
+              <w:bottom w:type="dxa" w:w="60"/>
+              <w:right w:type="dxa" w:w="90"/>
+            </w:tcMar>
+          </w:tcPr>
+          <w:p>
+            <w:pPr>
+              <w:spacing w:after="40"/>
+            </w:pPr>
+            <w:r>
+              <w:rPr>
+                <w:sz w:val="19"/>
+                <w:szCs w:val="19"/>
+              </w:rPr>
+              <w:t xml:space="preserve">Pruebas</w:t>
+            </w:r>
+          </w:p>
+        </w:tc>
+        <w:tc>
+          <w:tcPr>
+            <w:tcW w:type="dxa" w:w="4160"/>
+            <w:tcBorders>
+              <w:top w:val="single" w:color="999999" w:sz="4"/>
+              <w:left w:val="single" w:color="999999" w:sz="4"/>
+              <w:bottom w:val="single" w:color="999999" w:sz="4"/>
+              <w:right w:val="single" w:color="999999" w:sz="4"/>
+            </w:tcBorders>
+            <w:tcMar>
+              <w:top w:type="dxa" w:w="60"/>
+              <w:left w:type="dxa" w:w="90"/>
+              <w:bottom w:type="dxa" w:w="60"/>
+              <w:right w:type="dxa" w:w="90"/>
+            </w:tcMar>
+          </w:tcPr>
+          <w:p>
+            <w:pPr>
+              <w:spacing w:after="40"/>
+            </w:pPr>
+            <w:r>
+              <w:rPr>
+                <w:sz w:val="19"/>
+                <w:szCs w:val="19"/>
+              </w:rPr>
+              <w:t xml:space="preserve">Pruebas funcionales y correcciones</w:t>
+            </w:r>
+          </w:p>
+        </w:tc>
+        <w:tc>
+          <w:tcPr>
+            <w:tcW w:type="dxa" w:w="1450"/>
+            <w:tcBorders>
+              <w:top w:val="single" w:color="999999" w:sz="4"/>
+              <w:left w:val="single" w:color="999999" w:sz="4"/>
+              <w:bottom w:val="single" w:color="999999" w:sz="4"/>
+              <w:right w:val="single" w:color="999999" w:sz="4"/>
+            </w:tcBorders>
+            <w:tcMar>
+              <w:top w:type="dxa" w:w="60"/>
+              <w:left w:type="dxa" w:w="90"/>
+              <w:bottom w:type="dxa" w:w="60"/>
+              <w:right w:type="dxa" w:w="90"/>
+            </w:tcMar>
+          </w:tcPr>
+          <w:p>
+            <w:pPr>
+              <w:spacing w:after="40"/>
+            </w:pPr>
+            <w:r>
+              <w:rPr>
+                <w:sz w:val="19"/>
+                <w:szCs w:val="19"/>
+              </w:rPr>
+              <w:t xml:space="preserve">9 nov</w:t>
+            </w:r>
+          </w:p>
+        </w:tc>
+        <w:tc>
+          <w:tcPr>
+            <w:tcW w:type="dxa" w:w="1450"/>
+            <w:tcBorders>
+              <w:top w:val="single" w:color="999999" w:sz="4"/>
+              <w:left w:val="single" w:color="999999" w:sz="4"/>
+              <w:bottom w:val="single" w:color="999999" w:sz="4"/>
+              <w:right w:val="single" w:color="999999" w:sz="4"/>
+            </w:tcBorders>
+            <w:tcMar>
+              <w:top w:type="dxa" w:w="60"/>
+              <w:left w:type="dxa" w:w="90"/>
+              <w:bottom w:type="dxa" w:w="60"/>
+              <w:right w:type="dxa" w:w="90"/>
+            </w:tcMar>
+          </w:tcPr>
+          <w:p>
+            <w:pPr>
+              <w:spacing w:after="40"/>
+            </w:pPr>
+            <w:r>
+              <w:rPr>
+                <w:sz w:val="19"/>
+                <w:szCs w:val="19"/>
+              </w:rPr>
+              <w:t xml:space="preserve">14 nov</w:t>
+            </w:r>
+          </w:p>
+        </w:tc>
+      </w:tr>
+      <w:tr>
+        <w:trPr>
+          <w:cantSplit/>
+          <w:tblHeader w:val="false"/>
+        </w:trPr>
+        <w:tc>
+          <w:tcPr>
+            <w:tcW w:type="dxa" w:w="2300"/>
+            <w:tcBorders>
+              <w:top w:val="single" w:color="999999" w:sz="4"/>
+              <w:left w:val="single" w:color="999999" w:sz="4"/>
+              <w:bottom w:val="single" w:color="999999" w:sz="4"/>
+              <w:right w:val="single" w:color="999999" w:sz="4"/>
+            </w:tcBorders>
+            <w:tcMar>
+              <w:top w:type="dxa" w:w="60"/>
+              <w:left w:type="dxa" w:w="90"/>
+              <w:bottom w:type="dxa" w:w="60"/>
+              <w:right w:type="dxa" w:w="90"/>
+            </w:tcMar>
+          </w:tcPr>
+          <w:p>
+            <w:pPr>
+              <w:spacing w:after="40"/>
+            </w:pPr>
+            <w:r>
+              <w:rPr>
+                <w:sz w:val="19"/>
+                <w:szCs w:val="19"/>
+              </w:rPr>
+              <w:t xml:space="preserve">Pruebas</w:t>
+            </w:r>
+          </w:p>
+        </w:tc>
+        <w:tc>
+          <w:tcPr>
+            <w:tcW w:type="dxa" w:w="4160"/>
+            <w:tcBorders>
+              <w:top w:val="single" w:color="999999" w:sz="4"/>
+              <w:left w:val="single" w:color="999999" w:sz="4"/>
+              <w:bottom w:val="single" w:color="999999" w:sz="4"/>
+              <w:right w:val="single" w:color="999999" w:sz="4"/>
+            </w:tcBorders>
+            <w:tcMar>
+              <w:top w:type="dxa" w:w="60"/>
+              <w:left w:type="dxa" w:w="90"/>
+              <w:bottom w:type="dxa" w:w="60"/>
+              <w:right w:type="dxa" w:w="90"/>
+            </w:tcMar>
+          </w:tcPr>
+          <w:p>
+            <w:pPr>
+              <w:spacing w:after="40"/>
+            </w:pPr>
+            <w:r>
+              <w:rPr>
+                <w:sz w:val="19"/>
+                <w:szCs w:val="19"/>
+              </w:rPr>
+              <w:t xml:space="preserve">Pruebas con 4 usuarios y ajustes</w:t>
+            </w:r>
+          </w:p>
+        </w:tc>
+        <w:tc>
+          <w:tcPr>
+            <w:tcW w:type="dxa" w:w="1450"/>
+            <w:tcBorders>
+              <w:top w:val="single" w:color="999999" w:sz="4"/>
+              <w:left w:val="single" w:color="999999" w:sz="4"/>
+              <w:bottom w:val="single" w:color="999999" w:sz="4"/>
+              <w:right w:val="single" w:color="999999" w:sz="4"/>
+            </w:tcBorders>
+            <w:tcMar>
+              <w:top w:type="dxa" w:w="60"/>
+              <w:left w:type="dxa" w:w="90"/>
+              <w:bottom w:type="dxa" w:w="60"/>
+              <w:right w:type="dxa" w:w="90"/>
+            </w:tcMar>
+          </w:tcPr>
+          <w:p>
+            <w:pPr>
+              <w:spacing w:after="40"/>
+            </w:pPr>
+            <w:r>
+              <w:rPr>
+                <w:sz w:val="19"/>
+                <w:szCs w:val="19"/>
+              </w:rPr>
+              <w:t xml:space="preserve">16 nov</w:t>
+            </w:r>
+          </w:p>
+        </w:tc>
+        <w:tc>
+          <w:tcPr>
+            <w:tcW w:type="dxa" w:w="1450"/>
+            <w:tcBorders>
+              <w:top w:val="single" w:color="999999" w:sz="4"/>
+              <w:left w:val="single" w:color="999999" w:sz="4"/>
+              <w:bottom w:val="single" w:color="999999" w:sz="4"/>
+              <w:right w:val="single" w:color="999999" w:sz="4"/>
+            </w:tcBorders>
+            <w:tcMar>
+              <w:top w:type="dxa" w:w="60"/>
+              <w:left w:type="dxa" w:w="90"/>
+              <w:bottom w:type="dxa" w:w="60"/>
+              <w:right w:type="dxa" w:w="90"/>
+            </w:tcMar>
+          </w:tcPr>
+          <w:p>
+            <w:pPr>
+              <w:spacing w:after="40"/>
+            </w:pPr>
+            <w:r>
+              <w:rPr>
+                <w:sz w:val="19"/>
+                <w:szCs w:val="19"/>
+              </w:rPr>
+              <w:t xml:space="preserve">21 nov</w:t>
+            </w:r>
+          </w:p>
+        </w:tc>
+      </w:tr>
+      <w:tr>
+        <w:trPr>
+          <w:cantSplit/>
+          <w:tblHeader w:val="false"/>
+        </w:trPr>
+        <w:tc>
+          <w:tcPr>
+            <w:tcW w:type="dxa" w:w="2300"/>
+            <w:tcBorders>
+              <w:top w:val="single" w:color="999999" w:sz="4"/>
+              <w:left w:val="single" w:color="999999" w:sz="4"/>
+              <w:bottom w:val="single" w:color="999999" w:sz="4"/>
+              <w:right w:val="single" w:color="999999" w:sz="4"/>
+            </w:tcBorders>
+            <w:tcMar>
+              <w:top w:type="dxa" w:w="60"/>
+              <w:left w:type="dxa" w:w="90"/>
+              <w:bottom w:type="dxa" w:w="60"/>
+              <w:right w:type="dxa" w:w="90"/>
+            </w:tcMar>
+          </w:tcPr>
+          <w:p>
+            <w:pPr>
+              <w:spacing w:after="40"/>
+            </w:pPr>
+            <w:r>
+              <w:rPr>
+                <w:sz w:val="19"/>
+                <w:szCs w:val="19"/>
+              </w:rPr>
+              <w:t xml:space="preserve">Operación y mantenimiento</w:t>
+            </w:r>
+          </w:p>
+        </w:tc>
+        <w:tc>
+          <w:tcPr>
+            <w:tcW w:type="dxa" w:w="4160"/>
+            <w:tcBorders>
+              <w:top w:val="single" w:color="999999" w:sz="4"/>
+              <w:left w:val="single" w:color="999999" w:sz="4"/>
+              <w:bottom w:val="single" w:color="999999" w:sz="4"/>
+              <w:right w:val="single" w:color="999999" w:sz="4"/>
+            </w:tcBorders>
+            <w:tcMar>
+              <w:top w:type="dxa" w:w="60"/>
+              <w:left w:type="dxa" w:w="90"/>
+              <w:bottom w:type="dxa" w:w="60"/>
+              <w:right w:type="dxa" w:w="90"/>
+            </w:tcMar>
+          </w:tcPr>
+          <w:p>
+            <w:pPr>
+              <w:spacing w:after="40"/>
+            </w:pPr>
+            <w:r>
+              <w:rPr>
+                <w:sz w:val="19"/>
+                <w:szCs w:val="19"/>
+              </w:rPr>
+              <w:t xml:space="preserve">Manual de usuario</w:t>
+            </w:r>
+          </w:p>
+        </w:tc>
+        <w:tc>
+          <w:tcPr>
+            <w:tcW w:type="dxa" w:w="1450"/>
+            <w:tcBorders>
+              <w:top w:val="single" w:color="999999" w:sz="4"/>
+              <w:left w:val="single" w:color="999999" w:sz="4"/>
+              <w:bottom w:val="single" w:color="999999" w:sz="4"/>
+              <w:right w:val="single" w:color="999999" w:sz="4"/>
+            </w:tcBorders>
+            <w:tcMar>
+              <w:top w:type="dxa" w:w="60"/>
+              <w:left w:type="dxa" w:w="90"/>
+              <w:bottom w:type="dxa" w:w="60"/>
+              <w:right w:type="dxa" w:w="90"/>
+            </w:tcMar>
+          </w:tcPr>
+          <w:p>
+            <w:pPr>
+              <w:spacing w:after="40"/>
+            </w:pPr>
+            <w:r>
+              <w:rPr>
+                <w:sz w:val="19"/>
+                <w:szCs w:val="19"/>
+              </w:rPr>
+              <w:t xml:space="preserve">16 nov</w:t>
+            </w:r>
+          </w:p>
+        </w:tc>
+        <w:tc>
+          <w:tcPr>
+            <w:tcW w:type="dxa" w:w="1450"/>
+            <w:tcBorders>
+              <w:top w:val="single" w:color="999999" w:sz="4"/>
+              <w:left w:val="single" w:color="999999" w:sz="4"/>
+              <w:bottom w:val="single" w:color="999999" w:sz="4"/>
+              <w:right w:val="single" w:color="999999" w:sz="4"/>
+            </w:tcBorders>
+            <w:tcMar>
+              <w:top w:type="dxa" w:w="60"/>
+              <w:left w:type="dxa" w:w="90"/>
+              <w:bottom w:type="dxa" w:w="60"/>
+              <w:right w:type="dxa" w:w="90"/>
+            </w:tcMar>
+          </w:tcPr>
+          <w:p>
+            <w:pPr>
+              <w:spacing w:after="40"/>
+            </w:pPr>
+            <w:r>
+              <w:rPr>
+                <w:sz w:val="19"/>
+                <w:szCs w:val="19"/>
+              </w:rPr>
+              <w:t xml:space="preserve">21 nov</w:t>
+            </w:r>
+          </w:p>
+        </w:tc>
+      </w:tr>
+      <w:tr>
+        <w:trPr>
+          <w:cantSplit/>
+          <w:tblHeader w:val="false"/>
+        </w:trPr>
+        <w:tc>
+          <w:tcPr>
+            <w:tcW w:type="dxa" w:w="2300"/>
+            <w:tcBorders>
+              <w:top w:val="single" w:color="999999" w:sz="4"/>
+              <w:left w:val="single" w:color="999999" w:sz="4"/>
+              <w:bottom w:val="single" w:color="999999" w:sz="4"/>
+              <w:right w:val="single" w:color="999999" w:sz="4"/>
+            </w:tcBorders>
+            <w:tcMar>
+              <w:top w:type="dxa" w:w="60"/>
+              <w:left w:type="dxa" w:w="90"/>
+              <w:bottom w:type="dxa" w:w="60"/>
+              <w:right w:type="dxa" w:w="90"/>
+            </w:tcMar>
+          </w:tcPr>
+          <w:p>
+            <w:pPr>
+              <w:spacing w:after="40"/>
+            </w:pPr>
+            <w:r>
+              <w:rPr>
+                <w:sz w:val="19"/>
+                <w:szCs w:val="19"/>
+              </w:rPr>
+              <w:t xml:space="preserve">Operación y mantenimiento</w:t>
+            </w:r>
+          </w:p>
+        </w:tc>
+        <w:tc>
+          <w:tcPr>
+            <w:tcW w:type="dxa" w:w="4160"/>
+            <w:tcBorders>
+              <w:top w:val="single" w:color="999999" w:sz="4"/>
+              <w:left w:val="single" w:color="999999" w:sz="4"/>
+              <w:bottom w:val="single" w:color="999999" w:sz="4"/>
+              <w:right w:val="single" w:color="999999" w:sz="4"/>
+            </w:tcBorders>
+            <w:tcMar>
+              <w:top w:type="dxa" w:w="60"/>
+              <w:left w:type="dxa" w:w="90"/>
+              <w:bottom w:type="dxa" w:w="60"/>
+              <w:right w:type="dxa" w:w="90"/>
+            </w:tcMar>
+          </w:tcPr>
+          <w:p>
+            <w:pPr>
+              <w:spacing w:after="40"/>
+            </w:pPr>
+            <w:r>
+              <w:rPr>
+                <w:sz w:val="19"/>
+                <w:szCs w:val="19"/>
+              </w:rPr>
+              <w:t xml:space="preserve">Instalador y código final</w:t>
+            </w:r>
+          </w:p>
+        </w:tc>
+        <w:tc>
+          <w:tcPr>
+            <w:tcW w:type="dxa" w:w="1450"/>
+            <w:tcBorders>
+              <w:top w:val="single" w:color="999999" w:sz="4"/>
+              <w:left w:val="single" w:color="999999" w:sz="4"/>
+              <w:bottom w:val="single" w:color="999999" w:sz="4"/>
+              <w:right w:val="single" w:color="999999" w:sz="4"/>
+            </w:tcBorders>
+            <w:tcMar>
+              <w:top w:type="dxa" w:w="60"/>
+              <w:left w:type="dxa" w:w="90"/>
+              <w:bottom w:type="dxa" w:w="60"/>
+              <w:right w:type="dxa" w:w="90"/>
+            </w:tcMar>
+          </w:tcPr>
+          <w:p>
+            <w:pPr>
+              <w:spacing w:after="40"/>
+            </w:pPr>
+            <w:r>
+              <w:rPr>
+                <w:sz w:val="19"/>
+                <w:szCs w:val="19"/>
+              </w:rPr>
+              <w:t xml:space="preserve">23 nov</w:t>
+            </w:r>
+          </w:p>
+        </w:tc>
+        <w:tc>
+          <w:tcPr>
+            <w:tcW w:type="dxa" w:w="1450"/>
+            <w:tcBorders>
+              <w:top w:val="single" w:color="999999" w:sz="4"/>
+              <w:left w:val="single" w:color="999999" w:sz="4"/>
+              <w:bottom w:val="single" w:color="999999" w:sz="4"/>
+              <w:right w:val="single" w:color="999999" w:sz="4"/>
+            </w:tcBorders>
+            <w:tcMar>
+              <w:top w:type="dxa" w:w="60"/>
+              <w:left w:type="dxa" w:w="90"/>
+              <w:bottom w:type="dxa" w:w="60"/>
+              <w:right w:type="dxa" w:w="90"/>
+            </w:tcMar>
+          </w:tcPr>
+          <w:p>
+            <w:pPr>
+              <w:spacing w:after="40"/>
+            </w:pPr>
+            <w:r>
+              <w:rPr>
+                <w:sz w:val="19"/>
+                <w:szCs w:val="19"/>
+              </w:rPr>
+              <w:t xml:space="preserve">28 nov</w:t>
+            </w:r>
+          </w:p>
+        </w:tc>
+      </w:tr>
+      <w:tr>
+        <w:trPr>
+          <w:cantSplit/>
+          <w:tblHeader w:val="false"/>
+        </w:trPr>
+        <w:tc>
+          <w:tcPr>
+            <w:tcW w:type="dxa" w:w="2300"/>
+            <w:tcBorders>
+              <w:top w:val="single" w:color="999999" w:sz="4"/>
+              <w:left w:val="single" w:color="999999" w:sz="4"/>
+              <w:bottom w:val="single" w:color="999999" w:sz="4"/>
+              <w:right w:val="single" w:color="999999" w:sz="4"/>
+            </w:tcBorders>
+            <w:tcMar>
+              <w:top w:type="dxa" w:w="60"/>
+              <w:left w:type="dxa" w:w="90"/>
+              <w:bottom w:type="dxa" w:w="60"/>
+              <w:right w:type="dxa" w:w="90"/>
+            </w:tcMar>
+          </w:tcPr>
+          <w:p>
+            <w:pPr>
+              <w:spacing w:after="40"/>
+            </w:pPr>
+            <w:r>
+              <w:rPr>
+                <w:sz w:val="19"/>
+                <w:szCs w:val="19"/>
+              </w:rPr>
+              <w:t xml:space="preserve">Operación y mantenimiento</w:t>
+            </w:r>
+          </w:p>
+        </w:tc>
+        <w:tc>
+          <w:tcPr>
+            <w:tcW w:type="dxa" w:w="4160"/>
+            <w:tcBorders>
+              <w:top w:val="single" w:color="999999" w:sz="4"/>
+              <w:left w:val="single" w:color="999999" w:sz="4"/>
+              <w:bottom w:val="single" w:color="999999" w:sz="4"/>
+              <w:right w:val="single" w:color="999999" w:sz="4"/>
+            </w:tcBorders>
+            <w:tcMar>
+              <w:top w:type="dxa" w:w="60"/>
+              <w:left w:type="dxa" w:w="90"/>
+              <w:bottom w:type="dxa" w:w="60"/>
+              <w:right w:type="dxa" w:w="90"/>
+            </w:tcMar>
+          </w:tcPr>
+          <w:p>
+            <w:pPr>
+              <w:spacing w:after="40"/>
+            </w:pPr>
+            <w:r>
+              <w:rPr>
+                <w:sz w:val="19"/>
+                <w:szCs w:val="19"/>
+              </w:rPr>
+              <w:t xml:space="preserve">Ensayo y video de respaldo</w:t>
+            </w:r>
+          </w:p>
+        </w:tc>
+        <w:tc>
+          <w:tcPr>
+            <w:tcW w:type="dxa" w:w="1450"/>
+            <w:tcBorders>
+              <w:top w:val="single" w:color="999999" w:sz="4"/>
+              <w:left w:val="single" w:color="999999" w:sz="4"/>
+              <w:bottom w:val="single" w:color="999999" w:sz="4"/>
+              <w:right w:val="single" w:color="999999" w:sz="4"/>
+            </w:tcBorders>
+            <w:tcMar>
+              <w:top w:type="dxa" w:w="60"/>
+              <w:left w:type="dxa" w:w="90"/>
+              <w:bottom w:type="dxa" w:w="60"/>
+              <w:right w:type="dxa" w:w="90"/>
+            </w:tcMar>
+          </w:tcPr>
+          <w:p>
+            <w:pPr>
+              <w:spacing w:after="40"/>
+            </w:pPr>
+            <w:r>
+              <w:rPr>
+                <w:sz w:val="19"/>
+                <w:szCs w:val="19"/>
+              </w:rPr>
+              <w:t xml:space="preserve">30 nov</w:t>
+            </w:r>
+          </w:p>
+        </w:tc>
+        <w:tc>
+          <w:tcPr>
+            <w:tcW w:type="dxa" w:w="1450"/>
+            <w:tcBorders>
+              <w:top w:val="single" w:color="999999" w:sz="4"/>
+              <w:left w:val="single" w:color="999999" w:sz="4"/>
+              <w:bottom w:val="single" w:color="999999" w:sz="4"/>
+              <w:right w:val="single" w:color="999999" w:sz="4"/>
+            </w:tcBorders>
+            <w:tcMar>
+              <w:top w:type="dxa" w:w="60"/>
+              <w:left w:type="dxa" w:w="90"/>
+              <w:bottom w:type="dxa" w:w="60"/>
+              <w:right w:type="dxa" w:w="90"/>
+            </w:tcMar>
+          </w:tcPr>
+          <w:p>
+            <w:pPr>
+              <w:spacing w:after="40"/>
+            </w:pPr>
+            <w:r>
+              <w:rPr>
+                <w:sz w:val="19"/>
+                <w:szCs w:val="19"/>
+              </w:rPr>
+              <w:t xml:space="preserve">5 dic</w:t>
+            </w:r>
+          </w:p>
+        </w:tc>
+      </w:tr>
+      <w:tr>
+        <w:trPr>
+          <w:cantSplit/>
+          <w:tblHeader w:val="false"/>
+        </w:trPr>
+        <w:tc>
+          <w:tcPr>
+            <w:tcW w:type="dxa" w:w="2300"/>
+            <w:tcBorders>
+              <w:top w:val="single" w:color="999999" w:sz="4"/>
+              <w:left w:val="single" w:color="999999" w:sz="4"/>
+              <w:bottom w:val="single" w:color="999999" w:sz="4"/>
+              <w:right w:val="single" w:color="999999" w:sz="4"/>
+            </w:tcBorders>
+            <w:tcMar>
+              <w:top w:type="dxa" w:w="60"/>
+              <w:left w:type="dxa" w:w="90"/>
+              <w:bottom w:type="dxa" w:w="60"/>
+              <w:right w:type="dxa" w:w="90"/>
+            </w:tcMar>
+          </w:tcPr>
+          <w:p>
+            <w:pPr>
+              <w:spacing w:after="40"/>
+            </w:pPr>
+            <w:r>
+              <w:rPr>
+                <w:sz w:val="19"/>
+                <w:szCs w:val="19"/>
+              </w:rPr>
+              <w:t xml:space="preserve">Hitos del protocolo</w:t>
+            </w:r>
+          </w:p>
+        </w:tc>
+        <w:tc>
+          <w:tcPr>
+            <w:tcW w:type="dxa" w:w="4160"/>
+            <w:tcBorders>
+              <w:top w:val="single" w:color="999999" w:sz="4"/>
+              <w:left w:val="single" w:color="999999" w:sz="4"/>
+              <w:bottom w:val="single" w:color="999999" w:sz="4"/>
+              <w:right w:val="single" w:color="999999" w:sz="4"/>
+            </w:tcBorders>
+            <w:tcMar>
+              <w:top w:type="dxa" w:w="60"/>
+              <w:left w:type="dxa" w:w="90"/>
+              <w:bottom w:type="dxa" w:w="60"/>
+              <w:right w:type="dxa" w:w="90"/>
+            </w:tcMar>
+          </w:tcPr>
+          <w:p>
+            <w:pPr>
+              <w:spacing w:after="40"/>
+            </w:pPr>
+            <w:r>
+              <w:rPr>
+                <w:sz w:val="19"/>
+                <w:szCs w:val="19"/>
+              </w:rPr>
+              <w:t xml:space="preserve">Revisión del Cuadrante 2 (asesores)</w:t>
+            </w:r>
+          </w:p>
+        </w:tc>
+        <w:tc>
+          <w:tcPr>
+            <w:tcW w:type="dxa" w:w="1450"/>
+            <w:tcBorders>
+              <w:top w:val="single" w:color="999999" w:sz="4"/>
+              <w:left w:val="single" w:color="999999" w:sz="4"/>
+              <w:bottom w:val="single" w:color="999999" w:sz="4"/>
+              <w:right w:val="single" w:color="999999" w:sz="4"/>
+            </w:tcBorders>
+            <w:tcMar>
+              <w:top w:type="dxa" w:w="60"/>
+              <w:left w:type="dxa" w:w="90"/>
+              <w:bottom w:type="dxa" w:w="60"/>
+              <w:right w:type="dxa" w:w="90"/>
+            </w:tcMar>
+          </w:tcPr>
+          <w:p>
+            <w:pPr>
+              <w:spacing w:after="40"/>
+            </w:pPr>
+            <w:r>
+              <w:rPr>
+                <w:sz w:val="19"/>
+                <w:szCs w:val="19"/>
+              </w:rPr>
+              <w:t xml:space="preserve">21 sep</w:t>
+            </w:r>
+          </w:p>
+        </w:tc>
+        <w:tc>
+          <w:tcPr>
+            <w:tcW w:type="dxa" w:w="1450"/>
+            <w:tcBorders>
+              <w:top w:val="single" w:color="999999" w:sz="4"/>
+              <w:left w:val="single" w:color="999999" w:sz="4"/>
+              <w:bottom w:val="single" w:color="999999" w:sz="4"/>
+              <w:right w:val="single" w:color="999999" w:sz="4"/>
+            </w:tcBorders>
+            <w:tcMar>
+              <w:top w:type="dxa" w:w="60"/>
+              <w:left w:type="dxa" w:w="90"/>
+              <w:bottom w:type="dxa" w:w="60"/>
+              <w:right w:type="dxa" w:w="90"/>
+            </w:tcMar>
+          </w:tcPr>
+          <w:p>
+            <w:pPr>
+              <w:spacing w:after="40"/>
+            </w:pPr>
+            <w:r>
+              <w:rPr>
+                <w:sz w:val="19"/>
+                <w:szCs w:val="19"/>
+              </w:rPr>
+              <w:t xml:space="preserve">26 sep</w:t>
+            </w:r>
+          </w:p>
+        </w:tc>
+      </w:tr>
+      <w:tr>
+        <w:trPr>
+          <w:cantSplit/>
+          <w:tblHeader w:val="false"/>
+        </w:trPr>
+        <w:tc>
+          <w:tcPr>
+            <w:tcW w:type="dxa" w:w="2300"/>
+            <w:tcBorders>
+              <w:top w:val="single" w:color="999999" w:sz="4"/>
+              <w:left w:val="single" w:color="999999" w:sz="4"/>
+              <w:bottom w:val="single" w:color="999999" w:sz="4"/>
+              <w:right w:val="single" w:color="999999" w:sz="4"/>
+            </w:tcBorders>
+            <w:tcMar>
+              <w:top w:type="dxa" w:w="60"/>
+              <w:left w:type="dxa" w:w="90"/>
+              <w:bottom w:type="dxa" w:w="60"/>
+              <w:right w:type="dxa" w:w="90"/>
+            </w:tcMar>
+          </w:tcPr>
+          <w:p>
+            <w:pPr>
+              <w:spacing w:after="40"/>
+            </w:pPr>
+            <w:r>
+              <w:rPr>
+                <w:sz w:val="19"/>
+                <w:szCs w:val="19"/>
+              </w:rPr>
+              <w:t xml:space="preserve">Hitos del protocolo</w:t>
+            </w:r>
+          </w:p>
+        </w:tc>
+        <w:tc>
+          <w:tcPr>
+            <w:tcW w:type="dxa" w:w="4160"/>
+            <w:tcBorders>
+              <w:top w:val="single" w:color="999999" w:sz="4"/>
+              <w:left w:val="single" w:color="999999" w:sz="4"/>
+              <w:bottom w:val="single" w:color="999999" w:sz="4"/>
+              <w:right w:val="single" w:color="999999" w:sz="4"/>
+            </w:tcBorders>
+            <w:tcMar>
+              <w:top w:type="dxa" w:w="60"/>
+              <w:left w:type="dxa" w:w="90"/>
+              <w:bottom w:type="dxa" w:w="60"/>
+              <w:right w:type="dxa" w:w="90"/>
+            </w:tcMar>
+          </w:tcPr>
+          <w:p>
+            <w:pPr>
+              <w:spacing w:after="40"/>
+            </w:pPr>
+            <w:r>
+              <w:rPr>
+                <w:sz w:val="19"/>
+                <w:szCs w:val="19"/>
+              </w:rPr>
+              <w:t xml:space="preserve">1ra socialización</w:t>
+            </w:r>
+          </w:p>
+        </w:tc>
+        <w:tc>
+          <w:tcPr>
+            <w:tcW w:type="dxa" w:w="1450"/>
+            <w:tcBorders>
+              <w:top w:val="single" w:color="999999" w:sz="4"/>
+              <w:left w:val="single" w:color="999999" w:sz="4"/>
+              <w:bottom w:val="single" w:color="999999" w:sz="4"/>
+              <w:right w:val="single" w:color="999999" w:sz="4"/>
+            </w:tcBorders>
+            <w:tcMar>
+              <w:top w:type="dxa" w:w="60"/>
+              <w:left w:type="dxa" w:w="90"/>
+              <w:bottom w:type="dxa" w:w="60"/>
+              <w:right w:type="dxa" w:w="90"/>
+            </w:tcMar>
+          </w:tcPr>
+          <w:p>
+            <w:pPr>
+              <w:spacing w:after="40"/>
+            </w:pPr>
+            <w:r>
+              <w:rPr>
+                <w:sz w:val="19"/>
+                <w:szCs w:val="19"/>
+              </w:rPr>
+              <w:t xml:space="preserve">5 oct</w:t>
+            </w:r>
+          </w:p>
+        </w:tc>
+        <w:tc>
+          <w:tcPr>
+            <w:tcW w:type="dxa" w:w="1450"/>
+            <w:tcBorders>
+              <w:top w:val="single" w:color="999999" w:sz="4"/>
+              <w:left w:val="single" w:color="999999" w:sz="4"/>
+              <w:bottom w:val="single" w:color="999999" w:sz="4"/>
+              <w:right w:val="single" w:color="999999" w:sz="4"/>
+            </w:tcBorders>
+            <w:tcMar>
+              <w:top w:type="dxa" w:w="60"/>
+              <w:left w:type="dxa" w:w="90"/>
+              <w:bottom w:type="dxa" w:w="60"/>
+              <w:right w:type="dxa" w:w="90"/>
+            </w:tcMar>
+          </w:tcPr>
+          <w:p>
+            <w:pPr>
+              <w:spacing w:after="40"/>
+            </w:pPr>
+            <w:r>
+              <w:rPr>
+                <w:sz w:val="19"/>
+                <w:szCs w:val="19"/>
+              </w:rPr>
+              <w:t xml:space="preserve">11 oct</w:t>
+            </w:r>
+          </w:p>
+        </w:tc>
+      </w:tr>
+      <w:tr>
+        <w:trPr>
+          <w:cantSplit/>
+          <w:tblHeader w:val="false"/>
+        </w:trPr>
+        <w:tc>
+          <w:tcPr>
+            <w:tcW w:type="dxa" w:w="2300"/>
+            <w:tcBorders>
+              <w:top w:val="single" w:color="999999" w:sz="4"/>
+              <w:left w:val="single" w:color="999999" w:sz="4"/>
+              <w:bottom w:val="single" w:color="999999" w:sz="4"/>
+              <w:right w:val="single" w:color="999999" w:sz="4"/>
+            </w:tcBorders>
+            <w:tcMar>
+              <w:top w:type="dxa" w:w="60"/>
+              <w:left w:type="dxa" w:w="90"/>
+              <w:bottom w:type="dxa" w:w="60"/>
+              <w:right w:type="dxa" w:w="90"/>
+            </w:tcMar>
+          </w:tcPr>
+          <w:p>
+            <w:pPr>
+              <w:spacing w:after="40"/>
+            </w:pPr>
+            <w:r>
+              <w:rPr>
+                <w:sz w:val="19"/>
+                <w:szCs w:val="19"/>
+              </w:rPr>
+              <w:t xml:space="preserve">Hitos del protocolo</w:t>
+            </w:r>
+          </w:p>
+        </w:tc>
+        <w:tc>
+          <w:tcPr>
+            <w:tcW w:type="dxa" w:w="4160"/>
+            <w:tcBorders>
+              <w:top w:val="single" w:color="999999" w:sz="4"/>
+              <w:left w:val="single" w:color="999999" w:sz="4"/>
+              <w:bottom w:val="single" w:color="999999" w:sz="4"/>
+              <w:right w:val="single" w:color="999999" w:sz="4"/>
+            </w:tcBorders>
+            <w:tcMar>
+              <w:top w:type="dxa" w:w="60"/>
+              <w:left w:type="dxa" w:w="90"/>
+              <w:bottom w:type="dxa" w:w="60"/>
+              <w:right w:type="dxa" w:w="90"/>
+            </w:tcMar>
+          </w:tcPr>
+          <w:p>
+            <w:pPr>
+              <w:spacing w:after="40"/>
+            </w:pPr>
+            <w:r>
+              <w:rPr>
+                <w:sz w:val="19"/>
+                <w:szCs w:val="19"/>
+              </w:rPr>
+              <w:t xml:space="preserve">Notas de la 1ra socialización</w:t>
+            </w:r>
+          </w:p>
+        </w:tc>
+        <w:tc>
+          <w:tcPr>
+            <w:tcW w:type="dxa" w:w="1450"/>
+            <w:tcBorders>
+              <w:top w:val="single" w:color="999999" w:sz="4"/>
+              <w:left w:val="single" w:color="999999" w:sz="4"/>
+              <w:bottom w:val="single" w:color="999999" w:sz="4"/>
+              <w:right w:val="single" w:color="999999" w:sz="4"/>
+            </w:tcBorders>
+            <w:tcMar>
+              <w:top w:type="dxa" w:w="60"/>
+              <w:left w:type="dxa" w:w="90"/>
+              <w:bottom w:type="dxa" w:w="60"/>
+              <w:right w:type="dxa" w:w="90"/>
+            </w:tcMar>
+          </w:tcPr>
+          <w:p>
+            <w:pPr>
+              <w:spacing w:after="40"/>
+            </w:pPr>
+            <w:r>
+              <w:rPr>
+                <w:sz w:val="19"/>
+                <w:szCs w:val="19"/>
+              </w:rPr>
+              <w:t xml:space="preserve">12 oct</w:t>
+            </w:r>
+          </w:p>
+        </w:tc>
+        <w:tc>
+          <w:tcPr>
+            <w:tcW w:type="dxa" w:w="1450"/>
+            <w:tcBorders>
+              <w:top w:val="single" w:color="999999" w:sz="4"/>
+              <w:left w:val="single" w:color="999999" w:sz="4"/>
+              <w:bottom w:val="single" w:color="999999" w:sz="4"/>
+              <w:right w:val="single" w:color="999999" w:sz="4"/>
+            </w:tcBorders>
+            <w:tcMar>
+              <w:top w:type="dxa" w:w="60"/>
+              <w:left w:type="dxa" w:w="90"/>
+              <w:bottom w:type="dxa" w:w="60"/>
+              <w:right w:type="dxa" w:w="90"/>
+            </w:tcMar>
+          </w:tcPr>
+          <w:p>
+            <w:pPr>
+              <w:spacing w:after="40"/>
+            </w:pPr>
+            <w:r>
+              <w:rPr>
+                <w:sz w:val="19"/>
+                <w:szCs w:val="19"/>
+              </w:rPr>
+              <w:t xml:space="preserve">17 oct</w:t>
+            </w:r>
+          </w:p>
+        </w:tc>
+      </w:tr>
+      <w:tr>
+        <w:trPr>
+          <w:cantSplit/>
+          <w:tblHeader w:val="false"/>
+        </w:trPr>
+        <w:tc>
+          <w:tcPr>
+            <w:tcW w:type="dxa" w:w="2300"/>
+            <w:tcBorders>
+              <w:top w:val="single" w:color="999999" w:sz="4"/>
+              <w:left w:val="single" w:color="999999" w:sz="4"/>
+              <w:bottom w:val="single" w:color="999999" w:sz="4"/>
+              <w:right w:val="single" w:color="999999" w:sz="4"/>
+            </w:tcBorders>
+            <w:tcMar>
+              <w:top w:type="dxa" w:w="60"/>
+              <w:left w:type="dxa" w:w="90"/>
+              <w:bottom w:type="dxa" w:w="60"/>
+              <w:right w:type="dxa" w:w="90"/>
+            </w:tcMar>
+          </w:tcPr>
+          <w:p>
+            <w:pPr>
+              <w:spacing w:after="40"/>
+            </w:pPr>
+            <w:r>
+              <w:rPr>
+                <w:sz w:val="19"/>
+                <w:szCs w:val="19"/>
+              </w:rPr>
+              <w:t xml:space="preserve">Hitos del protocolo</w:t>
+            </w:r>
+          </w:p>
+        </w:tc>
+        <w:tc>
+          <w:tcPr>
+            <w:tcW w:type="dxa" w:w="4160"/>
+            <w:tcBorders>
+              <w:top w:val="single" w:color="999999" w:sz="4"/>
+              <w:left w:val="single" w:color="999999" w:sz="4"/>
+              <w:bottom w:val="single" w:color="999999" w:sz="4"/>
+              <w:right w:val="single" w:color="999999" w:sz="4"/>
+            </w:tcBorders>
+            <w:tcMar>
+              <w:top w:type="dxa" w:w="60"/>
+              <w:left w:type="dxa" w:w="90"/>
+              <w:bottom w:type="dxa" w:w="60"/>
+              <w:right w:type="dxa" w:w="90"/>
+            </w:tcMar>
+          </w:tcPr>
+          <w:p>
+            <w:pPr>
+              <w:spacing w:after="40"/>
+            </w:pPr>
+            <w:r>
+              <w:rPr>
+                <w:sz w:val="19"/>
+                <w:szCs w:val="19"/>
+              </w:rPr>
+              <w:t xml:space="preserve">Revisión del Cuadrante 3 (módulo sol)</w:t>
+            </w:r>
+          </w:p>
+        </w:tc>
+        <w:tc>
+          <w:tcPr>
+            <w:tcW w:type="dxa" w:w="1450"/>
+            <w:tcBorders>
+              <w:top w:val="single" w:color="999999" w:sz="4"/>
+              <w:left w:val="single" w:color="999999" w:sz="4"/>
+              <w:bottom w:val="single" w:color="999999" w:sz="4"/>
+              <w:right w:val="single" w:color="999999" w:sz="4"/>
+            </w:tcBorders>
+            <w:tcMar>
+              <w:top w:type="dxa" w:w="60"/>
+              <w:left w:type="dxa" w:w="90"/>
+              <w:bottom w:type="dxa" w:w="60"/>
+              <w:right w:type="dxa" w:w="90"/>
+            </w:tcMar>
+          </w:tcPr>
+          <w:p>
+            <w:pPr>
+              <w:spacing w:after="40"/>
+            </w:pPr>
+            <w:r>
+              <w:rPr>
+                <w:sz w:val="19"/>
+                <w:szCs w:val="19"/>
+              </w:rPr>
+              <w:t xml:space="preserve">2 nov</w:t>
+            </w:r>
+          </w:p>
+        </w:tc>
+        <w:tc>
+          <w:tcPr>
+            <w:tcW w:type="dxa" w:w="1450"/>
+            <w:tcBorders>
+              <w:top w:val="single" w:color="999999" w:sz="4"/>
+              <w:left w:val="single" w:color="999999" w:sz="4"/>
+              <w:bottom w:val="single" w:color="999999" w:sz="4"/>
+              <w:right w:val="single" w:color="999999" w:sz="4"/>
+            </w:tcBorders>
+            <w:tcMar>
+              <w:top w:type="dxa" w:w="60"/>
+              <w:left w:type="dxa" w:w="90"/>
+              <w:bottom w:type="dxa" w:w="60"/>
+              <w:right w:type="dxa" w:w="90"/>
+            </w:tcMar>
+          </w:tcPr>
+          <w:p>
+            <w:pPr>
+              <w:spacing w:after="40"/>
+            </w:pPr>
+            <w:r>
+              <w:rPr>
+                <w:sz w:val="19"/>
+                <w:szCs w:val="19"/>
+              </w:rPr>
+              <w:t xml:space="preserve">7 nov</w:t>
+            </w:r>
+          </w:p>
+        </w:tc>
+      </w:tr>
+      <w:tr>
+        <w:trPr>
+          <w:cantSplit/>
+          <w:tblHeader w:val="false"/>
+        </w:trPr>
+        <w:tc>
+          <w:tcPr>
+            <w:tcW w:type="dxa" w:w="2300"/>
+            <w:tcBorders>
+              <w:top w:val="single" w:color="999999" w:sz="4"/>
+              <w:left w:val="single" w:color="999999" w:sz="4"/>
+              <w:bottom w:val="single" w:color="999999" w:sz="4"/>
+              <w:right w:val="single" w:color="999999" w:sz="4"/>
+            </w:tcBorders>
+            <w:tcMar>
+              <w:top w:type="dxa" w:w="60"/>
+              <w:left w:type="dxa" w:w="90"/>
+              <w:bottom w:type="dxa" w:w="60"/>
+              <w:right w:type="dxa" w:w="90"/>
+            </w:tcMar>
+          </w:tcPr>
+          <w:p>
+            <w:pPr>
+              <w:spacing w:after="40"/>
+            </w:pPr>
+            <w:r>
+              <w:rPr>
+                <w:sz w:val="19"/>
+                <w:szCs w:val="19"/>
+              </w:rPr>
+              <w:t xml:space="preserve">Hitos del protocolo</w:t>
+            </w:r>
+          </w:p>
+        </w:tc>
+        <w:tc>
+          <w:tcPr>
+            <w:tcW w:type="dxa" w:w="4160"/>
+            <w:tcBorders>
+              <w:top w:val="single" w:color="999999" w:sz="4"/>
+              <w:left w:val="single" w:color="999999" w:sz="4"/>
+              <w:bottom w:val="single" w:color="999999" w:sz="4"/>
+              <w:right w:val="single" w:color="999999" w:sz="4"/>
+            </w:tcBorders>
+            <w:tcMar>
+              <w:top w:type="dxa" w:w="60"/>
+              <w:left w:type="dxa" w:w="90"/>
+              <w:bottom w:type="dxa" w:w="60"/>
+              <w:right w:type="dxa" w:w="90"/>
+            </w:tcMar>
+          </w:tcPr>
+          <w:p>
+            <w:pPr>
+              <w:spacing w:after="40"/>
+            </w:pPr>
+            <w:r>
+              <w:rPr>
+                <w:sz w:val="19"/>
+                <w:szCs w:val="19"/>
+              </w:rPr>
+              <w:t xml:space="preserve">Revisión del Cuadrante 4 (asesores)</w:t>
+            </w:r>
+          </w:p>
+        </w:tc>
+        <w:tc>
+          <w:tcPr>
+            <w:tcW w:type="dxa" w:w="1450"/>
+            <w:tcBorders>
+              <w:top w:val="single" w:color="999999" w:sz="4"/>
+              <w:left w:val="single" w:color="999999" w:sz="4"/>
+              <w:bottom w:val="single" w:color="999999" w:sz="4"/>
+              <w:right w:val="single" w:color="999999" w:sz="4"/>
+            </w:tcBorders>
+            <w:tcMar>
+              <w:top w:type="dxa" w:w="60"/>
+              <w:left w:type="dxa" w:w="90"/>
+              <w:bottom w:type="dxa" w:w="60"/>
+              <w:right w:type="dxa" w:w="90"/>
+            </w:tcMar>
+          </w:tcPr>
+          <w:p>
+            <w:pPr>
+              <w:spacing w:after="40"/>
+            </w:pPr>
+            <w:r>
+              <w:rPr>
+                <w:sz w:val="19"/>
+                <w:szCs w:val="19"/>
+              </w:rPr>
+              <w:t xml:space="preserve">23 nov</w:t>
+            </w:r>
+          </w:p>
+        </w:tc>
+        <w:tc>
+          <w:tcPr>
+            <w:tcW w:type="dxa" w:w="1450"/>
+            <w:tcBorders>
+              <w:top w:val="single" w:color="999999" w:sz="4"/>
+              <w:left w:val="single" w:color="999999" w:sz="4"/>
+              <w:bottom w:val="single" w:color="999999" w:sz="4"/>
+              <w:right w:val="single" w:color="999999" w:sz="4"/>
+            </w:tcBorders>
+            <w:tcMar>
+              <w:top w:type="dxa" w:w="60"/>
+              <w:left w:type="dxa" w:w="90"/>
+              <w:bottom w:type="dxa" w:w="60"/>
+              <w:right w:type="dxa" w:w="90"/>
+            </w:tcMar>
+          </w:tcPr>
+          <w:p>
+            <w:pPr>
+              <w:spacing w:after="40"/>
+            </w:pPr>
+            <w:r>
+              <w:rPr>
+                <w:sz w:val="19"/>
+                <w:szCs w:val="19"/>
+              </w:rPr>
+              <w:t xml:space="preserve">28 nov</w:t>
+            </w:r>
+          </w:p>
+        </w:tc>
+      </w:tr>
+      <w:tr>
+        <w:trPr>
+          <w:cantSplit/>
+          <w:tblHeader w:val="false"/>
+        </w:trPr>
+        <w:tc>
+          <w:tcPr>
+            <w:tcW w:type="dxa" w:w="2300"/>
+            <w:tcBorders>
+              <w:top w:val="single" w:color="999999" w:sz="4"/>
+              <w:left w:val="single" w:color="999999" w:sz="4"/>
+              <w:bottom w:val="single" w:color="999999" w:sz="4"/>
+              <w:right w:val="single" w:color="999999" w:sz="4"/>
+            </w:tcBorders>
+            <w:tcMar>
+              <w:top w:type="dxa" w:w="60"/>
+              <w:left w:type="dxa" w:w="90"/>
+              <w:bottom w:type="dxa" w:w="60"/>
+              <w:right w:type="dxa" w:w="90"/>
+            </w:tcMar>
+          </w:tcPr>
+          <w:p>
+            <w:pPr>
+              <w:spacing w:after="40"/>
+            </w:pPr>
+            <w:r>
+              <w:rPr>
+                <w:sz w:val="19"/>
+                <w:szCs w:val="19"/>
+              </w:rPr>
+              <w:t xml:space="preserve">Hitos del protocolo</w:t>
+            </w:r>
+          </w:p>
+        </w:tc>
+        <w:tc>
+          <w:tcPr>
+            <w:tcW w:type="dxa" w:w="4160"/>
+            <w:tcBorders>
+              <w:top w:val="single" w:color="999999" w:sz="4"/>
+              <w:left w:val="single" w:color="999999" w:sz="4"/>
+              <w:bottom w:val="single" w:color="999999" w:sz="4"/>
+              <w:right w:val="single" w:color="999999" w:sz="4"/>
+            </w:tcBorders>
+            <w:tcMar>
+              <w:top w:type="dxa" w:w="60"/>
+              <w:left w:type="dxa" w:w="90"/>
+              <w:bottom w:type="dxa" w:w="60"/>
+              <w:right w:type="dxa" w:w="90"/>
+            </w:tcMar>
+          </w:tcPr>
+          <w:p>
+            <w:pPr>
+              <w:spacing w:after="40"/>
+            </w:pPr>
+            <w:r>
+              <w:rPr>
+                <w:sz w:val="19"/>
+                <w:szCs w:val="19"/>
+              </w:rPr>
               <w:t xml:space="preserve">2da socialización</w:t>
             </w:r>
           </w:p>
@@ -3308,6 +4894,250 @@
                 <w:szCs w:val="19"/>
               </w:rPr>
               <w:t xml:space="preserve">12 dic</w:t>
+            </w:r>
+          </w:p>
+        </w:tc>
+      </w:tr>
+      <w:tr>
+        <w:trPr>
+          <w:cantSplit/>
+          <w:tblHeader w:val="false"/>
+        </w:trPr>
+        <w:tc>
+          <w:tcPr>
+            <w:tcW w:type="dxa" w:w="2300"/>
+            <w:tcBorders>
+              <w:top w:val="single" w:color="999999" w:sz="4"/>
+              <w:left w:val="single" w:color="999999" w:sz="4"/>
+              <w:bottom w:val="single" w:color="999999" w:sz="4"/>
+              <w:right w:val="single" w:color="999999" w:sz="4"/>
+            </w:tcBorders>
+            <w:tcMar>
+              <w:top w:type="dxa" w:w="60"/>
+              <w:left w:type="dxa" w:w="90"/>
+              <w:bottom w:type="dxa" w:w="60"/>
+              <w:right w:type="dxa" w:w="90"/>
+            </w:tcMar>
+          </w:tcPr>
+          <w:p>
+            <w:pPr>
+              <w:spacing w:after="40"/>
+            </w:pPr>
+            <w:r>
+              <w:rPr>
+                <w:sz w:val="19"/>
+                <w:szCs w:val="19"/>
+              </w:rPr>
+              <w:t xml:space="preserve">Hitos del protocolo</w:t>
+            </w:r>
+          </w:p>
+        </w:tc>
+        <w:tc>
+          <w:tcPr>
+            <w:tcW w:type="dxa" w:w="4160"/>
+            <w:tcBorders>
+              <w:top w:val="single" w:color="999999" w:sz="4"/>
+              <w:left w:val="single" w:color="999999" w:sz="4"/>
+              <w:bottom w:val="single" w:color="999999" w:sz="4"/>
+              <w:right w:val="single" w:color="999999" w:sz="4"/>
+            </w:tcBorders>
+            <w:tcMar>
+              <w:top w:type="dxa" w:w="60"/>
+              <w:left w:type="dxa" w:w="90"/>
+              <w:bottom w:type="dxa" w:w="60"/>
+              <w:right w:type="dxa" w:w="90"/>
+            </w:tcMar>
+          </w:tcPr>
+          <w:p>
+            <w:pPr>
+              <w:spacing w:after="40"/>
+            </w:pPr>
+            <w:r>
+              <w:rPr>
+                <w:sz w:val="19"/>
+                <w:szCs w:val="19"/>
+              </w:rPr>
+              <w:t xml:space="preserve">Notas de la 2da socialización</w:t>
+            </w:r>
+          </w:p>
+        </w:tc>
+        <w:tc>
+          <w:tcPr>
+            <w:tcW w:type="dxa" w:w="1450"/>
+            <w:tcBorders>
+              <w:top w:val="single" w:color="999999" w:sz="4"/>
+              <w:left w:val="single" w:color="999999" w:sz="4"/>
+              <w:bottom w:val="single" w:color="999999" w:sz="4"/>
+              <w:right w:val="single" w:color="999999" w:sz="4"/>
+            </w:tcBorders>
+            <w:tcMar>
+              <w:top w:type="dxa" w:w="60"/>
+              <w:left w:type="dxa" w:w="90"/>
+              <w:bottom w:type="dxa" w:w="60"/>
+              <w:right w:type="dxa" w:w="90"/>
+            </w:tcMar>
+          </w:tcPr>
+          <w:p>
+            <w:pPr>
+              <w:spacing w:after="40"/>
+            </w:pPr>
+            <w:r>
+              <w:rPr>
+                <w:sz w:val="19"/>
+                <w:szCs w:val="19"/>
+              </w:rPr>
+              <w:t xml:space="preserve">14 dic</w:t>
+            </w:r>
+          </w:p>
+        </w:tc>
+        <w:tc>
+          <w:tcPr>
+            <w:tcW w:type="dxa" w:w="1450"/>
+            <w:tcBorders>
+              <w:top w:val="single" w:color="999999" w:sz="4"/>
+              <w:left w:val="single" w:color="999999" w:sz="4"/>
+              <w:bottom w:val="single" w:color="999999" w:sz="4"/>
+              <w:right w:val="single" w:color="999999" w:sz="4"/>
+            </w:tcBorders>
+            <w:tcMar>
+              <w:top w:type="dxa" w:w="60"/>
+              <w:left w:type="dxa" w:w="90"/>
+              <w:bottom w:type="dxa" w:w="60"/>
+              <w:right w:type="dxa" w:w="90"/>
+            </w:tcMar>
+          </w:tcPr>
+          <w:p>
+            <w:pPr>
+              <w:spacing w:after="40"/>
+            </w:pPr>
+            <w:r>
+              <w:rPr>
+                <w:sz w:val="19"/>
+                <w:szCs w:val="19"/>
+              </w:rPr>
+              <w:t xml:space="preserve">19 dic</w:t>
+            </w:r>
+          </w:p>
+        </w:tc>
+      </w:tr>
+      <w:tr>
+        <w:trPr>
+          <w:cantSplit/>
+          <w:tblHeader w:val="false"/>
+        </w:trPr>
+        <w:tc>
+          <w:tcPr>
+            <w:tcW w:type="dxa" w:w="2300"/>
+            <w:tcBorders>
+              <w:top w:val="single" w:color="999999" w:sz="4"/>
+              <w:left w:val="single" w:color="999999" w:sz="4"/>
+              <w:bottom w:val="single" w:color="999999" w:sz="4"/>
+              <w:right w:val="single" w:color="999999" w:sz="4"/>
+            </w:tcBorders>
+            <w:tcMar>
+              <w:top w:type="dxa" w:w="60"/>
+              <w:left w:type="dxa" w:w="90"/>
+              <w:bottom w:type="dxa" w:w="60"/>
+              <w:right w:type="dxa" w:w="90"/>
+            </w:tcMar>
+          </w:tcPr>
+          <w:p>
+            <w:pPr>
+              <w:spacing w:after="40"/>
+            </w:pPr>
+            <w:r>
+              <w:rPr>
+                <w:sz w:val="19"/>
+                <w:szCs w:val="19"/>
+              </w:rPr>
+              <w:t xml:space="preserve">Hitos del protocolo</w:t>
+            </w:r>
+          </w:p>
+        </w:tc>
+        <w:tc>
+          <w:tcPr>
+            <w:tcW w:type="dxa" w:w="4160"/>
+            <w:tcBorders>
+              <w:top w:val="single" w:color="999999" w:sz="4"/>
+              <w:left w:val="single" w:color="999999" w:sz="4"/>
+              <w:bottom w:val="single" w:color="999999" w:sz="4"/>
+              <w:right w:val="single" w:color="999999" w:sz="4"/>
+            </w:tcBorders>
+            <w:tcMar>
+              <w:top w:type="dxa" w:w="60"/>
+              <w:left w:type="dxa" w:w="90"/>
+              <w:bottom w:type="dxa" w:w="60"/>
+              <w:right w:type="dxa" w:w="90"/>
+            </w:tcMar>
+          </w:tcPr>
+          <w:p>
+            <w:pPr>
+              <w:spacing w:after="40"/>
+            </w:pPr>
+            <w:r>
+              <w:rPr>
+                <w:sz w:val="19"/>
+                <w:szCs w:val="19"/>
+              </w:rPr>
+              <w:t xml:space="preserve">Entrega definitiva de notas</w:t>
+            </w:r>
+          </w:p>
+        </w:tc>
+        <w:tc>
+          <w:tcPr>
+            <w:tcW w:type="dxa" w:w="1450"/>
+            <w:tcBorders>
+              <w:top w:val="single" w:color="999999" w:sz="4"/>
+              <w:left w:val="single" w:color="999999" w:sz="4"/>
+              <w:bottom w:val="single" w:color="999999" w:sz="4"/>
+              <w:right w:val="single" w:color="999999" w:sz="4"/>
+            </w:tcBorders>
+            <w:tcMar>
+              <w:top w:type="dxa" w:w="60"/>
+              <w:left w:type="dxa" w:w="90"/>
+              <w:bottom w:type="dxa" w:w="60"/>
+              <w:right w:type="dxa" w:w="90"/>
+            </w:tcMar>
+          </w:tcPr>
+          <w:p>
+            <w:pPr>
+              <w:spacing w:after="40"/>
+            </w:pPr>
+            <w:r>
+              <w:rPr>
+                <w:sz w:val="19"/>
+                <w:szCs w:val="19"/>
+              </w:rPr>
+              <w:t xml:space="preserve">14 dic</w:t>
+            </w:r>
+          </w:p>
+        </w:tc>
+        <w:tc>
+          <w:tcPr>
+            <w:tcW w:type="dxa" w:w="1450"/>
+            <w:tcBorders>
+              <w:top w:val="single" w:color="999999" w:sz="4"/>
+              <w:left w:val="single" w:color="999999" w:sz="4"/>
+              <w:bottom w:val="single" w:color="999999" w:sz="4"/>
+              <w:right w:val="single" w:color="999999" w:sz="4"/>
+            </w:tcBorders>
+            <w:tcMar>
+              <w:top w:type="dxa" w:w="60"/>
+              <w:left w:type="dxa" w:w="90"/>
+              <w:bottom w:type="dxa" w:w="60"/>
+              <w:right w:type="dxa" w:w="90"/>
+            </w:tcMar>
+          </w:tcPr>
+          <w:p>
+            <w:pPr>
+              <w:spacing w:after="40"/>
+            </w:pPr>
+            <w:r>
+              <w:rPr>
+                <w:sz w:val="19"/>
+                <w:szCs w:val="19"/>
+              </w:rPr>
+              <w:t xml:space="preserve">20 dic</w:t>
             </w:r>
           </w:p>
         </w:tc>
@@ -3325,7 +5155,7 @@
         <w:jc w:val="both"/>
       </w:pPr>
       <w:r>
-        <w:t xml:space="preserve">Las fechas de las socializaciones siguen el protocolo PPI 2026-2.</w:t>
+        <w:t xml:space="preserve">Las fechas de revisiones, socializaciones y notas siguen el protocolo PPI 2026-2. Las demás actividades son la planeación del equipo.</w:t>
       </w:r>
     </w:p>
     <w:p>

</xml_diff>

<commit_message>
Schedule: finish the game by week 14
Co-Authored-By: Claude Sonnet 5.5 <noreply@anthropic.com>
Claude-Session: https://claude.ai/code/session_01R2Pu4Q9okMgo25ziHACUFG
</commit_message>
<xml_diff>
--- a/Cuadrante2_Rutastrofe_plantilla.docx
+++ b/Cuadrante2_Rutastrofe_plantilla.docx
@@ -3615,7 +3615,7 @@
                 <w:sz w:val="19"/>
                 <w:szCs w:val="19"/>
               </w:rPr>
-              <w:t xml:space="preserve">Pruebas funcionales y correcciones</w:t>
+              <w:t xml:space="preserve">Pruebas funcionales, con 4 usuarios y correcciones</w:t>
             </w:r>
           </w:p>
         </w:tc>
@@ -3708,7 +3708,7 @@
                 <w:sz w:val="19"/>
                 <w:szCs w:val="19"/>
               </w:rPr>
-              <w:t xml:space="preserve">Pruebas</w:t>
+              <w:t xml:space="preserve">Operación y mantenimiento</w:t>
             </w:r>
           </w:p>
         </w:tc>
@@ -3737,7 +3737,7 @@
                 <w:sz w:val="19"/>
                 <w:szCs w:val="19"/>
               </w:rPr>
-              <w:t xml:space="preserve">Pruebas con 4 usuarios y ajustes</w:t>
+              <w:t xml:space="preserve">Manual de usuario e instalador</w:t>
             </w:r>
           </w:p>
         </w:tc>
@@ -3859,7 +3859,7 @@
                 <w:sz w:val="19"/>
                 <w:szCs w:val="19"/>
               </w:rPr>
-              <w:t xml:space="preserve">Manual de usuario</w:t>
+              <w:t xml:space="preserve">Documentación final</w:t>
             </w:r>
           </w:p>
         </w:tc>
@@ -3888,7 +3888,7 @@
                 <w:sz w:val="19"/>
                 <w:szCs w:val="19"/>
               </w:rPr>
-              <w:t xml:space="preserve">16 nov</w:t>
+              <w:t xml:space="preserve">23 nov</w:t>
             </w:r>
           </w:p>
         </w:tc>
@@ -3917,7 +3917,7 @@
                 <w:sz w:val="19"/>
                 <w:szCs w:val="19"/>
               </w:rPr>
-              <w:t xml:space="preserve">21 nov</w:t>
+              <w:t xml:space="preserve">28 nov</w:t>
             </w:r>
           </w:p>
         </w:tc>
@@ -3981,7 +3981,7 @@
                 <w:sz w:val="19"/>
                 <w:szCs w:val="19"/>
               </w:rPr>
-              <w:t xml:space="preserve">Instalador y código final</w:t>
+              <w:t xml:space="preserve">Ensayo y video de respaldo</w:t>
             </w:r>
           </w:p>
         </w:tc>
@@ -4010,7 +4010,7 @@
                 <w:sz w:val="19"/>
                 <w:szCs w:val="19"/>
               </w:rPr>
-              <w:t xml:space="preserve">23 nov</w:t>
+              <w:t xml:space="preserve">30 nov</w:t>
             </w:r>
           </w:p>
         </w:tc>
@@ -4039,7 +4039,7 @@
                 <w:sz w:val="19"/>
                 <w:szCs w:val="19"/>
               </w:rPr>
-              <w:t xml:space="preserve">28 nov</w:t>
+              <w:t xml:space="preserve">5 dic</w:t>
             </w:r>
           </w:p>
         </w:tc>
@@ -4074,7 +4074,7 @@
                 <w:sz w:val="19"/>
                 <w:szCs w:val="19"/>
               </w:rPr>
-              <w:t xml:space="preserve">Operación y mantenimiento</w:t>
+              <w:t xml:space="preserve">Hitos del equipo</w:t>
             </w:r>
           </w:p>
         </w:tc>
@@ -4103,7 +4103,7 @@
                 <w:sz w:val="19"/>
                 <w:szCs w:val="19"/>
               </w:rPr>
-              <w:t xml:space="preserve">Ensayo y video de respaldo</w:t>
+              <w:t xml:space="preserve">JUEGO FINALIZADO (versión final)</w:t>
             </w:r>
           </w:p>
         </w:tc>
@@ -4132,7 +4132,7 @@
                 <w:sz w:val="19"/>
                 <w:szCs w:val="19"/>
               </w:rPr>
-              <w:t xml:space="preserve">30 nov</w:t>
+              <w:t xml:space="preserve">14 nov</w:t>
             </w:r>
           </w:p>
         </w:tc>
@@ -4161,7 +4161,7 @@
                 <w:sz w:val="19"/>
                 <w:szCs w:val="19"/>
               </w:rPr>
-              <w:t xml:space="preserve">5 dic</w:t>
+              <w:t xml:space="preserve">14 nov</w:t>
             </w:r>
           </w:p>
         </w:tc>

</xml_diff>